<commit_message>
Add Article 1 doxxing ban; refresh completePDF.
Regenerate article-01 from the Dominion completePDF source to include the Doxxing and Weaponised Disclosure of Private Identity offence, and update the downloadable DOCX/PDF.
</commit_message>
<xml_diff>
--- a/completePDF/Meritocratic Dominion of Canada.docx
+++ b/completePDF/Meritocratic Dominion of Canada.docx
@@ -569,8 +569,8 @@
       <w:bookmarkEnd w:id="55"/>
     </w:p>
     <w:p/>
-    <w:bookmarkStart w:id="56" w:name="_Toc215665027" w:displacedByCustomXml="next"/>
-    <w:bookmarkStart w:id="57" w:name="_Toc215664772" w:displacedByCustomXml="next"/>
+    <w:bookmarkStart w:id="56" w:name="_Toc215664772" w:displacedByCustomXml="next"/>
+    <w:bookmarkStart w:id="57" w:name="_Toc215665027" w:displacedByCustomXml="next"/>
     <w:sdt>
       <w:sdtPr>
         <w:rPr>
@@ -1118,7 +1118,7 @@
                 <w:noProof/>
                 <w:webHidden/>
               </w:rPr>
-              <w:t>20</w:t>
+              <w:t>21</w:t>
             </w:r>
             <w:r>
               <w:rPr>
@@ -1191,7 +1191,7 @@
                 <w:noProof/>
                 <w:webHidden/>
               </w:rPr>
-              <w:t>27</w:t>
+              <w:t>28</w:t>
             </w:r>
             <w:r>
               <w:rPr>
@@ -1264,7 +1264,7 @@
                 <w:noProof/>
                 <w:webHidden/>
               </w:rPr>
-              <w:t>32</w:t>
+              <w:t>33</w:t>
             </w:r>
             <w:r>
               <w:rPr>
@@ -1337,7 +1337,7 @@
                 <w:noProof/>
                 <w:webHidden/>
               </w:rPr>
-              <w:t>38</w:t>
+              <w:t>39</w:t>
             </w:r>
             <w:r>
               <w:rPr>
@@ -1410,7 +1410,7 @@
                 <w:noProof/>
                 <w:webHidden/>
               </w:rPr>
-              <w:t>44</w:t>
+              <w:t>45</w:t>
             </w:r>
             <w:r>
               <w:rPr>
@@ -1483,7 +1483,7 @@
                 <w:noProof/>
                 <w:webHidden/>
               </w:rPr>
-              <w:t>47</w:t>
+              <w:t>48</w:t>
             </w:r>
             <w:r>
               <w:rPr>
@@ -1556,7 +1556,7 @@
                 <w:noProof/>
                 <w:webHidden/>
               </w:rPr>
-              <w:t>50</w:t>
+              <w:t>51</w:t>
             </w:r>
             <w:r>
               <w:rPr>
@@ -1629,7 +1629,7 @@
                 <w:noProof/>
                 <w:webHidden/>
               </w:rPr>
-              <w:t>55</w:t>
+              <w:t>56</w:t>
             </w:r>
             <w:r>
               <w:rPr>
@@ -1702,7 +1702,7 @@
                 <w:noProof/>
                 <w:webHidden/>
               </w:rPr>
-              <w:t>66</w:t>
+              <w:t>67</w:t>
             </w:r>
             <w:r>
               <w:rPr>
@@ -1775,7 +1775,7 @@
                 <w:noProof/>
                 <w:webHidden/>
               </w:rPr>
-              <w:t>70</w:t>
+              <w:t>71</w:t>
             </w:r>
             <w:r>
               <w:rPr>
@@ -1848,7 +1848,7 @@
                 <w:noProof/>
                 <w:webHidden/>
               </w:rPr>
-              <w:t>74</w:t>
+              <w:t>75</w:t>
             </w:r>
             <w:r>
               <w:rPr>
@@ -1921,7 +1921,7 @@
                 <w:noProof/>
                 <w:webHidden/>
               </w:rPr>
-              <w:t>78</w:t>
+              <w:t>79</w:t>
             </w:r>
             <w:r>
               <w:rPr>
@@ -1994,7 +1994,7 @@
                 <w:noProof/>
                 <w:webHidden/>
               </w:rPr>
-              <w:t>84</w:t>
+              <w:t>85</w:t>
             </w:r>
             <w:r>
               <w:rPr>
@@ -2067,7 +2067,7 @@
                 <w:noProof/>
                 <w:webHidden/>
               </w:rPr>
-              <w:t>89</w:t>
+              <w:t>90</w:t>
             </w:r>
             <w:r>
               <w:rPr>
@@ -2140,7 +2140,7 @@
                 <w:noProof/>
                 <w:webHidden/>
               </w:rPr>
-              <w:t>99</w:t>
+              <w:t>100</w:t>
             </w:r>
             <w:r>
               <w:rPr>
@@ -2213,7 +2213,7 @@
                 <w:noProof/>
                 <w:webHidden/>
               </w:rPr>
-              <w:t>102</w:t>
+              <w:t>103</w:t>
             </w:r>
             <w:r>
               <w:rPr>
@@ -2286,7 +2286,7 @@
                 <w:noProof/>
                 <w:webHidden/>
               </w:rPr>
-              <w:t>110</w:t>
+              <w:t>111</w:t>
             </w:r>
             <w:r>
               <w:rPr>
@@ -2359,7 +2359,7 @@
                 <w:noProof/>
                 <w:webHidden/>
               </w:rPr>
-              <w:t>116</w:t>
+              <w:t>117</w:t>
             </w:r>
             <w:r>
               <w:rPr>
@@ -2432,7 +2432,7 @@
                 <w:noProof/>
                 <w:webHidden/>
               </w:rPr>
-              <w:t>120</w:t>
+              <w:t>121</w:t>
             </w:r>
             <w:r>
               <w:rPr>
@@ -2505,7 +2505,7 @@
                 <w:noProof/>
                 <w:webHidden/>
               </w:rPr>
-              <w:t>126</w:t>
+              <w:t>127</w:t>
             </w:r>
             <w:r>
               <w:rPr>
@@ -2578,7 +2578,7 @@
                 <w:noProof/>
                 <w:webHidden/>
               </w:rPr>
-              <w:t>131</w:t>
+              <w:t>132</w:t>
             </w:r>
             <w:r>
               <w:rPr>
@@ -2651,7 +2651,7 @@
                 <w:noProof/>
                 <w:webHidden/>
               </w:rPr>
-              <w:t>138</w:t>
+              <w:t>139</w:t>
             </w:r>
             <w:r>
               <w:rPr>
@@ -2724,7 +2724,7 @@
                 <w:noProof/>
                 <w:webHidden/>
               </w:rPr>
-              <w:t>143</w:t>
+              <w:t>144</w:t>
             </w:r>
             <w:r>
               <w:rPr>
@@ -2797,7 +2797,7 @@
                 <w:noProof/>
                 <w:webHidden/>
               </w:rPr>
-              <w:t>148</w:t>
+              <w:t>149</w:t>
             </w:r>
             <w:r>
               <w:rPr>
@@ -2870,7 +2870,7 @@
                 <w:noProof/>
                 <w:webHidden/>
               </w:rPr>
-              <w:t>154</w:t>
+              <w:t>155</w:t>
             </w:r>
             <w:r>
               <w:rPr>
@@ -2943,7 +2943,7 @@
                 <w:noProof/>
                 <w:webHidden/>
               </w:rPr>
-              <w:t>157</w:t>
+              <w:t>158</w:t>
             </w:r>
             <w:r>
               <w:rPr>
@@ -3016,7 +3016,7 @@
                 <w:noProof/>
                 <w:webHidden/>
               </w:rPr>
-              <w:t>161</w:t>
+              <w:t>162</w:t>
             </w:r>
             <w:r>
               <w:rPr>
@@ -3089,7 +3089,7 @@
                 <w:noProof/>
                 <w:webHidden/>
               </w:rPr>
-              <w:t>167</w:t>
+              <w:t>168</w:t>
             </w:r>
             <w:r>
               <w:rPr>
@@ -3162,7 +3162,7 @@
                 <w:noProof/>
                 <w:webHidden/>
               </w:rPr>
-              <w:t>171</w:t>
+              <w:t>172</w:t>
             </w:r>
             <w:r>
               <w:rPr>
@@ -3235,7 +3235,7 @@
                 <w:noProof/>
                 <w:webHidden/>
               </w:rPr>
-              <w:t>175</w:t>
+              <w:t>176</w:t>
             </w:r>
             <w:r>
               <w:rPr>
@@ -3308,7 +3308,7 @@
                 <w:noProof/>
                 <w:webHidden/>
               </w:rPr>
-              <w:t>179</w:t>
+              <w:t>180</w:t>
             </w:r>
             <w:r>
               <w:rPr>
@@ -3395,7 +3395,7 @@
                 <w:noProof/>
                 <w:webHidden/>
               </w:rPr>
-              <w:t>181</w:t>
+              <w:t>182</w:t>
             </w:r>
             <w:r>
               <w:rPr>
@@ -5248,6 +5248,7 @@
     </w:p>
     <w:p>
       <w:pPr>
+        <w:spacing w:after="0"/>
         <w:ind w:left="357" w:hanging="357"/>
       </w:pPr>
       <w:r>
@@ -5257,6 +5258,171 @@
         <w:tab/>
       </w:r>
       <w:r>
+        <w:t>“</w:t>
+      </w:r>
+      <w:r>
+        <w:t>Doxxing</w:t>
+      </w:r>
+      <w:r>
+        <w:t>”</w:t>
+      </w:r>
+      <w:r>
+        <w:t xml:space="preserve"> and Weaponised Disclosure of Private Identity</w:t>
+      </w:r>
+    </w:p>
+    <w:p>
+      <w:pPr>
+        <w:ind w:left="720" w:hanging="360"/>
+      </w:pPr>
+      <w:r>
+        <w:t>a)</w:t>
+      </w:r>
+      <w:r>
+        <w:tab/>
+      </w:r>
+      <w:r>
+        <w:t>The publication, broadcast, or distribution of a person’s non-public</w:t>
+      </w:r>
+      <w:r>
+        <w:t xml:space="preserve"> </w:t>
+      </w:r>
+      <w:r>
+        <w:t>personal identifying information</w:t>
+      </w:r>
+      <w:r>
+        <w:t xml:space="preserve"> </w:t>
+      </w:r>
+      <w:r>
+        <w:t>including but not limited to private</w:t>
+      </w:r>
+      <w:r>
+        <w:t xml:space="preserve"> </w:t>
+      </w:r>
+      <w:r>
+        <w:t>residential address, private telephone number, private electronic</w:t>
+      </w:r>
+      <w:r>
+        <w:t xml:space="preserve"> </w:t>
+      </w:r>
+      <w:r>
+        <w:t>address, or the non-public personal identifying information of their</w:t>
+      </w:r>
+      <w:r>
+        <w:t xml:space="preserve"> </w:t>
+      </w:r>
+      <w:r>
+        <w:t>family members</w:t>
+      </w:r>
+      <w:r>
+        <w:t xml:space="preserve"> </w:t>
+      </w:r>
+      <w:r>
+        <w:t>with intent to intimidate, harass, invite violence or</w:t>
+      </w:r>
+      <w:r>
+        <w:t xml:space="preserve"> </w:t>
+      </w:r>
+      <w:r>
+        <w:t>stalking, or cause others to do so, or with wilful blindness that such</w:t>
+      </w:r>
+      <w:r>
+        <w:t xml:space="preserve"> </w:t>
+      </w:r>
+      <w:r>
+        <w:t>use is likely, is prohibited and enjoys no protection under this Articl</w:t>
+      </w:r>
+      <w:r>
+        <w:t>e.</w:t>
+      </w:r>
+    </w:p>
+    <w:p>
+      <w:pPr>
+        <w:ind w:left="720" w:hanging="360"/>
+      </w:pPr>
+      <w:r>
+        <w:t>b)</w:t>
+      </w:r>
+      <w:r>
+        <w:tab/>
+      </w:r>
+      <w:r>
+        <w:t>This section applies to every natural person, corporation, platform, publisher, or other entity. Information already lawfully and widely</w:t>
+      </w:r>
+      <w:r>
+        <w:t xml:space="preserve"> </w:t>
+      </w:r>
+      <w:r>
+        <w:t>public, disclosure with the person’s informed consent, or good-faith</w:t>
+      </w:r>
+      <w:r>
+        <w:t xml:space="preserve"> </w:t>
+      </w:r>
+      <w:r>
+        <w:t>disclosure required for lawful judicial, law-enforcement, or emergency</w:t>
+      </w:r>
+      <w:r>
+        <w:t xml:space="preserve"> </w:t>
+      </w:r>
+      <w:r>
+        <w:t>purposes is not an offence under this section.</w:t>
+      </w:r>
+    </w:p>
+    <w:p>
+      <w:pPr>
+        <w:ind w:left="720" w:hanging="360"/>
+      </w:pPr>
+      <w:r>
+        <w:t>c)</w:t>
+      </w:r>
+      <w:r>
+        <w:tab/>
+      </w:r>
+      <w:r>
+        <w:t>Violation is a felony punishable by imprisonment for not less than</w:t>
+      </w:r>
+      <w:r>
+        <w:t xml:space="preserve"> </w:t>
+      </w:r>
+      <w:r>
+        <w:t>five years, treble damages to each victim, and, where committed by an</w:t>
+      </w:r>
+      <w:r>
+        <w:t xml:space="preserve"> </w:t>
+      </w:r>
+      <w:r>
+        <w:t>entity, a severe fine scaled to revenue together with personal liability</w:t>
+      </w:r>
+      <w:r>
+        <w:t xml:space="preserve"> </w:t>
+      </w:r>
+      <w:r>
+        <w:t>of</w:t>
+      </w:r>
+      <w:r>
+        <w:t xml:space="preserve"> </w:t>
+      </w:r>
+      <w:r>
+        <w:t>responsible officers. Aggravating factors include publication at</w:t>
+      </w:r>
+      <w:r>
+        <w:t xml:space="preserve"> </w:t>
+      </w:r>
+      <w:r>
+        <w:t>scale, for hire, or in a manner calculated to maximise risk of violence.</w:t>
+      </w:r>
+    </w:p>
+    <w:p>
+      <w:pPr>
+        <w:ind w:left="357" w:hanging="357"/>
+      </w:pPr>
+      <w:r>
+        <w:lastRenderedPageBreak/>
+        <w:t>4.</w:t>
+      </w:r>
+      <w:r>
+        <w:tab/>
+      </w:r>
+      <w:r>
         <w:t>No corporation, payment processor, bank, telecommunications provider, or public utility may deny</w:t>
       </w:r>
       <w:r>
@@ -5292,7 +5458,7 @@
         <w:ind w:left="360" w:hanging="360"/>
       </w:pPr>
       <w:r>
-        <w:t>4.</w:t>
+        <w:t>5.</w:t>
       </w:r>
       <w:r>
         <w:tab/>
@@ -5386,11 +5552,144 @@
         <w:t>not</w:t>
       </w:r>
       <w:r>
-        <w:t xml:space="preserve"> create, deploy, or permit algorithmic simulation of user interaction, including but not limited to bot-generated likes, </w:t>
+        <w:t xml:space="preserve"> create, deploy, or permit algorithmic simulation of user interaction, including but not limited to bot-generated likes, comments, replies, views, follows, or any artificial engagement designed to inflate, deflate, or fabricate perceived popularity, consensus, or social proof. All interactions visible to users must originate from natural persons.</w:t>
+      </w:r>
+    </w:p>
+    <w:p>
+      <w:pPr>
+        <w:ind w:left="720" w:hanging="360"/>
+      </w:pPr>
+      <w:r>
+        <w:t>b)</w:t>
+      </w:r>
+      <w:r>
+        <w:tab/>
+      </w:r>
+      <w:r>
+        <w:t>No provider of a public communications platform, domestic or foreign-owned and regardless of physical location, may deny service, limit reach, reduce visibility, demonetise, suspend, or terminate the account of any citizen for the exercise of lawful speech, opinion, or activity.</w:t>
+      </w:r>
+    </w:p>
+    <w:p>
+      <w:pPr>
+        <w:ind w:left="720" w:hanging="360"/>
+      </w:pPr>
+      <w:r>
+        <w:t>c)</w:t>
+      </w:r>
+      <w:r>
+        <w:tab/>
+      </w:r>
+      <w:r>
+        <w:t>Violations of this section are classified and punished as follows</w:t>
+      </w:r>
+      <w:r>
+        <w:t>:</w:t>
+      </w:r>
+    </w:p>
+    <w:p>
+      <w:pPr>
+        <w:ind w:left="1080" w:hanging="360"/>
+      </w:pPr>
+      <w:r>
+        <w:t>i)</w:t>
+      </w:r>
+      <w:r>
+        <w:tab/>
+      </w:r>
+      <w:r>
+        <w:t xml:space="preserve">A non-systemic violation affecting fewer than one thousand citizens that is fully rectified and all affected accounts unconditionally restored within 24 hours of formal notice incurs </w:t>
       </w:r>
       <w:r>
         <w:lastRenderedPageBreak/>
-        <w:t>comments, replies, views, follows, or any artificial engagement designed to inflate, deflate, or fabricate perceived popularity, consensus, or social proof. All interactions visible to users must originate from natural persons.</w:t>
+        <w:t>no penalty beyond a mandatory public explanation and algorithmic audit.</w:t>
+      </w:r>
+    </w:p>
+    <w:p>
+      <w:pPr>
+        <w:ind w:left="1080" w:hanging="360"/>
+      </w:pPr>
+      <w:r>
+        <w:t>ii)</w:t>
+      </w:r>
+      <w:r>
+        <w:tab/>
+      </w:r>
+      <w:r>
+        <w:t>Any single, non-systemic violation affecting fewer than one thousand citizens that is not rectified within 24 hours, or any systemic or repeated violation affecting fewer than one thousand citizens, incurs a substantial fine and mandatory public algorithmic audit.</w:t>
+      </w:r>
+    </w:p>
+    <w:p>
+      <w:pPr>
+        <w:ind w:left="1080" w:hanging="360"/>
+      </w:pPr>
+      <w:r>
+        <w:t>iii)</w:t>
+      </w:r>
+      <w:r>
+        <w:tab/>
+      </w:r>
+      <w:r>
+        <w:t>Any systemic or repeated violation affecting one thousand or more citizens, or any violation that persists more than 72 hours after formal notice, escalates automatically to</w:t>
+      </w:r>
+      <w:r>
+        <w:t>:</w:t>
+      </w:r>
+      <w:r>
+        <w:t xml:space="preserve"> severe fines scaled to a significant portion of annual domestic revenue; mandatory divestiture of Canadian operations to a </w:t>
+      </w:r>
+      <w:r>
+        <w:t>Dominion</w:t>
+      </w:r>
+      <w:r>
+        <w:t>-compliant entity; and personal liability of responsible officers for damages payable to affected citizens.</w:t>
+      </w:r>
+    </w:p>
+    <w:p>
+      <w:pPr>
+        <w:ind w:left="1080" w:hanging="360"/>
+      </w:pPr>
+      <w:r>
+        <w:t>iv)</w:t>
+      </w:r>
+      <w:r>
+        <w:tab/>
+      </w:r>
+      <w:r>
+        <w:t xml:space="preserve">A wilful, persistent, and nationwide campaign of censorship triggers immediate and permanent revocation of licence to operate in the </w:t>
+      </w:r>
+      <w:r>
+        <w:t>Dominion</w:t>
+      </w:r>
+      <w:r>
+        <w:t>, seizure of all domestic assets, and personal liability of responsible officers for treble damages.</w:t>
+      </w:r>
+    </w:p>
+    <w:p>
+      <w:pPr>
+        <w:ind w:left="1077" w:hanging="357"/>
+      </w:pPr>
+      <w:r>
+        <w:t>v)</w:t>
+      </w:r>
+      <w:r>
+        <w:tab/>
+      </w:r>
+      <w:r>
+        <w:t>Fines are payable to the sovereign wealth fund. All proceedings are public and triable by a special tribunal of three senior judges.</w:t>
+      </w:r>
+    </w:p>
+    <w:p>
+      <w:pPr>
+        <w:ind w:left="360" w:hanging="360"/>
+      </w:pPr>
+      <w:r>
+        <w:t>5.</w:t>
+      </w:r>
+      <w:r>
+        <w:tab/>
+      </w:r>
+      <w:r>
+        <w:t xml:space="preserve">Institutional Accountability for Mass Deception </w:t>
       </w:r>
     </w:p>
     <w:p>
@@ -5398,13 +5697,31 @@
         <w:ind w:left="720" w:hanging="360"/>
       </w:pPr>
       <w:r>
+        <w:t>a)</w:t>
+      </w:r>
+      <w:r>
+        <w:tab/>
+      </w:r>
+      <w:r>
+        <w:t>Nothing in this Article shall ever limit, chill, or punish the speech of natural persons, unincorporated associations, or media enterprises whose annual domestic revenue is less than one hundred times the national median wage. Such persons and enterprises retain absolute protection.</w:t>
+      </w:r>
+    </w:p>
+    <w:p>
+      <w:pPr>
+        <w:ind w:left="720" w:hanging="360"/>
+      </w:pPr>
+      <w:r>
         <w:t>b)</w:t>
       </w:r>
       <w:r>
         <w:tab/>
       </w:r>
       <w:r>
-        <w:t>No provider of a public communications platform, domestic or foreign-owned and regardless of physical location, may deny service, limit reach, reduce visibility, demonetise, suspend, or terminate the account of any citizen for the exercise of lawful speech, opinion, or activity.</w:t>
+        <w:t xml:space="preserve">A corporate entity or licensed broadcaster whose domestic audience regularly exceeds ten percent (10 %) of the citizen population that knowingly publishes or broadcasts a statement of material fact it knows or deliberately avoids knowing to be false, with specific intent to deceive citizens on matters of public policy, national security, public </w:t>
+      </w:r>
+      <w:r>
+        <w:lastRenderedPageBreak/>
+        <w:t>health, electoral choice, or demographic continuity, commits the offence of Institutional Deception.</w:t>
       </w:r>
     </w:p>
     <w:p>
@@ -5418,259 +5735,110 @@
         <w:tab/>
       </w:r>
       <w:r>
-        <w:t>Violations of this section are classified and punished as follows</w:t>
+        <w:t>The offence is triable only by a jury of twelve citizens chosen by blind lot, with conviction requiring a unanimous verdict; however, if the jury cannot reach unanimity after a reasonable period of deliberation as determined by the presiding judge, a verdict may be accepted by a majority of at least ten jurors.</w:t>
+      </w:r>
+      <w:r>
+        <w:t xml:space="preserve"> The prosecution must prove beyond reasonable doubt: </w:t>
+      </w:r>
+    </w:p>
+    <w:p>
+      <w:pPr>
+        <w:ind w:left="1080" w:hanging="360"/>
+      </w:pPr>
+      <w:r>
+        <w:t>i)</w:t>
+      </w:r>
+      <w:r>
+        <w:tab/>
+      </w:r>
+      <w:r>
+        <w:t xml:space="preserve">objective falsity or deliberate material omission; </w:t>
+      </w:r>
+    </w:p>
+    <w:p>
+      <w:pPr>
+        <w:ind w:left="1080" w:hanging="360"/>
+      </w:pPr>
+      <w:r>
+        <w:t>ii)</w:t>
+      </w:r>
+      <w:r>
+        <w:tab/>
+      </w:r>
+      <w:r>
+        <w:t xml:space="preserve">actual knowledge or wilful blindness of the responsible officers; </w:t>
+      </w:r>
+    </w:p>
+    <w:p>
+      <w:pPr>
+        <w:ind w:left="1080" w:hanging="360"/>
+      </w:pPr>
+      <w:r>
+        <w:t>iii)</w:t>
+      </w:r>
+      <w:r>
+        <w:tab/>
+      </w:r>
+      <w:r>
+        <w:t xml:space="preserve">intent to deceive on one of the protected subject areas; and </w:t>
+      </w:r>
+    </w:p>
+    <w:p>
+      <w:pPr>
+        <w:ind w:left="1080" w:hanging="360"/>
+      </w:pPr>
+      <w:r>
+        <w:t>iv)</w:t>
+      </w:r>
+      <w:r>
+        <w:tab/>
+      </w:r>
+      <w:r>
+        <w:t>quantifiable harm to the public interest.</w:t>
+      </w:r>
+    </w:p>
+    <w:p>
+      <w:pPr>
+        <w:ind w:left="720" w:hanging="360"/>
+      </w:pPr>
+      <w:r>
+        <w:t>d)</w:t>
+      </w:r>
+      <w:r>
+        <w:tab/>
+      </w:r>
+      <w:r>
+        <w:t xml:space="preserve">Punishment upon conviction: </w:t>
+      </w:r>
+    </w:p>
+    <w:p>
+      <w:pPr>
+        <w:ind w:left="1080" w:hanging="360"/>
+      </w:pPr>
+      <w:r>
+        <w:t>i)</w:t>
+      </w:r>
+      <w:r>
+        <w:tab/>
+      </w:r>
+      <w:r>
+        <w:t>First offence</w:t>
       </w:r>
       <w:r>
         <w:t>:</w:t>
       </w:r>
+      <w:r>
+        <w:t xml:space="preserve"> </w:t>
+      </w:r>
+      <w:r>
+        <w:t>a severe fine scaled to a significant portion of most recent annual domestic revenue, payable to the sovereign wealth fund.</w:t>
+      </w:r>
     </w:p>
     <w:p>
       <w:pPr>
         <w:ind w:left="1080" w:hanging="360"/>
       </w:pPr>
       <w:r>
-        <w:t>i)</w:t>
-      </w:r>
-      <w:r>
-        <w:tab/>
-      </w:r>
-      <w:r>
-        <w:t>A non-systemic violation affecting fewer than one thousand citizens that is fully rectified and all affected accounts unconditionally restored within 24 hours of formal notice incurs no penalty beyond a mandatory public explanation and algorithmic audit.</w:t>
-      </w:r>
-    </w:p>
-    <w:p>
-      <w:pPr>
-        <w:ind w:left="1080" w:hanging="360"/>
-      </w:pPr>
-      <w:r>
-        <w:t>ii)</w:t>
-      </w:r>
-      <w:r>
-        <w:tab/>
-      </w:r>
-      <w:r>
-        <w:t>Any single, non-systemic violation affecting fewer than one thousand citizens that is not rectified within 24 hours, or any systemic or repeated violation affecting fewer than one thousand citizens, incurs a substantial fine and mandatory public algorithmic audit.</w:t>
-      </w:r>
-    </w:p>
-    <w:p>
-      <w:pPr>
-        <w:ind w:left="1080" w:hanging="360"/>
-      </w:pPr>
-      <w:r>
-        <w:t>iii)</w:t>
-      </w:r>
-      <w:r>
-        <w:tab/>
-      </w:r>
-      <w:r>
-        <w:t>Any systemic or repeated violation affecting one thousand or more citizens, or any violation that persists more than 72 hours after formal notice, escalates automatically to</w:t>
-      </w:r>
-      <w:r>
-        <w:t>:</w:t>
-      </w:r>
-      <w:r>
-        <w:t xml:space="preserve"> severe fines scaled to a significant portion of annual domestic revenue; mandatory divestiture of Canadian operations to a </w:t>
-      </w:r>
-      <w:r>
-        <w:t>Dominion</w:t>
-      </w:r>
-      <w:r>
-        <w:t>-compliant entity; and personal liability of responsible officers for damages payable to affected citizens.</w:t>
-      </w:r>
-    </w:p>
-    <w:p>
-      <w:pPr>
-        <w:ind w:left="1080" w:hanging="360"/>
-      </w:pPr>
-      <w:r>
-        <w:t>iv)</w:t>
-      </w:r>
-      <w:r>
-        <w:tab/>
-      </w:r>
-      <w:r>
-        <w:t xml:space="preserve">A wilful, persistent, and nationwide campaign of censorship triggers immediate and permanent revocation of licence to operate in the </w:t>
-      </w:r>
-      <w:r>
-        <w:t>Dominion</w:t>
-      </w:r>
-      <w:r>
-        <w:t>, seizure of all domestic assets, and personal liability of responsible officers for treble damages.</w:t>
-      </w:r>
-    </w:p>
-    <w:p>
-      <w:pPr>
-        <w:ind w:left="1077" w:hanging="357"/>
-      </w:pPr>
-      <w:r>
-        <w:lastRenderedPageBreak/>
-        <w:t>v)</w:t>
-      </w:r>
-      <w:r>
-        <w:tab/>
-      </w:r>
-      <w:r>
-        <w:t>Fines are payable to the sovereign wealth fund. All proceedings are public and triable by a special tribunal of three senior judges.</w:t>
-      </w:r>
-    </w:p>
-    <w:p>
-      <w:pPr>
-        <w:ind w:left="360" w:hanging="360"/>
-      </w:pPr>
-      <w:r>
-        <w:t>5.</w:t>
-      </w:r>
-      <w:r>
-        <w:tab/>
-      </w:r>
-      <w:r>
-        <w:t xml:space="preserve">Institutional Accountability for Mass Deception </w:t>
-      </w:r>
-    </w:p>
-    <w:p>
-      <w:pPr>
-        <w:ind w:left="720" w:hanging="360"/>
-      </w:pPr>
-      <w:r>
-        <w:t>a)</w:t>
-      </w:r>
-      <w:r>
-        <w:tab/>
-      </w:r>
-      <w:r>
-        <w:t>Nothing in this Article shall ever limit, chill, or punish the speech of natural persons, unincorporated associations, or media enterprises whose annual domestic revenue is less than one hundred times the national median wage. Such persons and enterprises retain absolute protection.</w:t>
-      </w:r>
-    </w:p>
-    <w:p>
-      <w:pPr>
-        <w:ind w:left="720" w:hanging="360"/>
-      </w:pPr>
-      <w:r>
-        <w:t>b)</w:t>
-      </w:r>
-      <w:r>
-        <w:tab/>
-      </w:r>
-      <w:r>
-        <w:t>A corporate entity or licensed broadcaster whose domestic audience regularly exceeds ten percent (10 %) of the citizen population that knowingly publishes or broadcasts a statement of material fact it knows or deliberately avoids knowing to be false, with specific intent to deceive citizens on matters of public policy, national security, public health, electoral choice, or demographic continuity, commits the offence of Institutional Deception.</w:t>
-      </w:r>
-    </w:p>
-    <w:p>
-      <w:pPr>
-        <w:ind w:left="720" w:hanging="360"/>
-      </w:pPr>
-      <w:r>
-        <w:t>c)</w:t>
-      </w:r>
-      <w:r>
-        <w:tab/>
-      </w:r>
-      <w:r>
-        <w:t>The offence is triable only by a jury of twelve citizens chosen by blind lot, with conviction requiring a unanimous verdict; however, if the jury cannot reach unanimity after a reasonable period of deliberation as determined by the presiding judge, a verdict may be accepted by a majority of at least ten jurors.</w:t>
-      </w:r>
-      <w:r>
-        <w:t xml:space="preserve"> The prosecution must prove beyond reasonable doubt: </w:t>
-      </w:r>
-    </w:p>
-    <w:p>
-      <w:pPr>
-        <w:ind w:left="1080" w:hanging="360"/>
-      </w:pPr>
-      <w:r>
-        <w:t>i)</w:t>
-      </w:r>
-      <w:r>
-        <w:tab/>
-      </w:r>
-      <w:r>
-        <w:t xml:space="preserve">objective falsity or deliberate material omission; </w:t>
-      </w:r>
-    </w:p>
-    <w:p>
-      <w:pPr>
-        <w:ind w:left="1080" w:hanging="360"/>
-      </w:pPr>
-      <w:r>
-        <w:t>ii)</w:t>
-      </w:r>
-      <w:r>
-        <w:tab/>
-      </w:r>
-      <w:r>
-        <w:t xml:space="preserve">actual knowledge or wilful blindness of the responsible officers; </w:t>
-      </w:r>
-    </w:p>
-    <w:p>
-      <w:pPr>
-        <w:ind w:left="1080" w:hanging="360"/>
-      </w:pPr>
-      <w:r>
-        <w:t>iii)</w:t>
-      </w:r>
-      <w:r>
-        <w:tab/>
-      </w:r>
-      <w:r>
-        <w:t xml:space="preserve">intent to deceive on one of the protected subject areas; and </w:t>
-      </w:r>
-    </w:p>
-    <w:p>
-      <w:pPr>
-        <w:ind w:left="1080" w:hanging="360"/>
-      </w:pPr>
-      <w:r>
-        <w:t>iv)</w:t>
-      </w:r>
-      <w:r>
-        <w:tab/>
-      </w:r>
-      <w:r>
-        <w:t>quantifiable harm to the public interest.</w:t>
-      </w:r>
-    </w:p>
-    <w:p>
-      <w:pPr>
-        <w:ind w:left="720" w:hanging="360"/>
-      </w:pPr>
-      <w:r>
-        <w:t>d)</w:t>
-      </w:r>
-      <w:r>
-        <w:tab/>
-      </w:r>
-      <w:r>
-        <w:t xml:space="preserve">Punishment upon conviction: </w:t>
-      </w:r>
-    </w:p>
-    <w:p>
-      <w:pPr>
-        <w:ind w:left="1080" w:hanging="360"/>
-      </w:pPr>
-      <w:r>
-        <w:t>i)</w:t>
-      </w:r>
-      <w:r>
-        <w:tab/>
-      </w:r>
-      <w:r>
-        <w:t>First offence</w:t>
-      </w:r>
-      <w:r>
-        <w:t>:</w:t>
-      </w:r>
-      <w:r>
-        <w:t xml:space="preserve"> </w:t>
-      </w:r>
-      <w:r>
-        <w:t>a severe fine scaled to a significant portion of most recent annual domestic revenue, payable to the sovereign wealth fund.</w:t>
-      </w:r>
-    </w:p>
-    <w:p>
-      <w:pPr>
-        <w:ind w:left="1080" w:hanging="360"/>
-      </w:pPr>
-      <w:r>
-        <w:lastRenderedPageBreak/>
         <w:t>ii)</w:t>
       </w:r>
       <w:r>
@@ -8358,7 +8526,6 @@
     </w:p>
     <w:p>
       <w:r>
-        <w:lastRenderedPageBreak/>
         <w:t>Precis:</w:t>
       </w:r>
     </w:p>
@@ -8417,11 +8584,7 @@
         <w:t xml:space="preserve">, </w:t>
       </w:r>
       <w:r>
-        <w:t xml:space="preserve">balance compassion with accountability, while post-first-trimester registration enables state-facilitated adoption or paternal custody, empowering biological fathers with absolute rights unless proven unfit. This framework aligns with meritocratic principles by favoring competent guardianship and treating the killing of a pregnant woman as double murder from conception, deterring violent crimes that target vulnerable families, and providing safe, anonymous surrender of children at any age without stigma to encourage responsible alternatives. By classifying unauthorized terminations of viable fetuses as murder, it incorporates generous provisions for surrender to eliminate excuses for harm, drawing from European familial norms that emphasize paternal involvement and child welfare over individual convenience. This comprehensive approach not only upholds national vitality but also </w:t>
-      </w:r>
-      <w:r>
-        <w:lastRenderedPageBreak/>
-        <w:t xml:space="preserve">counters twenty-first-century challenges like declining birthrates or bioethical exploitation that could undermine the </w:t>
+        <w:t xml:space="preserve">balance compassion with accountability, while post-first-trimester registration enables state-facilitated adoption or paternal custody, empowering biological fathers with absolute rights unless proven unfit. This framework aligns with meritocratic principles by favoring competent guardianship and treating the killing of a pregnant woman as double murder from conception, deterring violent crimes that target vulnerable families, and providing safe, anonymous surrender of children at any age without stigma to encourage responsible alternatives. By classifying unauthorized terminations of viable fetuses as murder, it incorporates generous provisions for surrender to eliminate excuses for harm, drawing from European familial norms that emphasize paternal involvement and child welfare over individual convenience. This comprehensive approach not only upholds national vitality but also counters twenty-first-century challenges like declining birthrates or bioethical exploitation that could undermine the </w:t>
       </w:r>
       <w:r>
         <w:t>Dominion</w:t>
@@ -8574,11 +8737,7 @@
         <w:t>Indian</w:t>
       </w:r>
       <w:r>
-        <w:t xml:space="preserve"> inhabitants, as recognized on the date of ratification, are fully protected for </w:t>
-      </w:r>
-      <w:r>
-        <w:lastRenderedPageBreak/>
-        <w:t xml:space="preserve">those grandfathered citizens and their descendants on par with the European traditions in </w:t>
+        <w:t xml:space="preserve"> inhabitants, as recognized on the date of ratification, are fully protected for those grandfathered citizens and their descendants on par with the European traditions in </w:t>
       </w:r>
       <w:r>
         <w:t>s</w:t>
@@ -8921,7 +9080,6 @@
         <w:ind w:left="720" w:hanging="360"/>
       </w:pPr>
       <w:r>
-        <w:lastRenderedPageBreak/>
         <w:t>d)</w:t>
       </w:r>
       <w:r>
@@ -8940,6 +9098,7 @@
         <w:contextualSpacing w:val="0"/>
       </w:pPr>
       <w:r>
+        <w:lastRenderedPageBreak/>
         <w:t xml:space="preserve">Corporations or entities convicted of paying or facilitating such bribes shall have their charter or licence to operate in the </w:t>
       </w:r>
       <w:r>
@@ -9408,47 +9567,47 @@
         <w:ind w:left="720" w:hanging="360"/>
       </w:pPr>
       <w:r>
+        <w:t>c)</w:t>
+      </w:r>
+      <w:r>
+        <w:tab/>
+      </w:r>
+      <w:r>
+        <w:t xml:space="preserve">Proof of unmixed European descent under </w:t>
+      </w:r>
+      <w:r>
+        <w:t xml:space="preserve">section </w:t>
+      </w:r>
+      <w:r>
+        <w:t xml:space="preserve">3;  </w:t>
+      </w:r>
+    </w:p>
+    <w:p>
+      <w:pPr>
+        <w:ind w:left="720" w:hanging="360"/>
+      </w:pPr>
+      <w:r>
+        <w:t>d)</w:t>
+      </w:r>
+      <w:r>
+        <w:tab/>
+      </w:r>
+      <w:r>
+        <w:t xml:space="preserve">Good character and demonstrated contribution to the </w:t>
+      </w:r>
+      <w:r>
+        <w:t>Dominion</w:t>
+      </w:r>
+      <w:r>
+        <w:t>;</w:t>
+      </w:r>
+    </w:p>
+    <w:p>
+      <w:pPr>
+        <w:ind w:left="720" w:hanging="357"/>
+      </w:pPr>
+      <w:r>
         <w:lastRenderedPageBreak/>
-        <w:t>c)</w:t>
-      </w:r>
-      <w:r>
-        <w:tab/>
-      </w:r>
-      <w:r>
-        <w:t xml:space="preserve">Proof of unmixed European descent under </w:t>
-      </w:r>
-      <w:r>
-        <w:t xml:space="preserve">section </w:t>
-      </w:r>
-      <w:r>
-        <w:t xml:space="preserve">3;  </w:t>
-      </w:r>
-    </w:p>
-    <w:p>
-      <w:pPr>
-        <w:ind w:left="720" w:hanging="360"/>
-      </w:pPr>
-      <w:r>
-        <w:t>d)</w:t>
-      </w:r>
-      <w:r>
-        <w:tab/>
-      </w:r>
-      <w:r>
-        <w:t xml:space="preserve">Good character and demonstrated contribution to the </w:t>
-      </w:r>
-      <w:r>
-        <w:t>Dominion</w:t>
-      </w:r>
-      <w:r>
-        <w:t>;</w:t>
-      </w:r>
-    </w:p>
-    <w:p>
-      <w:pPr>
-        <w:ind w:left="720" w:hanging="357"/>
-      </w:pPr>
-      <w:r>
         <w:t>e)</w:t>
       </w:r>
       <w:r>
@@ -9637,11 +9796,14 @@
         <w:t xml:space="preserve">Every individual who, on the date of ratification, possesses registered Indian status under the former Indian Act or recognised Métis citizenship under the criteria in force on 31 December 2025, together with their lineal descendants, is immediately and irrevocably granted full citizenship on the same terms and with the same rights and duties as citizens of unmixed European descent. This grant is a final, one-time, and non-expandable act of historic reconciliation. No new </w:t>
       </w:r>
       <w:r>
+        <w:t>Indian</w:t>
+      </w:r>
+      <w:r>
+        <w:t xml:space="preserve"> or Métis citizenship categories may ever be created, and all separate legal status, reserves, and race-based programmes are abolished as per Article 8. On the tenth anniversary of ratification, all </w:t>
+      </w:r>
+      <w:r>
         <w:lastRenderedPageBreak/>
-        <w:t>Indian</w:t>
-      </w:r>
-      <w:r>
-        <w:t xml:space="preserve"> or Métis citizenship categories may ever be created, and all separate legal status, reserves, and race-based programmes are abolished as per Article 8. On the tenth anniversary of ratification, all administrative designations in the National Registry of Citizens that identify citizens as having been granted citizenship under </w:t>
+        <w:t xml:space="preserve">administrative designations in the National Registry of Citizens that identify citizens as having been granted citizenship under </w:t>
       </w:r>
       <w:r>
         <w:t xml:space="preserve">section </w:t>
@@ -9769,15 +9931,15 @@
         <w:ind w:left="360"/>
       </w:pPr>
       <w:r>
+        <w:t xml:space="preserve">The National Registry of Qualified Experts shall be maintained simultaneously in at least five geographically dispersed, physically hardened, and mutually independent forms: </w:t>
+      </w:r>
+    </w:p>
+    <w:p>
+      <w:pPr>
+        <w:ind w:left="1080" w:hanging="360"/>
+      </w:pPr>
+      <w:r>
         <w:lastRenderedPageBreak/>
-        <w:t xml:space="preserve">The National Registry of Qualified Experts shall be maintained simultaneously in at least five geographically dispersed, physically hardened, and mutually independent forms: </w:t>
-      </w:r>
-    </w:p>
-    <w:p>
-      <w:pPr>
-        <w:ind w:left="1080" w:hanging="360"/>
-      </w:pPr>
-      <w:r>
         <w:t>i)</w:t>
       </w:r>
       <w:r>
@@ -9912,7 +10074,6 @@
         <w:contextualSpacing w:val="0"/>
       </w:pPr>
       <w:r>
-        <w:lastRenderedPageBreak/>
         <w:t>Deliberate omission or falsification of registration data by an issuing institution, or any attempt to corrupt the Registry or selection process, is punishable as a crime against the Constitution</w:t>
       </w:r>
       <w:r>
@@ -9953,6 +10114,7 @@
         <w:ind w:left="720" w:hanging="360"/>
       </w:pPr>
       <w:r>
+        <w:lastRenderedPageBreak/>
         <w:t>a)</w:t>
       </w:r>
       <w:r>
@@ -10151,65 +10313,97 @@
         <w:t xml:space="preserve"> </w:t>
       </w:r>
       <w:r>
-        <w:t xml:space="preserve">Upon satisfactory verification, the Registrar shall immediately enter the child </w:t>
-      </w:r>
+        <w:t>Upon satisfactory verification, the Registrar shall immediately enter the child into the National Registry of Citizens and issue a lifelong citizenship certificate.</w:t>
+      </w:r>
+    </w:p>
+    <w:p>
+      <w:pPr>
+        <w:ind w:left="720" w:hanging="360"/>
+      </w:pPr>
+      <w:r>
+        <w:t>h)</w:t>
+      </w:r>
+      <w:r>
+        <w:tab/>
+      </w:r>
+      <w:r>
+        <w:t>Failure to register within the prescribed period without reasonable cause incurs no penalty against the child but requires prompt rectification by the parents or guardians.</w:t>
+      </w:r>
+    </w:p>
+    <w:p>
+      <w:pPr>
+        <w:ind w:left="720" w:hanging="360"/>
+      </w:pPr>
+      <w:r>
+        <w:t>i)</w:t>
+      </w:r>
+      <w:r>
+        <w:tab/>
+      </w:r>
+      <w:r>
+        <w:t xml:space="preserve">Hospitals, midwives, and other birth attendants within the </w:t>
+      </w:r>
+      <w:r>
+        <w:t>Dominion</w:t>
+      </w:r>
+      <w:r>
+        <w:t xml:space="preserve"> shall provide parents with registration forms and instructions as a routine duty.</w:t>
+      </w:r>
+    </w:p>
+    <w:p>
+      <w:pPr>
+        <w:ind w:left="720" w:hanging="360"/>
+      </w:pPr>
+      <w:r>
+        <w:t>j)</w:t>
+      </w:r>
+      <w:r>
+        <w:tab/>
+      </w:r>
+      <w:r>
+        <w:t xml:space="preserve">Metadata tied to the identification string </w:t>
+      </w:r>
+      <w:r>
+        <w:t>shall be limited to the following essential metadata</w:t>
+      </w:r>
+      <w:r>
+        <w:t xml:space="preserve">: </w:t>
+      </w:r>
+    </w:p>
+    <w:p>
+      <w:pPr>
+        <w:ind w:left="1080" w:hanging="360"/>
+      </w:pPr>
       <w:r>
         <w:lastRenderedPageBreak/>
-        <w:t>into the National Registry of Citizens and issue a lifelong citizenship certificate.</w:t>
-      </w:r>
-    </w:p>
-    <w:p>
-      <w:pPr>
-        <w:ind w:left="720" w:hanging="360"/>
-      </w:pPr>
-      <w:r>
-        <w:t>h)</w:t>
-      </w:r>
-      <w:r>
-        <w:tab/>
-      </w:r>
-      <w:r>
-        <w:t>Failure to register within the prescribed period without reasonable cause incurs no penalty against the child but requires prompt rectification by the parents or guardians.</w:t>
-      </w:r>
-    </w:p>
-    <w:p>
-      <w:pPr>
-        <w:ind w:left="720" w:hanging="360"/>
-      </w:pPr>
-      <w:r>
         <w:t>i)</w:t>
       </w:r>
       <w:r>
         <w:tab/>
       </w:r>
       <w:r>
-        <w:t xml:space="preserve">Hospitals, midwives, and other birth attendants within the </w:t>
-      </w:r>
-      <w:r>
-        <w:t>Dominion</w:t>
-      </w:r>
-      <w:r>
-        <w:t xml:space="preserve"> shall provide parents with registration forms and instructions as a routine duty.</w:t>
-      </w:r>
-    </w:p>
-    <w:p>
-      <w:pPr>
-        <w:ind w:left="720" w:hanging="360"/>
-      </w:pPr>
-      <w:r>
-        <w:t>j)</w:t>
-      </w:r>
-      <w:r>
-        <w:tab/>
-      </w:r>
-      <w:r>
-        <w:t xml:space="preserve">Metadata tied to the identification string </w:t>
-      </w:r>
-      <w:r>
-        <w:t>shall be limited to the following essential metadata</w:t>
-      </w:r>
-      <w:r>
-        <w:t xml:space="preserve">: </w:t>
+        <w:t>time of birth</w:t>
+      </w:r>
+      <w:r>
+        <w:t xml:space="preserve"> determined </w:t>
+      </w:r>
+      <w:r>
+        <w:t xml:space="preserve">to </w:t>
+      </w:r>
+      <w:r>
+        <w:t>the</w:t>
+      </w:r>
+      <w:r>
+        <w:t xml:space="preserve"> minute</w:t>
+      </w:r>
+      <w:r>
+        <w:t>, as 24-hour format</w:t>
+      </w:r>
+      <w:r>
+        <w:t xml:space="preserve"> HH:MM:SS</w:t>
+      </w:r>
+      <w:r>
+        <w:t>, local time</w:t>
       </w:r>
     </w:p>
     <w:p>
@@ -10217,34 +10411,22 @@
         <w:ind w:left="1080" w:hanging="360"/>
       </w:pPr>
       <w:r>
-        <w:t>i)</w:t>
-      </w:r>
-      <w:r>
-        <w:tab/>
-      </w:r>
-      <w:r>
-        <w:t>time of birth</w:t>
-      </w:r>
-      <w:r>
-        <w:t xml:space="preserve"> determined </w:t>
-      </w:r>
-      <w:r>
-        <w:t xml:space="preserve">to </w:t>
-      </w:r>
-      <w:r>
-        <w:t>the</w:t>
-      </w:r>
-      <w:r>
-        <w:t xml:space="preserve"> minute</w:t>
-      </w:r>
-      <w:r>
-        <w:t>, as 24-hour format</w:t>
-      </w:r>
-      <w:r>
-        <w:t xml:space="preserve"> HH:MM:SS</w:t>
-      </w:r>
-      <w:r>
-        <w:t>, local time</w:t>
+        <w:t>ii)</w:t>
+      </w:r>
+      <w:r>
+        <w:tab/>
+      </w:r>
+      <w:r>
+        <w:t>date of birth</w:t>
+      </w:r>
+      <w:r>
+        <w:t xml:space="preserve"> as year, month, day</w:t>
+      </w:r>
+      <w:r>
+        <w:t xml:space="preserve"> YYYY:MM:DD</w:t>
+      </w:r>
+      <w:r>
+        <w:t>, local day</w:t>
       </w:r>
     </w:p>
     <w:p>
@@ -10252,22 +10434,31 @@
         <w:ind w:left="1080" w:hanging="360"/>
       </w:pPr>
       <w:r>
-        <w:t>ii)</w:t>
-      </w:r>
-      <w:r>
-        <w:tab/>
-      </w:r>
-      <w:r>
-        <w:t>date of birth</w:t>
-      </w:r>
-      <w:r>
-        <w:t xml:space="preserve"> as year, month, day</w:t>
-      </w:r>
-      <w:r>
-        <w:t xml:space="preserve"> YYYY:MM:DD</w:t>
-      </w:r>
-      <w:r>
-        <w:t>, local day</w:t>
+        <w:t>iii)</w:t>
+      </w:r>
+      <w:r>
+        <w:tab/>
+      </w:r>
+      <w:r>
+        <w:t>place of birth</w:t>
+      </w:r>
+      <w:r>
+        <w:t>, with fields for</w:t>
+      </w:r>
+      <w:r>
+        <w:t xml:space="preserve"> town</w:t>
+      </w:r>
+      <w:r>
+        <w:t xml:space="preserve"> or</w:t>
+      </w:r>
+      <w:r>
+        <w:t xml:space="preserve"> city, county</w:t>
+      </w:r>
+      <w:r>
+        <w:t>, and province</w:t>
+      </w:r>
+      <w:r>
+        <w:t>, or if abroad, foreign location data</w:t>
       </w:r>
     </w:p>
     <w:p>
@@ -10275,31 +10466,16 @@
         <w:ind w:left="1080" w:hanging="360"/>
       </w:pPr>
       <w:r>
-        <w:t>iii)</w:t>
-      </w:r>
-      <w:r>
-        <w:tab/>
-      </w:r>
-      <w:r>
-        <w:t>place of birth</w:t>
-      </w:r>
-      <w:r>
-        <w:t>, with fields for</w:t>
-      </w:r>
-      <w:r>
-        <w:t xml:space="preserve"> town</w:t>
-      </w:r>
-      <w:r>
-        <w:t xml:space="preserve"> or</w:t>
-      </w:r>
-      <w:r>
-        <w:t xml:space="preserve"> city, county</w:t>
-      </w:r>
-      <w:r>
-        <w:t>, and province</w:t>
-      </w:r>
-      <w:r>
-        <w:t>, or if abroad, foreign location data</w:t>
+        <w:t>iv)</w:t>
+      </w:r>
+      <w:r>
+        <w:tab/>
+      </w:r>
+      <w:r>
+        <w:t>parental citizenship identification string</w:t>
+      </w:r>
+      <w:r>
+        <w:t xml:space="preserve"> from each parent</w:t>
       </w:r>
     </w:p>
     <w:p>
@@ -10307,16 +10483,16 @@
         <w:ind w:left="1080" w:hanging="360"/>
       </w:pPr>
       <w:r>
-        <w:t>iv)</w:t>
-      </w:r>
-      <w:r>
-        <w:tab/>
-      </w:r>
-      <w:r>
-        <w:t>parental citizenship identification string</w:t>
-      </w:r>
-      <w:r>
-        <w:t xml:space="preserve"> from each parent</w:t>
+        <w:t>v)</w:t>
+      </w:r>
+      <w:r>
+        <w:tab/>
+      </w:r>
+      <w:r>
+        <w:t xml:space="preserve">biological </w:t>
+      </w:r>
+      <w:r>
+        <w:t>sex</w:t>
       </w:r>
     </w:p>
     <w:p>
@@ -10324,16 +10500,19 @@
         <w:ind w:left="1080" w:hanging="360"/>
       </w:pPr>
       <w:r>
-        <w:t>v)</w:t>
-      </w:r>
-      <w:r>
-        <w:tab/>
-      </w:r>
-      <w:r>
-        <w:t xml:space="preserve">biological </w:t>
-      </w:r>
-      <w:r>
-        <w:t>sex</w:t>
+        <w:t>vi)</w:t>
+      </w:r>
+      <w:r>
+        <w:tab/>
+      </w:r>
+      <w:r>
+        <w:t>full legal name at birth, with fields for first, middle</w:t>
+      </w:r>
+      <w:r>
+        <w:t>(s)</w:t>
+      </w:r>
+      <w:r>
+        <w:t>, and last name</w:t>
       </w:r>
     </w:p>
     <w:p>
@@ -10341,19 +10520,37 @@
         <w:ind w:left="1080" w:hanging="360"/>
       </w:pPr>
       <w:r>
-        <w:t>vi)</w:t>
-      </w:r>
-      <w:r>
-        <w:tab/>
-      </w:r>
-      <w:r>
-        <w:t>full legal name at birth, with fields for first, middle</w:t>
-      </w:r>
-      <w:r>
-        <w:t>(s)</w:t>
-      </w:r>
-      <w:r>
-        <w:t>, and last name</w:t>
+        <w:t>vii)</w:t>
+      </w:r>
+      <w:r>
+        <w:tab/>
+      </w:r>
+      <w:r>
+        <w:t>date</w:t>
+      </w:r>
+      <w:r>
+        <w:t>,</w:t>
+      </w:r>
+      <w:r>
+        <w:t xml:space="preserve"> time</w:t>
+      </w:r>
+      <w:r>
+        <w:t>, and place</w:t>
+      </w:r>
+      <w:r>
+        <w:t xml:space="preserve"> of death, entered only upon verified posthumous notification</w:t>
+      </w:r>
+      <w:r>
+        <w:t>, in the same format as subclauses i)</w:t>
+      </w:r>
+      <w:r>
+        <w:t>,</w:t>
+      </w:r>
+      <w:r>
+        <w:t xml:space="preserve"> ii)</w:t>
+      </w:r>
+      <w:r>
+        <w:t>, iii).</w:t>
       </w:r>
     </w:p>
     <w:p>
@@ -10361,44 +10558,6 @@
         <w:ind w:left="1080" w:hanging="360"/>
       </w:pPr>
       <w:r>
-        <w:t>vii)</w:t>
-      </w:r>
-      <w:r>
-        <w:tab/>
-      </w:r>
-      <w:r>
-        <w:t>date</w:t>
-      </w:r>
-      <w:r>
-        <w:t>,</w:t>
-      </w:r>
-      <w:r>
-        <w:t xml:space="preserve"> time</w:t>
-      </w:r>
-      <w:r>
-        <w:t>, and place</w:t>
-      </w:r>
-      <w:r>
-        <w:t xml:space="preserve"> of death, entered only upon verified posthumous notification</w:t>
-      </w:r>
-      <w:r>
-        <w:t>, in the same format as subclauses i)</w:t>
-      </w:r>
-      <w:r>
-        <w:t>,</w:t>
-      </w:r>
-      <w:r>
-        <w:t xml:space="preserve"> ii)</w:t>
-      </w:r>
-      <w:r>
-        <w:t>, iii).</w:t>
-      </w:r>
-    </w:p>
-    <w:p>
-      <w:pPr>
-        <w:ind w:left="1080" w:hanging="360"/>
-      </w:pPr>
-      <w:r>
         <w:t>viii)</w:t>
       </w:r>
       <w:r>
@@ -10437,11 +10596,7 @@
         <w:t>’</w:t>
       </w:r>
       <w:r>
-        <w:t xml:space="preserve">s citizenship identification string and corroborating evidence (e.g., medical certificate of death). Upon verification, the Registrar shall update the registry with the date and </w:t>
-      </w:r>
-      <w:r>
-        <w:lastRenderedPageBreak/>
-        <w:t>time of death. Failure to report without reasonable cause incurs no penalty against heirs but requires prompt rectification.</w:t>
+        <w:t>s citizenship identification string and corroborating evidence (e.g., medical certificate of death). Upon verification, the Registrar shall update the registry with the date and time of death. Failure to report without reasonable cause incurs no penalty against heirs but requires prompt rectification.</w:t>
       </w:r>
       <w:r>
         <w:t xml:space="preserve"> </w:t>
@@ -10538,6 +10693,7 @@
         <w:ind w:left="720" w:hanging="360"/>
       </w:pPr>
       <w:r>
+        <w:lastRenderedPageBreak/>
         <w:t>iv)</w:t>
       </w:r>
       <w:r>
@@ -10604,11 +10760,51 @@
         <w:tab/>
       </w:r>
       <w:r>
-        <w:t xml:space="preserve">Within ninety days of ratification, the Supreme Court shall appoint the Registrar of Constitutional Registries. Upon appointment, the Registrar shall immediately commence the process of populating the </w:t>
+        <w:t>Within ninety days of ratification, the Supreme Court shall appoint the Registrar of Constitutional Registries. Upon appointment, the Registrar shall immediately commence the process of populating the National Registry of Citizens and the National Registry of Qualified Experts, utilizing subordinate staff and, if deemed necessary, forming ad-hoc transitional teams composed of qualified citizens with expertise in genealogy, data verification, and administration. The Registrar shall collaborate with domestic accredited institutions, pre-ratification government records, and the public to ensure comprehensive, merit-based enrollment.</w:t>
+      </w:r>
+    </w:p>
+    <w:p>
+      <w:pPr>
+        <w:ind w:left="720" w:hanging="360"/>
+      </w:pPr>
+      <w:r>
+        <w:t>b)</w:t>
+      </w:r>
+      <w:r>
+        <w:tab/>
+      </w:r>
+      <w:r>
+        <w:t xml:space="preserve">For the National Registry of Citizens: A mandatory </w:t>
+      </w:r>
+      <w:r>
+        <w:t>tw</w:t>
+      </w:r>
+      <w:r>
+        <w:t>e</w:t>
+      </w:r>
+      <w:r>
+        <w:t>nty-four</w:t>
+      </w:r>
+      <w:r>
+        <w:t>-month application window shall open post-appointment for all pre-ratification Canadian citizens and residents to apply for entry, requiring proof of unmixed European descent per Article 9, section 3 (e.g., civil records, statutory declarations, or subsidized DNA tests from Registrar-accredited labs). Existing federal records for registered Indians and Métis (as of December 31, 2025) shall be automatically imported and verified, with lineal descendants applying via simplified forms. Non-qualifying applicants default to permanent resident status without political rights.</w:t>
+      </w:r>
+    </w:p>
+    <w:p>
+      <w:pPr>
+        <w:ind w:left="720" w:hanging="360"/>
+      </w:pPr>
+      <w:r>
+        <w:t>c)</w:t>
+      </w:r>
+      <w:r>
+        <w:tab/>
+      </w:r>
+      <w:r>
+        <w:t xml:space="preserve">Permanent non-citizen residents enjoy all rights and protections enumerated in the Charter of Rights and Freedoms except political rights, the franchise (Article 16), eligibility for public office or employment in the public service (Article 14), adoption or </w:t>
       </w:r>
       <w:r>
         <w:lastRenderedPageBreak/>
-        <w:t>National Registry of Citizens and the National Registry of Qualified Experts, utilizing subordinate staff and, if deemed necessary, forming ad-hoc transitional teams composed of qualified citizens with expertise in genealogy, data verification, and administration. The Registrar shall collaborate with domestic accredited institutions, pre-ratification government records, and the public to ensure comprehensive, merit-based enrollment.</w:t>
+        <w:t>guardianship of citizen children (Article 5), and any right to transmit citizenship to offspring. They are subject to national preference in employment, housing allocation, and public benefits (Article 8) and to the demographic caps of this Article. Once the 90 % European threshold is certified by the Registrar, further non-European immigration ceases except for the exceptional cases in Article 8.4; existing permanent residents remain indefinitely unless convicted of felony or voluntary departure.</w:t>
       </w:r>
     </w:p>
     <w:p>
@@ -10616,161 +10812,174 @@
         <w:ind w:left="720" w:hanging="360"/>
       </w:pPr>
       <w:r>
+        <w:t>d)</w:t>
+      </w:r>
+      <w:r>
+        <w:tab/>
+      </w:r>
+      <w:r>
+        <w:t xml:space="preserve">For the National Registry of Qualified Experts: All accredited institutions (domestic and foreign, if degrees were recognized pre-ratification) shall submit historical graduate records for </w:t>
+      </w:r>
+      <w:r>
+        <w:t>Dominion</w:t>
+      </w:r>
+      <w:r>
+        <w:t xml:space="preserve"> citizens (retroactive fifty years), including degree details, within six months of the Registrar</w:t>
+      </w:r>
+      <w:r>
+        <w:t>’</w:t>
+      </w:r>
+      <w:r>
+        <w:t>s request. The Registrar shall verify descent per Article 9, section 3 through cross-referencing or requiring supplemental proof from individuals. Individuals may self-register with certified transcripts. Omissions or delays incur fines up to ten percent of institutional funding.</w:t>
+      </w:r>
+    </w:p>
+    <w:p>
+      <w:pPr>
+        <w:ind w:left="714" w:hanging="357"/>
+      </w:pPr>
+      <w:r>
+        <w:t>e)</w:t>
+      </w:r>
+      <w:r>
+        <w:tab/>
+      </w:r>
+      <w:r>
+        <w:t xml:space="preserve">All operations shall comply with the </w:t>
+      </w:r>
+      <w:r>
+        <w:t xml:space="preserve">necessary </w:t>
+      </w:r>
+      <w:r>
+        <w:t xml:space="preserve">security protocols in </w:t>
+      </w:r>
+      <w:r>
+        <w:t xml:space="preserve">this </w:t>
+      </w:r>
+      <w:r>
+        <w:t xml:space="preserve">Article from inception, funded from the sovereign wealth fund under Article 20. Fraud or sabotage shall be punished per section </w:t>
+      </w:r>
+      <w:r>
+        <w:t>14</w:t>
+      </w:r>
+      <w:r>
+        <w:t>. The Registrar shall publish quarterly anonymized progress reports to ensure transparency and merit-based integrity.</w:t>
+      </w:r>
+    </w:p>
+    <w:p>
+      <w:pPr>
+        <w:ind w:left="360" w:hanging="360"/>
+      </w:pPr>
+      <w:r>
+        <w:t>15.</w:t>
+      </w:r>
+      <w:r>
+        <w:tab/>
+      </w:r>
+      <w:r>
+        <w:t>Transitional Demographic Restoration</w:t>
+      </w:r>
+    </w:p>
+    <w:p>
+      <w:pPr>
+        <w:ind w:left="720" w:hanging="360"/>
+      </w:pPr>
+      <w:r>
+        <w:t>a)</w:t>
+      </w:r>
+      <w:r>
+        <w:tab/>
+      </w:r>
+      <w:r>
+        <w:t xml:space="preserve">Upon ratification of this Constitution, the </w:t>
+      </w:r>
+      <w:r>
+        <w:t>Dominion</w:t>
+      </w:r>
+      <w:r>
+        <w:t xml:space="preserve"> shall establish a National Registry and Continuity Directorate (NRCD. The NRCD shall have sole authority to verify residency status against the National Registry of </w:t>
+      </w:r>
+      <w:r>
+        <w:t>Citizens</w:t>
+      </w:r>
+      <w:r>
+        <w:t xml:space="preserve"> established under Article 9, identify non-qualifying residents, and enforce orderly departure from the territory of the </w:t>
+      </w:r>
+      <w:r>
+        <w:t>Dominion</w:t>
+      </w:r>
+      <w:r>
+        <w:t>.</w:t>
+      </w:r>
+    </w:p>
+    <w:p>
+      <w:pPr>
+        <w:ind w:left="720" w:hanging="360"/>
+      </w:pPr>
+      <w:r>
         <w:t>b)</w:t>
       </w:r>
       <w:r>
         <w:tab/>
       </w:r>
       <w:r>
-        <w:t xml:space="preserve">For the National Registry of Citizens: A mandatory </w:t>
-      </w:r>
-      <w:r>
-        <w:t>tw</w:t>
-      </w:r>
-      <w:r>
-        <w:t>e</w:t>
-      </w:r>
-      <w:r>
-        <w:t>nty-four</w:t>
-      </w:r>
-      <w:r>
-        <w:t>-month application window shall open post-appointment for all pre-ratification Canadian citizens and residents to apply for entry, requiring proof of unmixed European descent per Article 9, section 3 (e.g., civil records, statutory declarations, or subsidized DNA tests from Registrar-accredited labs). Existing federal records for registered Indians and Métis (as of December 31, 2025) shall be automatically imported and verified, with lineal descendants applying via simplified forms. Non-qualifying applicants default to permanent resident status without political rights.</w:t>
-      </w:r>
-    </w:p>
-    <w:p>
-      <w:pPr>
-        <w:ind w:left="720" w:hanging="360"/>
-      </w:pPr>
-      <w:r>
-        <w:t>c)</w:t>
-      </w:r>
-      <w:r>
-        <w:tab/>
-      </w:r>
-      <w:r>
-        <w:t>Permanent non-citizen residents enjoy all rights and protections enumerated in the Charter of Rights and Freedoms except political rights, the franchise (Article 16), eligibility for public office or employment in the public service (Article 14), adoption or guardianship of citizen children (Article 5), and any right to transmit citizenship to offspring. They are subject to national preference in employment, housing allocation, and public benefits (Article 8) and to the demographic caps of this Article. Once the 90 % European threshold is certified by the Registrar, further non-European immigration ceases except for the exceptional cases in Article 8.4; existing permanent residents remain indefinitely unless convicted of felony or voluntary departure.</w:t>
-      </w:r>
-    </w:p>
-    <w:p>
-      <w:pPr>
-        <w:ind w:left="720" w:hanging="360"/>
-      </w:pPr>
-      <w:r>
-        <w:t>d)</w:t>
-      </w:r>
-      <w:r>
-        <w:tab/>
-      </w:r>
-      <w:r>
-        <w:t xml:space="preserve">For the National Registry of Qualified Experts: All accredited institutions (domestic and foreign, if degrees were recognized pre-ratification) shall submit historical graduate records for </w:t>
-      </w:r>
-      <w:r>
-        <w:t>Dominion</w:t>
-      </w:r>
-      <w:r>
-        <w:t xml:space="preserve"> citizens (retroactive fifty years), including degree details, within six months of the Registrar</w:t>
-      </w:r>
-      <w:r>
-        <w:t>’</w:t>
-      </w:r>
-      <w:r>
-        <w:t xml:space="preserve">s request. The Registrar shall verify descent </w:t>
-      </w:r>
+        <w:t xml:space="preserve">A phased remigration program shall commence within ninety days of ratification and continue until the prohibitions against demographic displacement in Charter Clause 6 and Article 8 are fully satisfied. </w:t>
+      </w:r>
+    </w:p>
+    <w:p>
+      <w:pPr>
+        <w:ind w:left="1080" w:hanging="360"/>
+      </w:pPr>
+      <w:r>
+        <w:t>i)</w:t>
+      </w:r>
+      <w:r>
+        <w:tab/>
+      </w:r>
+      <w:r>
+        <w:t>Phase priority shall proceed as follows:</w:t>
+      </w:r>
+    </w:p>
+    <w:p>
+      <w:pPr>
+        <w:ind w:left="1440" w:hanging="360"/>
+      </w:pPr>
+      <w:r>
+        <w:t>(i)</w:t>
+      </w:r>
+      <w:r>
+        <w:tab/>
+      </w:r>
+      <w:r>
+        <w:t>All holders of temporary visas, work permits, study permits, visitor status, and undocumented entrants;</w:t>
+      </w:r>
+    </w:p>
+    <w:p>
+      <w:pPr>
+        <w:ind w:left="1440" w:hanging="360"/>
+      </w:pPr>
       <w:r>
         <w:lastRenderedPageBreak/>
-        <w:t>per Article 9, section 3 through cross-referencing or requiring supplemental proof from individuals. Individuals may self-register with certified transcripts. Omissions or delays incur fines up to ten percent of institutional funding.</w:t>
-      </w:r>
-    </w:p>
-    <w:p>
-      <w:pPr>
-        <w:ind w:left="714" w:hanging="357"/>
-      </w:pPr>
-      <w:r>
-        <w:t>e)</w:t>
-      </w:r>
-      <w:r>
-        <w:tab/>
-      </w:r>
-      <w:r>
-        <w:t xml:space="preserve">All operations shall comply with the </w:t>
-      </w:r>
-      <w:r>
-        <w:t xml:space="preserve">necessary </w:t>
-      </w:r>
-      <w:r>
-        <w:t xml:space="preserve">security protocols in </w:t>
-      </w:r>
-      <w:r>
-        <w:t xml:space="preserve">this </w:t>
-      </w:r>
-      <w:r>
-        <w:t xml:space="preserve">Article from inception, funded from the sovereign wealth fund under Article 20. Fraud or sabotage shall be punished per section </w:t>
-      </w:r>
-      <w:r>
-        <w:t>14</w:t>
-      </w:r>
-      <w:r>
-        <w:t>. The Registrar shall publish quarterly anonymized progress reports to ensure transparency and merit-based integrity.</w:t>
-      </w:r>
-    </w:p>
-    <w:p>
-      <w:pPr>
-        <w:ind w:left="360" w:hanging="360"/>
-      </w:pPr>
-      <w:r>
-        <w:t>15.</w:t>
-      </w:r>
-      <w:r>
-        <w:tab/>
-      </w:r>
-      <w:r>
-        <w:t>Transitional Demographic Restoration</w:t>
-      </w:r>
-    </w:p>
-    <w:p>
-      <w:pPr>
-        <w:ind w:left="720" w:hanging="360"/>
-      </w:pPr>
-      <w:r>
-        <w:t>a)</w:t>
-      </w:r>
-      <w:r>
-        <w:tab/>
-      </w:r>
-      <w:r>
-        <w:t xml:space="preserve">Upon ratification of this Constitution, the </w:t>
-      </w:r>
-      <w:r>
-        <w:t>Dominion</w:t>
-      </w:r>
-      <w:r>
-        <w:t xml:space="preserve"> shall establish a National Registry and Continuity Directorate (NRCD. The NRCD shall have sole authority to verify residency status against the National Registry of </w:t>
-      </w:r>
-      <w:r>
-        <w:t>Citizens</w:t>
-      </w:r>
-      <w:r>
-        <w:t xml:space="preserve"> established under Article 9, identify non-qualifying residents, and enforce orderly departure from the territory of the </w:t>
-      </w:r>
-      <w:r>
-        <w:t>Dominion</w:t>
-      </w:r>
-      <w:r>
-        <w:t>.</w:t>
-      </w:r>
-    </w:p>
-    <w:p>
-      <w:pPr>
-        <w:ind w:left="720" w:hanging="360"/>
-      </w:pPr>
-      <w:r>
-        <w:t>b)</w:t>
-      </w:r>
-      <w:r>
-        <w:tab/>
-      </w:r>
-      <w:r>
-        <w:t xml:space="preserve">A phased remigration program shall commence within ninety days of ratification and continue until the prohibitions against demographic displacement in Charter Clause 6 and Article 8 are fully satisfied. </w:t>
+        <w:t>(ii)</w:t>
+      </w:r>
+      <w:r>
+        <w:tab/>
+      </w:r>
+      <w:r>
+        <w:t>Permanent residents granted status most recently, proceeding chronologically backward by date of landing;</w:t>
+      </w:r>
+    </w:p>
+    <w:p>
+      <w:pPr>
+        <w:ind w:left="1440" w:hanging="360"/>
+      </w:pPr>
+      <w:r>
+        <w:t>(iii)</w:t>
+      </w:r>
+      <w:r>
+        <w:tab/>
+      </w:r>
+      <w:r>
+        <w:t>All other non-citizens and non-qualifying long-term residents.</w:t>
       </w:r>
     </w:p>
     <w:p>
@@ -10778,55 +10987,13 @@
         <w:ind w:left="1080" w:hanging="360"/>
       </w:pPr>
       <w:r>
-        <w:t>i)</w:t>
-      </w:r>
-      <w:r>
-        <w:tab/>
-      </w:r>
-      <w:r>
-        <w:t>Phase priority shall proceed as follows:</w:t>
-      </w:r>
-    </w:p>
-    <w:p>
-      <w:pPr>
-        <w:ind w:left="1440" w:hanging="360"/>
-      </w:pPr>
-      <w:r>
-        <w:t>(i)</w:t>
-      </w:r>
-      <w:r>
-        <w:tab/>
-      </w:r>
-      <w:r>
-        <w:t>All holders of temporary visas, work permits, study permits, visitor status, and undocumented entrants;</w:t>
-      </w:r>
-    </w:p>
-    <w:p>
-      <w:pPr>
-        <w:ind w:left="1440" w:hanging="360"/>
-      </w:pPr>
-      <w:r>
-        <w:t>(ii)</w:t>
-      </w:r>
-      <w:r>
-        <w:tab/>
-      </w:r>
-      <w:r>
-        <w:t>Permanent residents granted status most recently, proceeding chronologically backward by date of landing;</w:t>
-      </w:r>
-    </w:p>
-    <w:p>
-      <w:pPr>
-        <w:ind w:left="1440" w:hanging="360"/>
-      </w:pPr>
-      <w:r>
-        <w:t>(iii)</w:t>
-      </w:r>
-      <w:r>
-        <w:tab/>
-      </w:r>
-      <w:r>
-        <w:t>All other non-citizens and non-qualifying long-term residents.</w:t>
+        <w:t>ii)</w:t>
+      </w:r>
+      <w:r>
+        <w:tab/>
+      </w:r>
+      <w:r>
+        <w:t>The NRCD shall issue formal departure notices with reasonable timelines proportionate to length of prior residence, not exceeding twenty-four months for any individual.</w:t>
       </w:r>
     </w:p>
     <w:p>
@@ -10834,21 +11001,6 @@
         <w:ind w:left="1080" w:hanging="360"/>
       </w:pPr>
       <w:r>
-        <w:t>ii)</w:t>
-      </w:r>
-      <w:r>
-        <w:tab/>
-      </w:r>
-      <w:r>
-        <w:t>The NRCD shall issue formal departure notices with reasonable timelines proportionate to length of prior residence, not exceeding twenty-four months for any individual.</w:t>
-      </w:r>
-    </w:p>
-    <w:p>
-      <w:pPr>
-        <w:ind w:left="1080" w:hanging="360"/>
-      </w:pPr>
-      <w:r>
-        <w:lastRenderedPageBreak/>
         <w:t>iii)</w:t>
       </w:r>
       <w:r>
@@ -11359,14 +11511,17 @@
         <w:ind w:left="720" w:hanging="360"/>
       </w:pPr>
       <w:r>
+        <w:t>a)</w:t>
+      </w:r>
+      <w:r>
+        <w:tab/>
+      </w:r>
+      <w:r>
+        <w:t xml:space="preserve">No citizen challenge shall stay any operational order, or portion thereof, that the executive certifies in writing is immediately necessary to prevent loss of human life or catastrophic destruction of inhabited </w:t>
+      </w:r>
+      <w:r>
         <w:lastRenderedPageBreak/>
-        <w:t>a)</w:t>
-      </w:r>
-      <w:r>
-        <w:tab/>
-      </w:r>
-      <w:r>
-        <w:t>No citizen challenge shall stay any operational order, or portion thereof, that the executive certifies in writing is immediately necessary to prevent loss of human life or catastrophic destruction of inhabited property during an active natural disaster (wildfire, flood, earthquake, volcanic eruption, hurricane, or equivalent event)</w:t>
+        <w:t>property during an active natural disaster (wildfire, flood, earthquake, volcanic eruption, hurricane, or equivalent event)</w:t>
       </w:r>
       <w:r>
         <w:t xml:space="preserve"> or invasion</w:t>
@@ -12062,21 +12217,21 @@
         <w:ind w:left="720" w:hanging="360"/>
       </w:pPr>
       <w:r>
+        <w:t>d)</w:t>
+      </w:r>
+      <w:r>
+        <w:tab/>
+      </w:r>
+      <w:r>
+        <w:t xml:space="preserve">may veto legislation (veto override requires a three-quarters vote of the House), </w:t>
+      </w:r>
+    </w:p>
+    <w:p>
+      <w:pPr>
+        <w:ind w:left="720" w:hanging="357"/>
+      </w:pPr>
+      <w:r>
         <w:lastRenderedPageBreak/>
-        <w:t>d)</w:t>
-      </w:r>
-      <w:r>
-        <w:tab/>
-      </w:r>
-      <w:r>
-        <w:t xml:space="preserve">may veto legislation (veto override requires a three-quarters vote of the House), </w:t>
-      </w:r>
-    </w:p>
-    <w:p>
-      <w:pPr>
-        <w:ind w:left="720" w:hanging="357"/>
-      </w:pPr>
-      <w:r>
         <w:t>e)</w:t>
       </w:r>
       <w:r>
@@ -12171,11 +12326,11 @@
         <w:tab/>
       </w:r>
       <w:r>
-        <w:t xml:space="preserve">Question Period is abolished in its current theatrical form. Instead, every Wednesday the Prime Minister and every minister shall appear in person </w:t>
+        <w:t xml:space="preserve">Question Period is abolished in its current theatrical form. Instead, every Wednesday the Prime Minister and every minister shall appear in person before the House for a maximum of three hours of direct, unscripted questioning by any member. Questions are limited to two minutes; answers </w:t>
       </w:r>
       <w:r>
         <w:lastRenderedPageBreak/>
-        <w:t xml:space="preserve">before the House for a maximum of three hours of direct, unscripted questioning by any member. Questions are limited to two minutes; answers to four minutes. No points of order, no props, no applause, no prepared talking points. </w:t>
+        <w:t xml:space="preserve">to four minutes. No points of order, no props, no applause, no prepared talking points. </w:t>
       </w:r>
       <w:r>
         <w:t>Sessions are live-streamed and permanently archived.</w:t>
@@ -12302,28 +12457,28 @@
         <w:tab/>
       </w:r>
       <w:r>
-        <w:t xml:space="preserve">Members of the House may not serve simultaneously as ministers or as provincial legislators. Members receive a salary fixed at twice the national </w:t>
+        <w:t>Members of the House may not serve simultaneously as ministers or as provincial legislators. Members receive a salary fixed at twice the national median wage and are subject to immediate recall by petition of ten percent of their riding’s electors.</w:t>
+      </w:r>
+      <w:r>
+        <w:t xml:space="preserve"> </w:t>
+      </w:r>
+    </w:p>
+    <w:p>
+      <w:pPr>
+        <w:ind w:left="357" w:hanging="357"/>
+      </w:pPr>
+      <w:r>
+        <w:t>18)</w:t>
+      </w:r>
+      <w:r>
+        <w:tab/>
+      </w:r>
+      <w:r>
+        <w:t xml:space="preserve">The provinces retain exclusive jurisdiction over education, health, municipal institutions, property and civil rights, natural resources within their boundaries, and all matters of a purely local or private nature. All </w:t>
       </w:r>
       <w:r>
         <w:lastRenderedPageBreak/>
-        <w:t>median wage and are subject to immediate recall by petition of ten percent of their riding’s electors.</w:t>
-      </w:r>
-      <w:r>
-        <w:t xml:space="preserve"> </w:t>
-      </w:r>
-    </w:p>
-    <w:p>
-      <w:pPr>
-        <w:ind w:left="357" w:hanging="357"/>
-      </w:pPr>
-      <w:r>
-        <w:t>18)</w:t>
-      </w:r>
-      <w:r>
-        <w:tab/>
-      </w:r>
-      <w:r>
-        <w:t>The provinces retain exclusive jurisdiction over education, health, municipal institutions, property and civil rights, natural resources within their boundaries, and all matters of a purely local or private nature. All residual powers belong to the national government. No concurrent powers exist except where explicitly stated in this Constitution.</w:t>
+        <w:t>residual powers belong to the national government. No concurrent powers exist except where explicitly stated in this Constitution.</w:t>
       </w:r>
     </w:p>
     <w:p>
@@ -12703,21 +12858,21 @@
         <w:ind w:left="360" w:hanging="357"/>
       </w:pPr>
       <w:r>
+        <w:t>4.</w:t>
+      </w:r>
+      <w:r>
+        <w:tab/>
+      </w:r>
+      <w:r>
+        <w:t>Every candidate for or holder of public office or judicial appointment must, upon nomination and annually thereafter, make full public disclosure of all personal and family financial holdings, debts, and sources of income.</w:t>
+      </w:r>
+    </w:p>
+    <w:p>
+      <w:pPr>
+        <w:ind w:left="360" w:hanging="357"/>
+      </w:pPr>
+      <w:r>
         <w:lastRenderedPageBreak/>
-        <w:t>4.</w:t>
-      </w:r>
-      <w:r>
-        <w:tab/>
-      </w:r>
-      <w:r>
-        <w:t>Every candidate for or holder of public office or judicial appointment must, upon nomination and annually thereafter, make full public disclosure of all personal and family financial holdings, debts, and sources of income.</w:t>
-      </w:r>
-    </w:p>
-    <w:p>
-      <w:pPr>
-        <w:ind w:left="360" w:hanging="357"/>
-      </w:pPr>
-      <w:r>
         <w:t>5.</w:t>
       </w:r>
       <w:r>
@@ -12900,11 +13055,7 @@
         <w:t>of</w:t>
       </w:r>
       <w:r>
-        <w:t xml:space="preserve"> </w:t>
-      </w:r>
-      <w:r>
-        <w:lastRenderedPageBreak/>
-        <w:t>government.</w:t>
+        <w:t xml:space="preserve"> government.</w:t>
       </w:r>
       <w:r>
         <w:t xml:space="preserve"> Any person discovered</w:t>
@@ -12947,6 +13098,7 @@
         <w:contextualSpacing w:val="0"/>
       </w:pPr>
       <w:r>
+        <w:lastRenderedPageBreak/>
         <w:t>Sexual offences against minors, any non-consensual sexual crime committed by a public servant (past or present), or possession of child sexual abuse material by a public servant shall be punished by death by firing squad under the provisions of Article 5 and Article 15, in addition to automatic removal and permanent disqualification.</w:t>
       </w:r>
       <w:r>
@@ -13034,7 +13186,6 @@
         <w:ind w:left="360" w:hanging="360"/>
       </w:pPr>
       <w:r>
-        <w:lastRenderedPageBreak/>
         <w:t>11.</w:t>
       </w:r>
       <w:r>
@@ -13056,7 +13207,11 @@
         <w:t>business</w:t>
       </w:r>
       <w:r>
-        <w:t>-class equivalents are prohibited. All claims must be publicly itemized and posted online within seven days. Violation constitutes waste of public funds under section 6 and triggers the full penalties therein.</w:t>
+        <w:t xml:space="preserve">-class equivalents are prohibited. All claims </w:t>
+      </w:r>
+      <w:r>
+        <w:lastRenderedPageBreak/>
+        <w:t>must be publicly itemized and posted online within seven days. Violation constitutes waste of public funds under section 6 and triggers the full penalties therein.</w:t>
       </w:r>
     </w:p>
     <w:p/>
@@ -13288,8 +13443,73 @@
         <w:pStyle w:val="ListParagraph"/>
       </w:pPr>
       <w:r>
+        <w:t>For each vacancy, the commission shall propose a shortlist of three qualified candidates ranked by merit. The provincial premier shall appoint one from this shortlist.</w:t>
+      </w:r>
+    </w:p>
+    <w:p>
+      <w:pPr>
+        <w:pStyle w:val="ListParagraph"/>
+      </w:pPr>
+      <w:r>
         <w:lastRenderedPageBreak/>
-        <w:t>For each vacancy, the commission shall propose a shortlist of three qualified candidates ranked by merit. The provincial premier shall appoint one from this shortlist.</w:t>
+        <w:t xml:space="preserve">Provincial superior court judges serve until mandatory retirement at age </w:t>
+      </w:r>
+      <w:r>
+        <w:t>60</w:t>
+      </w:r>
+      <w:r>
+        <w:t>. Removal occurs only by a two-thirds vote of the provincial legislature for proven misbehaviour or incapacity.</w:t>
+      </w:r>
+    </w:p>
+    <w:p>
+      <w:pPr>
+        <w:ind w:left="720" w:hanging="357"/>
+      </w:pPr>
+      <w:r>
+        <w:t>c)</w:t>
+      </w:r>
+      <w:r>
+        <w:tab/>
+      </w:r>
+      <w:r>
+        <w:t xml:space="preserve">Members of the Judicial Appointments Commissions, whether federal or provincial, who serve in their capacity as senior judges or as members of the House or provincial legislature, receive no additional compensation beyond their existing salaries. Citizen members selected by lot receive full reimbursement of any wages lost during the period of service, plus a daily honorarium equal to twice the national median daily wage. Each commission convenes only for the time required to evaluate candidates and produce the mandated shortlist for the vacancy or vacancies under consideration, </w:t>
+      </w:r>
+      <w:r>
+        <w:t>never to exceed four weeks</w:t>
+      </w:r>
+      <w:r>
+        <w:t>.</w:t>
+      </w:r>
+      <w:r>
+        <w:t xml:space="preserve"> </w:t>
+      </w:r>
+    </w:p>
+    <w:p>
+      <w:pPr>
+        <w:ind w:left="360" w:hanging="357"/>
+      </w:pPr>
+      <w:r>
+        <w:t>5.</w:t>
+      </w:r>
+      <w:r>
+        <w:tab/>
+      </w:r>
+      <w:r>
+        <w:t>Judicial and Official Liability for Enabling Recidivism</w:t>
+      </w:r>
+    </w:p>
+    <w:p>
+      <w:pPr>
+        <w:ind w:left="720" w:hanging="360"/>
+      </w:pPr>
+      <w:r>
+        <w:t>a)</w:t>
+      </w:r>
+      <w:r>
+        <w:tab/>
+      </w:r>
+      <w:r>
+        <w:t>Purpose</w:t>
       </w:r>
     </w:p>
     <w:p>
@@ -13297,18 +13517,40 @@
         <w:pStyle w:val="ListParagraph"/>
       </w:pPr>
       <w:r>
-        <w:t xml:space="preserve">Provincial superior court judges serve until mandatory retirement at age </w:t>
-      </w:r>
-      <w:r>
-        <w:t>60</w:t>
-      </w:r>
-      <w:r>
-        <w:t>. Removal occurs only by a two-thirds vote of the provincial legislature for proven misbehaviour or incapacity.</w:t>
-      </w:r>
-    </w:p>
-    <w:p>
-      <w:pPr>
-        <w:ind w:left="720" w:hanging="357"/>
+        <w:t xml:space="preserve">The </w:t>
+      </w:r>
+      <w:r>
+        <w:t>Dominion</w:t>
+      </w:r>
+      <w:r>
+        <w:t xml:space="preserve"> recognises that the premature or inadequate restoration of liberty to a violent or designated high-harm offender is among the gravest betrayals of public trust. Officials who order, approve, or facilitate such liberty share criminal responsibility when predictable further harm follows.</w:t>
+      </w:r>
+    </w:p>
+    <w:p>
+      <w:pPr>
+        <w:ind w:left="720" w:hanging="360"/>
+      </w:pPr>
+      <w:r>
+        <w:t>b)</w:t>
+      </w:r>
+      <w:r>
+        <w:tab/>
+      </w:r>
+      <w:r>
+        <w:t xml:space="preserve">Covered Decision-Makers </w:t>
+      </w:r>
+    </w:p>
+    <w:p>
+      <w:pPr>
+        <w:pStyle w:val="ListParagraph"/>
+      </w:pPr>
+      <w:r>
+        <w:t>This section applies to every judge, justice of the peace, parole or release-board member, prosecutor, corrections official, or other person acting under colour of law who orders, recommends, approves, or materially facilitates any Covered Liberty Decision under subsection (c).</w:t>
+      </w:r>
+    </w:p>
+    <w:p>
+      <w:pPr>
+        <w:ind w:left="720" w:hanging="360"/>
       </w:pPr>
       <w:r>
         <w:t>c)</w:t>
@@ -13317,30 +13559,637 @@
         <w:tab/>
       </w:r>
       <w:r>
-        <w:t xml:space="preserve">Members of the Judicial Appointments Commissions, whether federal or provincial, who serve in their capacity as senior judges or as members of the House or provincial legislature, receive no additional compensation beyond their existing salaries. Citizen members selected by lot receive full reimbursement of any wages lost during the period of service, plus a daily honorarium equal to twice the national median daily wage. Each commission convenes only for the time required to evaluate candidates and produce the mandated shortlist for the vacancy or vacancies under consideration, </w:t>
-      </w:r>
-      <w:r>
-        <w:t>never to exceed four weeks</w:t>
-      </w:r>
-      <w:r>
-        <w:t>.</w:t>
+        <w:t>Covered Liberty Decisions</w:t>
+      </w:r>
+    </w:p>
+    <w:p>
+      <w:pPr>
+        <w:pStyle w:val="ListParagraph"/>
+      </w:pPr>
+      <w:r>
+        <w:t>A Covered Liberty Decision is any of the following concerning a person charged with, or convicted of, a violent offence, or a Designated High-Harm Offence as defined in subsection (l):</w:t>
+      </w:r>
+    </w:p>
+    <w:p>
+      <w:pPr>
+        <w:ind w:left="1080" w:hanging="360"/>
+      </w:pPr>
+      <w:r>
+        <w:t>i)</w:t>
+      </w:r>
+      <w:r>
+        <w:tab/>
+      </w:r>
+      <w:r>
+        <w:t>early release, parole, temporary absence, day pass, or any form of release before the full term required by this Article or by mandatory minimum sentence;</w:t>
+      </w:r>
+    </w:p>
+    <w:p>
+      <w:pPr>
+        <w:ind w:left="1080" w:hanging="360"/>
+      </w:pPr>
+      <w:r>
+        <w:lastRenderedPageBreak/>
+        <w:t>ii)</w:t>
+      </w:r>
+      <w:r>
+        <w:tab/>
+      </w:r>
+      <w:r>
+        <w:t>bail, judicial interim release, release pending appeal, or stay of proceedings that returns the person to the community when this Constitution or ordinary law required detention;</w:t>
+      </w:r>
+    </w:p>
+    <w:p>
+      <w:pPr>
+        <w:ind w:left="1080" w:hanging="360"/>
+      </w:pPr>
+      <w:r>
+        <w:t>iii)</w:t>
+      </w:r>
+      <w:r>
+        <w:tab/>
+      </w:r>
+      <w:r>
+        <w:t>house arrest, electronic monitoring, or any community-based substitute for custodial detention that functions as de facto release from secure custody;</w:t>
+      </w:r>
+    </w:p>
+    <w:p>
+      <w:pPr>
+        <w:ind w:left="1080" w:hanging="360"/>
+      </w:pPr>
+      <w:r>
+        <w:t>iv)</w:t>
+      </w:r>
+      <w:r>
+        <w:tab/>
+      </w:r>
+      <w:r>
+        <w:t>a sentence below the mandatory minimum applicable under section 2, or any sentence or disposition that violates section 3 or section 8(d); or</w:t>
+      </w:r>
+    </w:p>
+    <w:p>
+      <w:pPr>
+        <w:ind w:left="1080" w:hanging="360"/>
+      </w:pPr>
+      <w:r>
+        <w:t>v)</w:t>
+      </w:r>
+      <w:r>
+        <w:tab/>
+      </w:r>
+      <w:r>
+        <w:t>any order that knowingly or recklessly frustrates the full service of a lawful custodial sentence.</w:t>
+      </w:r>
+    </w:p>
+    <w:p>
+      <w:pPr>
+        <w:ind w:left="720" w:hanging="360"/>
+      </w:pPr>
+      <w:r>
+        <w:t>d)</w:t>
+      </w:r>
+      <w:r>
+        <w:tab/>
+      </w:r>
+      <w:r>
+        <w:t>Manifestly Inadequate Sentence</w:t>
+      </w:r>
+    </w:p>
+    <w:p>
+      <w:pPr>
+        <w:pStyle w:val="ListParagraph"/>
+      </w:pPr>
+      <w:r>
+        <w:t>A sentence or disposition is “manifestly inadequate” when it:</w:t>
+      </w:r>
+    </w:p>
+    <w:p>
+      <w:pPr>
+        <w:ind w:left="1080" w:hanging="360"/>
+      </w:pPr>
+      <w:r>
+        <w:t>i)</w:t>
+      </w:r>
+      <w:r>
+        <w:tab/>
+      </w:r>
+      <w:r>
+        <w:t>falls below a mandatory minimum under section 2;</w:t>
+      </w:r>
+    </w:p>
+    <w:p>
+      <w:pPr>
+        <w:ind w:left="1080" w:hanging="360"/>
+      </w:pPr>
+      <w:r>
+        <w:t>ii)</w:t>
+      </w:r>
+      <w:r>
+        <w:tab/>
+      </w:r>
+      <w:r>
+        <w:t>permits release before full term contrary to section 3;</w:t>
+      </w:r>
+    </w:p>
+    <w:p>
+      <w:pPr>
+        <w:ind w:left="1080" w:hanging="360"/>
+      </w:pPr>
+      <w:r>
+        <w:t>iii)</w:t>
+      </w:r>
+      <w:r>
+        <w:tab/>
+      </w:r>
+      <w:r>
+        <w:t>permits release while any reasonable doubt about public safety remains, contrary to section 8(d); or</w:t>
+      </w:r>
+    </w:p>
+    <w:p>
+      <w:pPr>
+        <w:ind w:left="1080" w:hanging="360"/>
+      </w:pPr>
+      <w:r>
+        <w:t>iv)</w:t>
+      </w:r>
+      <w:r>
+        <w:tab/>
+      </w:r>
+      <w:r>
+        <w:t>is so disproportionate to the gravity of a violent or Designated High-Harm Offence that no reasonable decision-maker acting in good faith under this Constitution could have imposed it.</w:t>
+      </w:r>
+    </w:p>
+    <w:p>
+      <w:pPr>
+        <w:ind w:left="720" w:hanging="360"/>
+      </w:pPr>
+      <w:r>
+        <w:t>e)</w:t>
+      </w:r>
+      <w:r>
+        <w:tab/>
+      </w:r>
+      <w:r>
+        <w:t>Predicate Subsequent Offence</w:t>
+      </w:r>
+    </w:p>
+    <w:p>
+      <w:pPr>
+        <w:pStyle w:val="ListParagraph"/>
+      </w:pPr>
+      <w:r>
+        <w:t>Liability under this section is triggered when a person who was the subject of a Covered Liberty Decision or manifestly inadequate sentence later commits, or is lawfully charged with and subsequently convicted of, a violent offence or a Designated High-Harm Offence committed after that decision (the “Subsequent Offence”). Where the principal dies or is otherwise unavailable for trial, the Subsequent Offence may be proved beyond reasonable doubt in the proceedings against the Covered Decision-Maker alone.</w:t>
+      </w:r>
+    </w:p>
+    <w:p>
+      <w:pPr>
+        <w:ind w:left="720" w:hanging="360"/>
+      </w:pPr>
+      <w:r>
+        <w:t>f)</w:t>
+      </w:r>
+      <w:r>
+        <w:tab/>
+      </w:r>
+      <w:r>
+        <w:t>Mens Rea</w:t>
+      </w:r>
+    </w:p>
+    <w:p>
+      <w:pPr>
+        <w:pStyle w:val="ListParagraph"/>
+      </w:pPr>
+      <w:r>
+        <w:t>Criminal liability under this section requires that the Covered Decision-Maker acted:</w:t>
+      </w:r>
+    </w:p>
+    <w:p>
+      <w:pPr>
+        <w:ind w:left="1080" w:hanging="360"/>
+      </w:pPr>
+      <w:r>
+        <w:t>i)</w:t>
+      </w:r>
+      <w:r>
+        <w:tab/>
+      </w:r>
+      <w:r>
+        <w:t>knowing that the decision violated this Article or a mandatory minimum;</w:t>
+      </w:r>
+    </w:p>
+    <w:p>
+      <w:pPr>
+        <w:ind w:left="1080" w:hanging="360"/>
+      </w:pPr>
+      <w:r>
+        <w:t>ii)</w:t>
+      </w:r>
+      <w:r>
+        <w:tab/>
+      </w:r>
+      <w:r>
+        <w:t>with wilful blindness to such violation; or</w:t>
+      </w:r>
+    </w:p>
+    <w:p>
+      <w:pPr>
+        <w:ind w:left="1080" w:hanging="360"/>
+      </w:pPr>
+      <w:r>
+        <w:lastRenderedPageBreak/>
+        <w:t>iii)</w:t>
+      </w:r>
+      <w:r>
+        <w:tab/>
+      </w:r>
+      <w:r>
+        <w:t>recklessly, in conscious disregard of a substantial and unjustifiable risk that the decision violated sections 2, 3, or 8(d), or that the person posed a continuing danger to the public.</w:t>
+      </w:r>
+    </w:p>
+    <w:p>
+      <w:pPr>
+        <w:pStyle w:val="ListParagraph"/>
+      </w:pPr>
+      <w:r>
+        <w:t>Honest error after documented full compliance with sections 2, 3, and 8(d) and with all mandatory findings required by law is not a criminal offence under this section, but remains subject to removal for misbehaviour or incapacity under section 4 and to civil liability where negligence is proven.</w:t>
+      </w:r>
+    </w:p>
+    <w:p>
+      <w:pPr>
+        <w:ind w:left="720" w:hanging="360"/>
+      </w:pPr>
+      <w:r>
+        <w:t>g)</w:t>
+      </w:r>
+      <w:r>
+        <w:tab/>
+      </w:r>
+      <w:r>
+        <w:t>Immediate Suspension upon Rearrest</w:t>
+      </w:r>
+    </w:p>
+    <w:p>
+      <w:pPr>
+        <w:pStyle w:val="ListParagraph"/>
+      </w:pPr>
+      <w:r>
+        <w:t>When a person who was the subject of a Covered Liberty Decision or manifestly inadequate sentence is arrested and charged with a Subsequent Offence that is violent or Designated High-Harm:</w:t>
+      </w:r>
+    </w:p>
+    <w:p>
+      <w:pPr>
+        <w:ind w:left="1080" w:hanging="360"/>
+      </w:pPr>
+      <w:r>
+        <w:t>i)</w:t>
+      </w:r>
+      <w:r>
+        <w:tab/>
+      </w:r>
+      <w:r>
+        <w:t>every Covered Decision-Maker who ordered, approved, or materially facilitated that prior decision shall be immediately suspended from all judicial, prosecutorial, parole, or related official duties, without pay beyond a subsistence stipend not exceeding the national median wage pro-rated, pending investigation under this section;</w:t>
+      </w:r>
+    </w:p>
+    <w:p>
+      <w:pPr>
+        <w:ind w:left="1080" w:hanging="360"/>
+      </w:pPr>
+      <w:r>
+        <w:t>ii)</w:t>
+      </w:r>
+      <w:r>
+        <w:tab/>
+      </w:r>
+      <w:r>
+        <w:t>suspension is automatic by operation of law upon certification by the prosecuting authority or by a single senior judge chosen by lot that the prior decision falls within subsection (c) or (d) on a prima facie basis;</w:t>
+      </w:r>
+    </w:p>
+    <w:p>
+      <w:pPr>
+        <w:ind w:left="1080" w:hanging="360"/>
+      </w:pPr>
+      <w:r>
+        <w:t>iii)</w:t>
+      </w:r>
+      <w:r>
+        <w:tab/>
+      </w:r>
+      <w:r>
+        <w:t>suspension does not determine guilt; the suspended person retains the presumption of innocence under section 1 for purposes of criminal trial under this section; and</w:t>
+      </w:r>
+    </w:p>
+    <w:p>
+      <w:pPr>
+        <w:ind w:left="1080" w:hanging="360"/>
+      </w:pPr>
+      <w:r>
+        <w:t>iv)</w:t>
+      </w:r>
+      <w:r>
+        <w:tab/>
+      </w:r>
+      <w:r>
+        <w:t>if the Subsequent Offence charge is dismissed on the merits, withdrawn for lack of evidence, or ends in acquittal, and no separate probable cause remains that the prior decision was criminal under subsection (f), suspension terminates and full back pay is restored.</w:t>
+      </w:r>
+    </w:p>
+    <w:p>
+      <w:pPr>
+        <w:ind w:left="720" w:hanging="360"/>
+      </w:pPr>
+      <w:r>
+        <w:t>h)</w:t>
+      </w:r>
+      <w:r>
+        <w:tab/>
+      </w:r>
+      <w:r>
+        <w:t>Criminal Offence and Penalty</w:t>
+      </w:r>
+    </w:p>
+    <w:p>
+      <w:pPr>
+        <w:pStyle w:val="ListParagraph"/>
+      </w:pPr>
+      <w:r>
+        <w:t xml:space="preserve">A Covered Decision-Maker who, with the mens rea required by subsection (f), made or facilitated a Covered Liberty Decision or imposed a manifestly inadequate sentence, after which a Subsequent Offence is committed, shall be prosecuted as an accessory before the </w:t>
+      </w:r>
+      <w:r>
+        <w:lastRenderedPageBreak/>
+        <w:t>fact to the Subsequent Offence (or under an equivalent statutory offence of reckless judicial endangerment of the public) and, upon conviction by jury beyond reasonable doubt:</w:t>
+      </w:r>
+    </w:p>
+    <w:p>
+      <w:pPr>
+        <w:ind w:left="1080" w:hanging="360"/>
+      </w:pPr>
+      <w:r>
+        <w:t>i)</w:t>
+      </w:r>
+      <w:r>
+        <w:tab/>
+      </w:r>
+      <w:r>
+        <w:t>shall be imprisoned for a term not less than the term imposed for the Subsequent Offence (or, where that offence carries death or life without parole, for life without parole, or death if accessory liability for that offence so provides under ordinary law consistent with this Article);</w:t>
+      </w:r>
+    </w:p>
+    <w:p>
+      <w:pPr>
+        <w:ind w:left="1080" w:hanging="360"/>
+      </w:pPr>
+      <w:r>
+        <w:t>ii)</w:t>
+      </w:r>
+      <w:r>
+        <w:tab/>
+      </w:r>
+      <w:r>
+        <w:t>shall serve that sentence in the same custody classification and the same class of secure facility as the principal offender for the Subsequent Offence, so far as security and the protection of life permit; nothing in this subsection requires or permits forced co-detention in the same cell or unit where that placement would create a substantial risk of murder, hostage-taking, or coercion;</w:t>
+      </w:r>
+    </w:p>
+    <w:p>
+      <w:pPr>
+        <w:ind w:left="1080" w:hanging="360"/>
+      </w:pPr>
+      <w:r>
+        <w:t>iii)</w:t>
+      </w:r>
+      <w:r>
+        <w:tab/>
+      </w:r>
+      <w:r>
+        <w:t xml:space="preserve">shall be permanently disqualified from every public office, judicial appointment, prosecutorial post, parole function, and the practice of law within the </w:t>
+      </w:r>
+      <w:r>
+        <w:t>Dominion</w:t>
+      </w:r>
+      <w:r>
+        <w:t>;</w:t>
+      </w:r>
+    </w:p>
+    <w:p>
+      <w:pPr>
+        <w:ind w:left="1080" w:hanging="360"/>
+      </w:pPr>
+      <w:r>
+        <w:t>iv)</w:t>
+      </w:r>
+      <w:r>
+        <w:tab/>
+      </w:r>
+      <w:r>
+        <w:t>shall be jointly and severally liable, personally, for treble the proven damages of every victim of the Subsequent Offence, including medical costs, lost earnings, property loss, and non-pecuniary harm as determined by a jury, which liability is not dischargeable and may be satisfied from personal assets, pensions, and future earnings; and</w:t>
+      </w:r>
+    </w:p>
+    <w:p>
+      <w:pPr>
+        <w:ind w:left="1080" w:hanging="360"/>
+      </w:pPr>
+      <w:r>
+        <w:t>v)</w:t>
+      </w:r>
+      <w:r>
+        <w:tab/>
+      </w:r>
+      <w:r>
+        <w:t>where the Subsequent Offence is one for which section 6 restores capital punishment and the Covered Decision-Maker acted knowingly or with wilful blindness, shall be eligible for the same maximum penalty as an accessory under the law applicable to that offence.</w:t>
+      </w:r>
+    </w:p>
+    <w:p>
+      <w:pPr>
+        <w:ind w:left="720" w:hanging="360"/>
+      </w:pPr>
+      <w:r>
+        <w:t>i)</w:t>
+      </w:r>
+      <w:r>
+        <w:tab/>
+      </w:r>
+      <w:r>
+        <w:t>Victim Standing and Compulsory Process</w:t>
+      </w:r>
+    </w:p>
+    <w:p>
+      <w:pPr>
+        <w:ind w:left="1080" w:hanging="360"/>
+      </w:pPr>
+      <w:r>
+        <w:t>i)</w:t>
+      </w:r>
+      <w:r>
+        <w:tab/>
+      </w:r>
+      <w:r>
+        <w:t>Any victim of the Subsequent Offence, or the next of kin of a deceased victim, may file a sworn complaint with the Supreme Court or a superior court demanding investigation and prosecution under this section.</w:t>
+      </w:r>
+    </w:p>
+    <w:p>
+      <w:pPr>
+        <w:ind w:left="1080" w:hanging="360"/>
+      </w:pPr>
+      <w:r>
+        <w:t>ii)</w:t>
+      </w:r>
+      <w:r>
+        <w:tab/>
+      </w:r>
+      <w:r>
+        <w:t xml:space="preserve">Upon a complaint supported by prima facie evidence of a Covered Liberty Decision or manifestly inadequate sentence and a </w:t>
+      </w:r>
+      <w:r>
+        <w:lastRenderedPageBreak/>
+        <w:t>Subsequent Offence, the court shall order an independent prosecutor (who shall not be the office that participated in the original liberty decision) to investigate and, if evidence warrants, to charge within sixty days, or to file public written reasons for declining, which reasons are themselves subject to review by a three-judge panel drawn by lot.</w:t>
+      </w:r>
+    </w:p>
+    <w:p>
+      <w:pPr>
+        <w:ind w:left="1080" w:hanging="360"/>
+      </w:pPr>
+      <w:r>
+        <w:t>iii)</w:t>
+      </w:r>
+      <w:r>
+        <w:tab/>
+      </w:r>
+      <w:r>
+        <w:t>No minister, attorney-general, or official may stay, suspend, or quietly terminate a prosecution under this section except by written public reasons reviewable under the same three-judge procedure.</w:t>
+      </w:r>
+    </w:p>
+    <w:p>
+      <w:pPr>
+        <w:ind w:left="1080" w:hanging="360"/>
+      </w:pPr>
+      <w:r>
+        <w:t>iv)</w:t>
+      </w:r>
+      <w:r>
+        <w:tab/>
+      </w:r>
+      <w:r>
+        <w:t>Malicious false complaints under this subsection are punished under the false-accusation rules of section 6 and Article 14, as applicable.</w:t>
+      </w:r>
+    </w:p>
+    <w:p>
+      <w:pPr>
+        <w:ind w:left="720" w:hanging="360"/>
+      </w:pPr>
+      <w:r>
+        <w:t>j)</w:t>
+      </w:r>
+      <w:r>
+        <w:tab/>
+      </w:r>
+      <w:r>
+        <w:t>Parole Boards and Collective Decisions. Where a Covered Liberty Decision was made by a multi-member board, every member who voted in favour is a Covered Decision-Maker. Members who voted against and recorded a dissent in writing are not liable under this section for that decision.</w:t>
+      </w:r>
+    </w:p>
+    <w:p>
+      <w:pPr>
+        <w:ind w:left="720" w:hanging="360"/>
+      </w:pPr>
+      <w:r>
+        <w:t>k)</w:t>
+      </w:r>
+      <w:r>
+        <w:tab/>
+      </w:r>
+      <w:r>
+        <w:t>Designated High-Harm Offences. For greater certainty, Designated High-Harm Offences shall include at least: trafficking in fentanyl or equivalent lethal substances; home invasion; sexual offences; robbery with a weapon; arson endangering life; and any offence involving intentional or reckless infliction of grievous bodily harm. The House may expand this list by ordinary law; it may not narrow the violent-offence core of this section.</w:t>
+      </w:r>
+    </w:p>
+    <w:p>
+      <w:pPr>
+        <w:ind w:left="714" w:hanging="357"/>
+      </w:pPr>
+      <w:r>
+        <w:t>l)</w:t>
+      </w:r>
+      <w:r>
+        <w:tab/>
+      </w:r>
+      <w:r>
+        <w:t xml:space="preserve">Non-Derogation. Nothing in this section diminishes mandatory minimums, full-term service, or the public-safety rule in sections 2, 3, and 8; authorises any emergency or administrative power to restore the liberty of a violent offender contrary to those sections; or limits civil actions by victims against the </w:t>
+      </w:r>
+      <w:r>
+        <w:t>Dominion</w:t>
+      </w:r>
+      <w:r>
+        <w:t xml:space="preserve"> for systemic failure, subject to ordinary law and the fiscal limits of Article 20.</w:t>
+      </w:r>
+    </w:p>
+    <w:p>
+      <w:pPr>
+        <w:ind w:left="360" w:hanging="357"/>
+      </w:pPr>
+      <w:r>
+        <w:t>6.</w:t>
+      </w:r>
+      <w:r>
+        <w:tab/>
+      </w:r>
+      <w:r>
+        <w:t>The death penalty is restored for premeditated murder, child rape, child trafficking, child sexual abuse, possession of child sexual abuse material,</w:t>
+      </w:r>
+      <w:r>
+        <w:t xml:space="preserve"> rape,</w:t>
+      </w:r>
+      <w:r>
+        <w:t xml:space="preserve"> high treason, and for extreme, provably intentional financial, medical, religious, scientific or any other fraud that directly causes widespread death </w:t>
+      </w:r>
+      <w:r>
+        <w:lastRenderedPageBreak/>
+        <w:t>or irreversible ruin,</w:t>
       </w:r>
       <w:r>
         <w:t xml:space="preserve"> </w:t>
       </w:r>
+      <w:r>
+        <w:t>and for intentional arson that causes death, endangers human life, or destroys or gravely damages dwellings, a community, critical infrastructure, or a substantial area of forest or wildland</w:t>
+      </w:r>
+      <w:r>
+        <w:t>,</w:t>
+      </w:r>
+      <w:r>
+        <w:t xml:space="preserve"> upon unanimous jury verdict beyond reasonable doubt. Any person who makes a false accusation of any of these offences with premeditated intent to deceive or to cause harm shall, upon unanimous jury verdict proving that intent beyond reasonable doubt, suffer the exact same penalty that would have applied to the accused.</w:t>
+      </w:r>
     </w:p>
     <w:p>
       <w:pPr>
         <w:ind w:left="360" w:hanging="357"/>
       </w:pPr>
       <w:r>
-        <w:t>5.</w:t>
-      </w:r>
-      <w:r>
-        <w:tab/>
-      </w:r>
-      <w:r>
-        <w:t>Judicial and Official Liability for Enabling Recidivism</w:t>
+        <w:t>7.</w:t>
+      </w:r>
+      <w:r>
+        <w:tab/>
+      </w:r>
+      <w:r>
+        <w:t>All executions shall be carried out solely by firing squad with hand-held lethal arms within seven days of final sentencing. For convictions of child trafficking, child sexual abuse, or possession of child sexual abuse materia</w:t>
+      </w:r>
+      <w:r>
+        <w:t>l,</w:t>
+      </w:r>
+      <w:r>
+        <w:t xml:space="preserve"> the timeline is mandatory and non-extendable.</w:t>
+      </w:r>
+    </w:p>
+    <w:p>
+      <w:pPr>
+        <w:ind w:left="360" w:hanging="360"/>
+      </w:pPr>
+      <w:r>
+        <w:t>8.</w:t>
+      </w:r>
+      <w:r>
+        <w:tab/>
+      </w:r>
+      <w:r>
+        <w:t xml:space="preserve">The criminal justice system of the </w:t>
+      </w:r>
+      <w:r>
+        <w:t>Dominion</w:t>
+      </w:r>
+      <w:r>
+        <w:t xml:space="preserve"> exists first to protect the innocent and second to restore the offender to lawful life wherever this is compatible with public safety. </w:t>
       </w:r>
     </w:p>
     <w:p>
@@ -13354,21 +14203,7 @@
         <w:tab/>
       </w:r>
       <w:r>
-        <w:t>Purpose</w:t>
-      </w:r>
-    </w:p>
-    <w:p>
-      <w:pPr>
-        <w:pStyle w:val="ListParagraph"/>
-      </w:pPr>
-      <w:r>
-        <w:t xml:space="preserve">The </w:t>
-      </w:r>
-      <w:r>
-        <w:t>Dominion</w:t>
-      </w:r>
-      <w:r>
-        <w:t xml:space="preserve"> recognises that the premature or inadequate restoration of liberty to a violent or designated high-harm offender is among the gravest betrayals of public trust. Officials who order, approve, or facilitate such liberty share criminal responsibility when predictable further harm follows.</w:t>
+        <w:t xml:space="preserve">Every person sentenced to imprisonment shall be offered intensive, evidence-based rehabilitation programmes (psychological, educational, vocational, moral, and, where appropriate, medical or pharmacological) chosen solely for proven efficacy in reducing recidivism. The state has a constitutional duty to research, develop, and implement the most effective methods available, without ideological preference or prohibition. </w:t>
       </w:r>
     </w:p>
     <w:p>
@@ -13382,15 +14217,7 @@
         <w:tab/>
       </w:r>
       <w:r>
-        <w:t xml:space="preserve">Covered Decision-Makers </w:t>
-      </w:r>
-    </w:p>
-    <w:p>
-      <w:pPr>
-        <w:pStyle w:val="ListParagraph"/>
-      </w:pPr>
-      <w:r>
-        <w:t>This section applies to every judge, justice of the peace, parole or release-board member, prosecutor, corrections official, or other person acting under colour of law who orders, recommends, approves, or materially facilitates any Covered Liberty Decision under subsection (c).</w:t>
+        <w:t xml:space="preserve">For offenders convicted of premeditated murder, child rape, or high treason, rehabilitation may be attempted only under the strictest conditions of permanent physical isolation from the general population and from any position of trust or authority. </w:t>
       </w:r>
     </w:p>
     <w:p>
@@ -13404,690 +14231,15 @@
         <w:tab/>
       </w:r>
       <w:r>
-        <w:t>Covered Liberty Decisions</w:t>
-      </w:r>
-    </w:p>
-    <w:p>
-      <w:pPr>
-        <w:pStyle w:val="ListParagraph"/>
+        <w:t xml:space="preserve">The death penalty or irrevocable life imprisonment without parole remains mandatory when a special Rehabilitation Review Board (composed of three senior judges, three forensic psychologists, and three citizen members chosen by lot) unanimously determines, after no fewer than seven years of observed behaviour and treatment, that the offender remains an incurable danger to human life. Such determination must be reviewed and reaffirmed every five years thereafter. </w:t>
+      </w:r>
+    </w:p>
+    <w:p>
+      <w:pPr>
+        <w:ind w:left="714" w:hanging="357"/>
       </w:pPr>
       <w:r>
         <w:lastRenderedPageBreak/>
-        <w:t>A Covered Liberty Decision is any of the following concerning a person charged with, or convicted of, a violent offence, or a Designated High-Harm Offence as defined in subsection (l):</w:t>
-      </w:r>
-    </w:p>
-    <w:p>
-      <w:pPr>
-        <w:ind w:left="1080" w:hanging="360"/>
-      </w:pPr>
-      <w:r>
-        <w:t>i)</w:t>
-      </w:r>
-      <w:r>
-        <w:tab/>
-      </w:r>
-      <w:r>
-        <w:t>early release, parole, temporary absence, day pass, or any form of release before the full term required by this Article or by mandatory minimum sentence;</w:t>
-      </w:r>
-    </w:p>
-    <w:p>
-      <w:pPr>
-        <w:ind w:left="1080" w:hanging="360"/>
-      </w:pPr>
-      <w:r>
-        <w:t>ii)</w:t>
-      </w:r>
-      <w:r>
-        <w:tab/>
-      </w:r>
-      <w:r>
-        <w:t>bail, judicial interim release, release pending appeal, or stay of proceedings that returns the person to the community when this Constitution or ordinary law required detention;</w:t>
-      </w:r>
-    </w:p>
-    <w:p>
-      <w:pPr>
-        <w:ind w:left="1080" w:hanging="360"/>
-      </w:pPr>
-      <w:r>
-        <w:t>iii)</w:t>
-      </w:r>
-      <w:r>
-        <w:tab/>
-      </w:r>
-      <w:r>
-        <w:t>house arrest, electronic monitoring, or any community-based substitute for custodial detention that functions as de facto release from secure custody;</w:t>
-      </w:r>
-    </w:p>
-    <w:p>
-      <w:pPr>
-        <w:ind w:left="1080" w:hanging="360"/>
-      </w:pPr>
-      <w:r>
-        <w:t>iv)</w:t>
-      </w:r>
-      <w:r>
-        <w:tab/>
-      </w:r>
-      <w:r>
-        <w:t>a sentence below the mandatory minimum applicable under section 2, or any sentence or disposition that violates section 3 or section 8(d); or</w:t>
-      </w:r>
-    </w:p>
-    <w:p>
-      <w:pPr>
-        <w:ind w:left="1080" w:hanging="360"/>
-      </w:pPr>
-      <w:r>
-        <w:t>v)</w:t>
-      </w:r>
-      <w:r>
-        <w:tab/>
-      </w:r>
-      <w:r>
-        <w:t>any order that knowingly or recklessly frustrates the full service of a lawful custodial sentence.</w:t>
-      </w:r>
-    </w:p>
-    <w:p>
-      <w:pPr>
-        <w:ind w:left="720" w:hanging="360"/>
-      </w:pPr>
-      <w:r>
-        <w:t>d)</w:t>
-      </w:r>
-      <w:r>
-        <w:tab/>
-      </w:r>
-      <w:r>
-        <w:t>Manifestly Inadequate Sentence</w:t>
-      </w:r>
-    </w:p>
-    <w:p>
-      <w:pPr>
-        <w:pStyle w:val="ListParagraph"/>
-      </w:pPr>
-      <w:r>
-        <w:t>A sentence or disposition is “manifestly inadequate” when it:</w:t>
-      </w:r>
-    </w:p>
-    <w:p>
-      <w:pPr>
-        <w:ind w:left="1080" w:hanging="360"/>
-      </w:pPr>
-      <w:r>
-        <w:t>i)</w:t>
-      </w:r>
-      <w:r>
-        <w:tab/>
-      </w:r>
-      <w:r>
-        <w:t>falls below a mandatory minimum under section 2;</w:t>
-      </w:r>
-    </w:p>
-    <w:p>
-      <w:pPr>
-        <w:ind w:left="1080" w:hanging="360"/>
-      </w:pPr>
-      <w:r>
-        <w:t>ii)</w:t>
-      </w:r>
-      <w:r>
-        <w:tab/>
-      </w:r>
-      <w:r>
-        <w:t>permits release before full term contrary to section 3;</w:t>
-      </w:r>
-    </w:p>
-    <w:p>
-      <w:pPr>
-        <w:ind w:left="1080" w:hanging="360"/>
-      </w:pPr>
-      <w:r>
-        <w:t>iii)</w:t>
-      </w:r>
-      <w:r>
-        <w:tab/>
-      </w:r>
-      <w:r>
-        <w:t>permits release while any reasonable doubt about public safety remains, contrary to section 8(d); or</w:t>
-      </w:r>
-    </w:p>
-    <w:p>
-      <w:pPr>
-        <w:ind w:left="1080" w:hanging="360"/>
-      </w:pPr>
-      <w:r>
-        <w:t>iv)</w:t>
-      </w:r>
-      <w:r>
-        <w:tab/>
-      </w:r>
-      <w:r>
-        <w:t>is so disproportionate to the gravity of a violent or Designated High-Harm Offence that no reasonable decision-maker acting in good faith under this Constitution could have imposed it.</w:t>
-      </w:r>
-    </w:p>
-    <w:p>
-      <w:pPr>
-        <w:ind w:left="720" w:hanging="360"/>
-      </w:pPr>
-      <w:r>
-        <w:t>e)</w:t>
-      </w:r>
-      <w:r>
-        <w:tab/>
-      </w:r>
-      <w:r>
-        <w:t>Predicate Subsequent Offence</w:t>
-      </w:r>
-    </w:p>
-    <w:p>
-      <w:pPr>
-        <w:pStyle w:val="ListParagraph"/>
-      </w:pPr>
-      <w:r>
-        <w:lastRenderedPageBreak/>
-        <w:t>Liability under this section is triggered when a person who was the subject of a Covered Liberty Decision or manifestly inadequate sentence later commits, or is lawfully charged with and subsequently convicted of, a violent offence or a Designated High-Harm Offence committed after that decision (the “Subsequent Offence”). Where the principal dies or is otherwise unavailable for trial, the Subsequent Offence may be proved beyond reasonable doubt in the proceedings against the Covered Decision-Maker alone.</w:t>
-      </w:r>
-    </w:p>
-    <w:p>
-      <w:pPr>
-        <w:ind w:left="720" w:hanging="360"/>
-      </w:pPr>
-      <w:r>
-        <w:t>f)</w:t>
-      </w:r>
-      <w:r>
-        <w:tab/>
-      </w:r>
-      <w:r>
-        <w:t>Mens Rea</w:t>
-      </w:r>
-    </w:p>
-    <w:p>
-      <w:pPr>
-        <w:pStyle w:val="ListParagraph"/>
-      </w:pPr>
-      <w:r>
-        <w:t>Criminal liability under this section requires that the Covered Decision-Maker acted:</w:t>
-      </w:r>
-    </w:p>
-    <w:p>
-      <w:pPr>
-        <w:ind w:left="1080" w:hanging="360"/>
-      </w:pPr>
-      <w:r>
-        <w:t>i)</w:t>
-      </w:r>
-      <w:r>
-        <w:tab/>
-      </w:r>
-      <w:r>
-        <w:t>knowing that the decision violated this Article or a mandatory minimum;</w:t>
-      </w:r>
-    </w:p>
-    <w:p>
-      <w:pPr>
-        <w:ind w:left="1080" w:hanging="360"/>
-      </w:pPr>
-      <w:r>
-        <w:t>ii)</w:t>
-      </w:r>
-      <w:r>
-        <w:tab/>
-      </w:r>
-      <w:r>
-        <w:t>with wilful blindness to such violation; or</w:t>
-      </w:r>
-    </w:p>
-    <w:p>
-      <w:pPr>
-        <w:ind w:left="1080" w:hanging="360"/>
-      </w:pPr>
-      <w:r>
-        <w:t>iii)</w:t>
-      </w:r>
-      <w:r>
-        <w:tab/>
-      </w:r>
-      <w:r>
-        <w:t>recklessly, in conscious disregard of a substantial and unjustifiable risk that the decision violated sections 2, 3, or 8(d), or that the person posed a continuing danger to the public.</w:t>
-      </w:r>
-    </w:p>
-    <w:p>
-      <w:pPr>
-        <w:pStyle w:val="ListParagraph"/>
-      </w:pPr>
-      <w:r>
-        <w:t>Honest error after documented full compliance with sections 2, 3, and 8(d) and with all mandatory findings required by law is not a criminal offence under this section, but remains subject to removal for misbehaviour or incapacity under section 4 and to civil liability where negligence is proven.</w:t>
-      </w:r>
-    </w:p>
-    <w:p>
-      <w:pPr>
-        <w:ind w:left="720" w:hanging="360"/>
-      </w:pPr>
-      <w:r>
-        <w:t>g)</w:t>
-      </w:r>
-      <w:r>
-        <w:tab/>
-      </w:r>
-      <w:r>
-        <w:t>Immediate Suspension upon Rearrest</w:t>
-      </w:r>
-    </w:p>
-    <w:p>
-      <w:pPr>
-        <w:pStyle w:val="ListParagraph"/>
-      </w:pPr>
-      <w:r>
-        <w:t>When a person who was the subject of a Covered Liberty Decision or manifestly inadequate sentence is arrested and charged with a Subsequent Offence that is violent or Designated High-Harm:</w:t>
-      </w:r>
-    </w:p>
-    <w:p>
-      <w:pPr>
-        <w:ind w:left="1080" w:hanging="360"/>
-      </w:pPr>
-      <w:r>
-        <w:t>i)</w:t>
-      </w:r>
-      <w:r>
-        <w:tab/>
-      </w:r>
-      <w:r>
-        <w:t xml:space="preserve">every Covered Decision-Maker who ordered, approved, or materially facilitated that prior decision shall be immediately suspended from all judicial, prosecutorial, parole, or related official duties, without pay beyond a subsistence stipend not exceeding </w:t>
-      </w:r>
-      <w:r>
-        <w:lastRenderedPageBreak/>
-        <w:t>the national median wage pro-rated, pending investigation under this section;</w:t>
-      </w:r>
-    </w:p>
-    <w:p>
-      <w:pPr>
-        <w:ind w:left="1080" w:hanging="360"/>
-      </w:pPr>
-      <w:r>
-        <w:t>ii)</w:t>
-      </w:r>
-      <w:r>
-        <w:tab/>
-      </w:r>
-      <w:r>
-        <w:t>suspension is automatic by operation of law upon certification by the prosecuting authority or by a single senior judge chosen by lot that the prior decision falls within subsection (c) or (d) on a prima facie basis;</w:t>
-      </w:r>
-    </w:p>
-    <w:p>
-      <w:pPr>
-        <w:ind w:left="1080" w:hanging="360"/>
-      </w:pPr>
-      <w:r>
-        <w:t>iii)</w:t>
-      </w:r>
-      <w:r>
-        <w:tab/>
-      </w:r>
-      <w:r>
-        <w:t>suspension does not determine guilt; the suspended person retains the presumption of innocence under section 1 for purposes of criminal trial under this section; and</w:t>
-      </w:r>
-    </w:p>
-    <w:p>
-      <w:pPr>
-        <w:ind w:left="1080" w:hanging="360"/>
-      </w:pPr>
-      <w:r>
-        <w:t>iv)</w:t>
-      </w:r>
-      <w:r>
-        <w:tab/>
-      </w:r>
-      <w:r>
-        <w:t>if the Subsequent Offence charge is dismissed on the merits, withdrawn for lack of evidence, or ends in acquittal, and no separate probable cause remains that the prior decision was criminal under subsection (f), suspension terminates and full back pay is restored.</w:t>
-      </w:r>
-    </w:p>
-    <w:p>
-      <w:pPr>
-        <w:ind w:left="720" w:hanging="360"/>
-      </w:pPr>
-      <w:r>
-        <w:t>h)</w:t>
-      </w:r>
-      <w:r>
-        <w:tab/>
-      </w:r>
-      <w:r>
-        <w:t>Criminal Offence and Penalty</w:t>
-      </w:r>
-    </w:p>
-    <w:p>
-      <w:pPr>
-        <w:pStyle w:val="ListParagraph"/>
-      </w:pPr>
-      <w:r>
-        <w:t>A Covered Decision-Maker who, with the mens rea required by subsection (f), made or facilitated a Covered Liberty Decision or imposed a manifestly inadequate sentence, after which a Subsequent Offence is committed, shall be prosecuted as an accessory before the fact to the Subsequent Offence (or under an equivalent statutory offence of reckless judicial endangerment of the public) and, upon conviction by jury beyond reasonable doubt:</w:t>
-      </w:r>
-    </w:p>
-    <w:p>
-      <w:pPr>
-        <w:ind w:left="1080" w:hanging="360"/>
-      </w:pPr>
-      <w:r>
-        <w:t>i)</w:t>
-      </w:r>
-      <w:r>
-        <w:tab/>
-      </w:r>
-      <w:r>
-        <w:t>shall be imprisoned for a term not less than the term imposed for the Subsequent Offence (or, where that offence carries death or life without parole, for life without parole, or death if accessory liability for that offence so provides under ordinary law consistent with this Article);</w:t>
-      </w:r>
-    </w:p>
-    <w:p>
-      <w:pPr>
-        <w:ind w:left="1080" w:hanging="360"/>
-      </w:pPr>
-      <w:r>
-        <w:t>ii)</w:t>
-      </w:r>
-      <w:r>
-        <w:tab/>
-      </w:r>
-      <w:r>
-        <w:t>shall serve that sentence in the same custody classification and the same class of secure facility as the principal offender for the Subsequent Offence, so far as security and the protection of life permit; nothing in this subsection requires or permits forced co-</w:t>
-      </w:r>
-      <w:r>
-        <w:lastRenderedPageBreak/>
-        <w:t>detention in the same cell or unit where that placement would create a substantial risk of murder, hostage-taking, or coercion;</w:t>
-      </w:r>
-    </w:p>
-    <w:p>
-      <w:pPr>
-        <w:ind w:left="1080" w:hanging="360"/>
-      </w:pPr>
-      <w:r>
-        <w:t>iii)</w:t>
-      </w:r>
-      <w:r>
-        <w:tab/>
-      </w:r>
-      <w:r>
-        <w:t xml:space="preserve">shall be permanently disqualified from every public office, judicial appointment, prosecutorial post, parole function, and the practice of law within the </w:t>
-      </w:r>
-      <w:r>
-        <w:t>Dominion</w:t>
-      </w:r>
-      <w:r>
-        <w:t>;</w:t>
-      </w:r>
-    </w:p>
-    <w:p>
-      <w:pPr>
-        <w:ind w:left="1080" w:hanging="360"/>
-      </w:pPr>
-      <w:r>
-        <w:t>iv)</w:t>
-      </w:r>
-      <w:r>
-        <w:tab/>
-      </w:r>
-      <w:r>
-        <w:t>shall be jointly and severally liable, personally, for treble the proven damages of every victim of the Subsequent Offence, including medical costs, lost earnings, property loss, and non-pecuniary harm as determined by a jury, which liability is not dischargeable and may be satisfied from personal assets, pensions, and future earnings; and</w:t>
-      </w:r>
-    </w:p>
-    <w:p>
-      <w:pPr>
-        <w:ind w:left="1080" w:hanging="360"/>
-      </w:pPr>
-      <w:r>
-        <w:t>v)</w:t>
-      </w:r>
-      <w:r>
-        <w:tab/>
-      </w:r>
-      <w:r>
-        <w:t>where the Subsequent Offence is one for which section 6 restores capital punishment and the Covered Decision-Maker acted knowingly or with wilful blindness, shall be eligible for the same maximum penalty as an accessory under the law applicable to that offence.</w:t>
-      </w:r>
-    </w:p>
-    <w:p>
-      <w:pPr>
-        <w:ind w:left="720" w:hanging="360"/>
-      </w:pPr>
-      <w:r>
-        <w:t>i)</w:t>
-      </w:r>
-      <w:r>
-        <w:tab/>
-      </w:r>
-      <w:r>
-        <w:t>Victim Standing and Compulsory Process</w:t>
-      </w:r>
-    </w:p>
-    <w:p>
-      <w:pPr>
-        <w:ind w:left="1080" w:hanging="360"/>
-      </w:pPr>
-      <w:r>
-        <w:t>i)</w:t>
-      </w:r>
-      <w:r>
-        <w:tab/>
-      </w:r>
-      <w:r>
-        <w:t>Any victim of the Subsequent Offence, or the next of kin of a deceased victim, may file a sworn complaint with the Supreme Court or a superior court demanding investigation and prosecution under this section.</w:t>
-      </w:r>
-    </w:p>
-    <w:p>
-      <w:pPr>
-        <w:ind w:left="1080" w:hanging="360"/>
-      </w:pPr>
-      <w:r>
-        <w:t>ii)</w:t>
-      </w:r>
-      <w:r>
-        <w:tab/>
-      </w:r>
-      <w:r>
-        <w:t>Upon a complaint supported by prima facie evidence of a Covered Liberty Decision or manifestly inadequate sentence and a Subsequent Offence, the court shall order an independent prosecutor (who shall not be the office that participated in the original liberty decision) to investigate and, if evidence warrants, to charge within sixty days, or to file public written reasons for declining, which reasons are themselves subject to review by a three-judge panel drawn by lot.</w:t>
-      </w:r>
-    </w:p>
-    <w:p>
-      <w:pPr>
-        <w:ind w:left="1080" w:hanging="360"/>
-      </w:pPr>
-      <w:r>
-        <w:t>iii)</w:t>
-      </w:r>
-      <w:r>
-        <w:tab/>
-      </w:r>
-      <w:r>
-        <w:t xml:space="preserve">No minister, attorney-general, or official may stay, suspend, or quietly terminate a prosecution under this section except by </w:t>
-      </w:r>
-      <w:r>
-        <w:lastRenderedPageBreak/>
-        <w:t>written public reasons reviewable under the same three-judge procedure.</w:t>
-      </w:r>
-    </w:p>
-    <w:p>
-      <w:pPr>
-        <w:ind w:left="1080" w:hanging="360"/>
-      </w:pPr>
-      <w:r>
-        <w:t>iv)</w:t>
-      </w:r>
-      <w:r>
-        <w:tab/>
-      </w:r>
-      <w:r>
-        <w:t>Malicious false complaints under this subsection are punished under the false-accusation rules of section 6 and Article 14, as applicable.</w:t>
-      </w:r>
-    </w:p>
-    <w:p>
-      <w:pPr>
-        <w:ind w:left="720" w:hanging="360"/>
-      </w:pPr>
-      <w:r>
-        <w:t>j)</w:t>
-      </w:r>
-      <w:r>
-        <w:tab/>
-      </w:r>
-      <w:r>
-        <w:t>Parole Boards and Collective Decisions. Where a Covered Liberty Decision was made by a multi-member board, every member who voted in favour is a Covered Decision-Maker. Members who voted against and recorded a dissent in writing are not liable under this section for that decision.</w:t>
-      </w:r>
-    </w:p>
-    <w:p>
-      <w:pPr>
-        <w:ind w:left="720" w:hanging="360"/>
-      </w:pPr>
-      <w:r>
-        <w:t>k)</w:t>
-      </w:r>
-      <w:r>
-        <w:tab/>
-      </w:r>
-      <w:r>
-        <w:t>Designated High-Harm Offences. For greater certainty, Designated High-Harm Offences shall include at least: trafficking in fentanyl or equivalent lethal substances; home invasion; sexual offences; robbery with a weapon; arson endangering life; and any offence involving intentional or reckless infliction of grievous bodily harm. The House may expand this list by ordinary law; it may not narrow the violent-offence core of this section.</w:t>
-      </w:r>
-    </w:p>
-    <w:p>
-      <w:pPr>
-        <w:ind w:left="714" w:hanging="357"/>
-      </w:pPr>
-      <w:r>
-        <w:t>l)</w:t>
-      </w:r>
-      <w:r>
-        <w:tab/>
-      </w:r>
-      <w:r>
-        <w:t xml:space="preserve">Non-Derogation. Nothing in this section diminishes mandatory minimums, full-term service, or the public-safety rule in sections 2, 3, and 8; authorises any emergency or administrative power to restore the liberty of a violent offender contrary to those sections; or limits civil actions by victims against the </w:t>
-      </w:r>
-      <w:r>
-        <w:t>Dominion</w:t>
-      </w:r>
-      <w:r>
-        <w:t xml:space="preserve"> for systemic failure, subject to ordinary law and the fiscal limits of Article 20.</w:t>
-      </w:r>
-    </w:p>
-    <w:p>
-      <w:pPr>
-        <w:ind w:left="360" w:hanging="357"/>
-      </w:pPr>
-      <w:r>
-        <w:t>6.</w:t>
-      </w:r>
-      <w:r>
-        <w:tab/>
-      </w:r>
-      <w:r>
-        <w:t>The death penalty is restored for premeditated murder, child rape, child trafficking, child sexual abuse, possession of child sexual abuse material,</w:t>
-      </w:r>
-      <w:r>
-        <w:t xml:space="preserve"> rape,</w:t>
-      </w:r>
-      <w:r>
-        <w:t xml:space="preserve"> high treason, and for extreme, provably intentional financial, medical, religious, scientific or any other fraud that directly causes widespread death or irreversible ruin,</w:t>
-      </w:r>
-      <w:r>
-        <w:t xml:space="preserve"> </w:t>
-      </w:r>
-      <w:r>
-        <w:t>and for intentional arson that causes death, endangers human life, or destroys or gravely damages dwellings, a community, critical infrastructure, or a substantial area of forest or wildland</w:t>
-      </w:r>
-      <w:r>
-        <w:t>,</w:t>
-      </w:r>
-      <w:r>
-        <w:t xml:space="preserve"> upon unanimous jury verdict beyond reasonable doubt. Any person who makes a false accusation of any of these offences with premeditated intent to deceive or to cause harm shall, upon unanimous jury verdict proving that intent </w:t>
-      </w:r>
-      <w:r>
-        <w:lastRenderedPageBreak/>
-        <w:t>beyond reasonable doubt, suffer the exact same penalty that would have applied to the accused.</w:t>
-      </w:r>
-    </w:p>
-    <w:p>
-      <w:pPr>
-        <w:ind w:left="360" w:hanging="357"/>
-      </w:pPr>
-      <w:r>
-        <w:t>7.</w:t>
-      </w:r>
-      <w:r>
-        <w:tab/>
-      </w:r>
-      <w:r>
-        <w:t>All executions shall be carried out solely by firing squad with hand-held lethal arms within seven days of final sentencing. For convictions of child trafficking, child sexual abuse, or possession of child sexual abuse materia</w:t>
-      </w:r>
-      <w:r>
-        <w:t>l,</w:t>
-      </w:r>
-      <w:r>
-        <w:t xml:space="preserve"> the timeline is mandatory and non-extendable.</w:t>
-      </w:r>
-    </w:p>
-    <w:p>
-      <w:pPr>
-        <w:ind w:left="360" w:hanging="360"/>
-      </w:pPr>
-      <w:r>
-        <w:t>8.</w:t>
-      </w:r>
-      <w:r>
-        <w:tab/>
-      </w:r>
-      <w:r>
-        <w:t xml:space="preserve">The criminal justice system of the </w:t>
-      </w:r>
-      <w:r>
-        <w:t>Dominion</w:t>
-      </w:r>
-      <w:r>
-        <w:t xml:space="preserve"> exists first to protect the innocent and second to restore the offender to lawful life wherever this is compatible with public safety. </w:t>
-      </w:r>
-    </w:p>
-    <w:p>
-      <w:pPr>
-        <w:ind w:left="720" w:hanging="360"/>
-      </w:pPr>
-      <w:r>
-        <w:t>a)</w:t>
-      </w:r>
-      <w:r>
-        <w:tab/>
-      </w:r>
-      <w:r>
-        <w:t xml:space="preserve">Every person sentenced to imprisonment shall be offered intensive, evidence-based rehabilitation programmes (psychological, educational, vocational, moral, and, where appropriate, medical or pharmacological) chosen solely for proven efficacy in reducing recidivism. The state has a constitutional duty to research, develop, and implement the most effective methods available, without ideological preference or prohibition. </w:t>
-      </w:r>
-    </w:p>
-    <w:p>
-      <w:pPr>
-        <w:ind w:left="720" w:hanging="360"/>
-      </w:pPr>
-      <w:r>
-        <w:t>b)</w:t>
-      </w:r>
-      <w:r>
-        <w:tab/>
-      </w:r>
-      <w:r>
-        <w:t xml:space="preserve">For offenders convicted of premeditated murder, child rape, or high treason, rehabilitation may be attempted only under the strictest conditions of permanent physical isolation from the general population and from any position of trust or authority. </w:t>
-      </w:r>
-    </w:p>
-    <w:p>
-      <w:pPr>
-        <w:ind w:left="720" w:hanging="360"/>
-      </w:pPr>
-      <w:r>
-        <w:t>c)</w:t>
-      </w:r>
-      <w:r>
-        <w:tab/>
-      </w:r>
-      <w:r>
-        <w:t xml:space="preserve">The death penalty or irrevocable life imprisonment without parole remains mandatory when a special Rehabilitation Review Board (composed of three senior judges, three forensic psychologists, and three citizen members chosen by lot) unanimously determines, after no fewer than seven years of observed behaviour and treatment, that the offender remains an incurable danger to human life. Such determination must be reviewed and reaffirmed every five years thereafter. </w:t>
-      </w:r>
-    </w:p>
-    <w:p>
-      <w:pPr>
-        <w:ind w:left="714" w:hanging="357"/>
-      </w:pPr>
-      <w:r>
         <w:t>d)</w:t>
       </w:r>
       <w:r>
@@ -14210,6 +14362,7 @@
     </w:p>
     <w:p>
       <w:r>
+        <w:lastRenderedPageBreak/>
         <w:t>Prec</w:t>
       </w:r>
       <w:r>
@@ -14251,6 +14404,7 @@
     </w:p>
     <w:p>
       <w:r>
+        <w:lastRenderedPageBreak/>
         <w:t xml:space="preserve">By mandating presumption of innocence, jury trials beyond reasonable doubt, and prohibitions against self-incrimination, Article 15 fortifies the </w:t>
       </w:r>
       <w:r>
@@ -14273,6 +14427,7 @@
       <w:bookmarkStart w:id="116" w:name="_Toc215665047"/>
       <w:bookmarkStart w:id="117" w:name="_Toc229835220"/>
       <w:r>
+        <w:lastRenderedPageBreak/>
         <w:t xml:space="preserve">Article </w:t>
       </w:r>
       <w:r>
@@ -14406,6 +14561,7 @@
         <w:ind w:left="720" w:hanging="360"/>
       </w:pPr>
       <w:r>
+        <w:lastRenderedPageBreak/>
         <w:t>a)</w:t>
       </w:r>
       <w:r>
@@ -14462,6 +14618,7 @@
     </w:p>
     <w:p>
       <w:r>
+        <w:lastRenderedPageBreak/>
         <w:t>Precis:</w:t>
       </w:r>
     </w:p>
@@ -14590,6 +14747,7 @@
       <w:bookmarkStart w:id="119" w:name="_Toc215665048"/>
       <w:bookmarkStart w:id="120" w:name="_Toc229835221"/>
       <w:r>
+        <w:lastRenderedPageBreak/>
         <w:t xml:space="preserve">Article </w:t>
       </w:r>
       <w:r>

</xml_diff>

<commit_message>
Fix Article 1 section numbering after doxxing insert.
Regenerate article-01 and refresh completePDF DOCX/PDF so Digital Platforms and Institutional Accountability are correctly numbered.
</commit_message>
<xml_diff>
--- a/completePDF/Meritocratic Dominion of Canada.docx
+++ b/completePDF/Meritocratic Dominion of Canada.docx
@@ -569,8 +569,8 @@
       <w:bookmarkEnd w:id="55"/>
     </w:p>
     <w:p/>
-    <w:bookmarkStart w:id="56" w:name="_Toc215664772" w:displacedByCustomXml="next"/>
-    <w:bookmarkStart w:id="57" w:name="_Toc215665027" w:displacedByCustomXml="next"/>
+    <w:bookmarkStart w:id="56" w:name="_Toc215665027" w:displacedByCustomXml="next"/>
+    <w:bookmarkStart w:id="57" w:name="_Toc215664772" w:displacedByCustomXml="next"/>
     <w:sdt>
       <w:sdtPr>
         <w:rPr>
@@ -4468,14 +4468,28 @@
         <w:ind w:left="360" w:hanging="360"/>
       </w:pPr>
       <w:r>
+        <w:t>4.</w:t>
+      </w:r>
+      <w:r>
+        <w:tab/>
+      </w:r>
+      <w:r>
+        <w:t xml:space="preserve">They have shielded violent offenders with leniency and early release while threatening citizens with imprisonment for words spoken or written.  </w:t>
+      </w:r>
+    </w:p>
+    <w:p>
+      <w:pPr>
+        <w:ind w:left="360" w:hanging="360"/>
+      </w:pPr>
+      <w:r>
         <w:lastRenderedPageBreak/>
-        <w:t>4.</w:t>
-      </w:r>
-      <w:r>
-        <w:tab/>
-      </w:r>
-      <w:r>
-        <w:t xml:space="preserve">They have shielded violent offenders with leniency and early release while threatening citizens with imprisonment for words spoken or written.  </w:t>
+        <w:t>5.</w:t>
+      </w:r>
+      <w:r>
+        <w:tab/>
+      </w:r>
+      <w:r>
+        <w:t xml:space="preserve">They have subjected the people to speech codes, digital censorship, frozen bank accounts, and algorithmic suppression for political dissent.  </w:t>
       </w:r>
     </w:p>
     <w:p>
@@ -4483,13 +4497,13 @@
         <w:ind w:left="360" w:hanging="360"/>
       </w:pPr>
       <w:r>
-        <w:t>5.</w:t>
-      </w:r>
-      <w:r>
-        <w:tab/>
-      </w:r>
-      <w:r>
-        <w:t xml:space="preserve">They have subjected the people to speech codes, digital censorship, frozen bank accounts, and algorithmic suppression for political dissent.  </w:t>
+        <w:t>6.</w:t>
+      </w:r>
+      <w:r>
+        <w:tab/>
+      </w:r>
+      <w:r>
+        <w:t>They have invoked so-called “emergency powers” without lawful justification, freezing the bank accounts of peaceful citizens, trampling ancient rights of assembly and expression, and threatening the use of lethal force against lawful protest, abuses later judicially determined to be illegal, yet for which no official has ever been punished, revealing the power to declare “emergency” as the master-key to tyranny.</w:t>
       </w:r>
     </w:p>
     <w:p>
@@ -4497,13 +4511,13 @@
         <w:ind w:left="360" w:hanging="360"/>
       </w:pPr>
       <w:r>
-        <w:t>6.</w:t>
-      </w:r>
-      <w:r>
-        <w:tab/>
-      </w:r>
-      <w:r>
-        <w:t>They have invoked so-called “emergency powers” without lawful justification, freezing the bank accounts of peaceful citizens, trampling ancient rights of assembly and expression, and threatening the use of lethal force against lawful protest, abuses later judicially determined to be illegal, yet for which no official has ever been punished, revealing the power to declare “emergency” as the master-key to tyranny.</w:t>
+        <w:t>7.</w:t>
+      </w:r>
+      <w:r>
+        <w:tab/>
+      </w:r>
+      <w:r>
+        <w:t xml:space="preserve">They have permitted and, in many cases, encouraged the organized sexual corruption and medical mutilation of children in taxpayer-funded schools under the guise of “inclusion” and “gender ideology.”  </w:t>
       </w:r>
     </w:p>
     <w:p>
@@ -4511,13 +4525,13 @@
         <w:ind w:left="360" w:hanging="360"/>
       </w:pPr>
       <w:r>
-        <w:t>7.</w:t>
-      </w:r>
-      <w:r>
-        <w:tab/>
-      </w:r>
-      <w:r>
-        <w:t xml:space="preserve">They have permitted and, in many cases, encouraged the organized sexual corruption and medical mutilation of children in taxpayer-funded schools under the guise of “inclusion” and “gender ideology.”  </w:t>
+        <w:t>8.</w:t>
+      </w:r>
+      <w:r>
+        <w:tab/>
+      </w:r>
+      <w:r>
+        <w:t xml:space="preserve">They have opened the borders to mass migration without the consent of the people, eroding wages, straining housing, shattering cultural cohesion and destroying historic continuity, and endangering public safety.  </w:t>
       </w:r>
     </w:p>
     <w:p>
@@ -4525,13 +4539,13 @@
         <w:ind w:left="360" w:hanging="360"/>
       </w:pPr>
       <w:r>
-        <w:t>8.</w:t>
-      </w:r>
-      <w:r>
-        <w:tab/>
-      </w:r>
-      <w:r>
-        <w:t xml:space="preserve">They have opened the borders to mass migration without the consent of the people, eroding wages, straining housing, shattering cultural cohesion and destroying historic continuity, and endangering public safety.  </w:t>
+        <w:t>9.</w:t>
+      </w:r>
+      <w:r>
+        <w:tab/>
+      </w:r>
+      <w:r>
+        <w:t xml:space="preserve">They have surrendered national sovereignty to foreign and supranational bodies under pretexts of politically manufactured pseudosciences while rendering the historic Crown powerless to protect even its own subjects, as the daughters of England are assaulted in their own streets with impunity.  </w:t>
       </w:r>
     </w:p>
     <w:p>
@@ -4539,13 +4553,13 @@
         <w:ind w:left="360" w:hanging="360"/>
       </w:pPr>
       <w:r>
-        <w:t>9.</w:t>
-      </w:r>
-      <w:r>
-        <w:tab/>
-      </w:r>
-      <w:r>
-        <w:t xml:space="preserve">They have surrendered national sovereignty to foreign and supranational bodies under pretexts of politically manufactured pseudosciences while rendering the historic Crown powerless to protect even its own subjects, as the daughters of England are assaulted in their own streets with impunity.  </w:t>
+        <w:t>10.</w:t>
+      </w:r>
+      <w:r>
+        <w:tab/>
+      </w:r>
+      <w:r>
+        <w:t xml:space="preserve">They have debased the currency, exploded unrepayable public debt, and laid the groundwork or openly threatened the imposition of central-bank digital currencies to enslave future generations under programmable money.  </w:t>
       </w:r>
     </w:p>
     <w:p>
@@ -4553,13 +4567,13 @@
         <w:ind w:left="360" w:hanging="360"/>
       </w:pPr>
       <w:r>
-        <w:t>10.</w:t>
-      </w:r>
-      <w:r>
-        <w:tab/>
-      </w:r>
-      <w:r>
-        <w:t xml:space="preserve">They have debased the currency, exploded unrepayable public debt, and laid the groundwork or openly threatened the imposition of central-bank digital currencies to enslave future generations under programmable money.  </w:t>
+        <w:t>11.</w:t>
+      </w:r>
+      <w:r>
+        <w:tab/>
+      </w:r>
+      <w:r>
+        <w:t xml:space="preserve">They have forfeited every vestige of legitimacy by scorning the immemorial rights of the European peoples who conquered and settled this land with their blood, while working tirelessly to effect the demographic replacement of their descendants.  </w:t>
       </w:r>
     </w:p>
     <w:p>
@@ -4567,13 +4581,13 @@
         <w:ind w:left="360" w:hanging="360"/>
       </w:pPr>
       <w:r>
-        <w:t>11.</w:t>
-      </w:r>
-      <w:r>
-        <w:tab/>
-      </w:r>
-      <w:r>
-        <w:t xml:space="preserve">They have forfeited every vestige of legitimacy by scorning the immemorial rights of the European peoples who conquered and settled this land with their blood, while working tirelessly to effect the demographic replacement of their descendants.  </w:t>
+        <w:t>12.</w:t>
+      </w:r>
+      <w:r>
+        <w:tab/>
+      </w:r>
+      <w:r>
+        <w:t>They have imposed racial and ideological preferences in every institution under the false banners of “diversity, equity, and inclusion,” punishing merit and competence while rewarding failure and foreign allegiance.</w:t>
       </w:r>
     </w:p>
     <w:p>
@@ -4581,39 +4595,25 @@
         <w:ind w:left="360" w:hanging="360"/>
       </w:pPr>
       <w:r>
-        <w:t>12.</w:t>
-      </w:r>
-      <w:r>
-        <w:tab/>
-      </w:r>
-      <w:r>
-        <w:t>They have imposed racial and ideological preferences in every institution under the false banners of “diversity, equity, and inclusion,” punishing merit and competence while rewarding failure and foreign allegiance.</w:t>
-      </w:r>
-    </w:p>
-    <w:p>
-      <w:pPr>
-        <w:ind w:left="360" w:hanging="360"/>
-      </w:pPr>
+        <w:t>13.</w:t>
+      </w:r>
+      <w:r>
+        <w:tab/>
+      </w:r>
+      <w:r>
+        <w:t>They have surrendered the ancient birthright of the European found</w:t>
+      </w:r>
+      <w:r>
+        <w:t>ers and settlers</w:t>
+      </w:r>
+      <w:r>
+        <w:t xml:space="preserve"> of this nation to demographic replacement and cultural erasure, an act that meets every legal and moral definition of genocide.</w:t>
+      </w:r>
+    </w:p>
+    <w:p/>
+    <w:p>
       <w:r>
         <w:lastRenderedPageBreak/>
-        <w:t>13.</w:t>
-      </w:r>
-      <w:r>
-        <w:tab/>
-      </w:r>
-      <w:r>
-        <w:t>They have surrendered the ancient birthright of the European found</w:t>
-      </w:r>
-      <w:r>
-        <w:t>ers and settlers</w:t>
-      </w:r>
-      <w:r>
-        <w:t xml:space="preserve"> of this nation to demographic replacement and cultural erasure, an act that meets every legal and moral definition of genocide.</w:t>
-      </w:r>
-    </w:p>
-    <w:p/>
-    <w:p>
-      <w:r>
         <w:t>A government that rules by emergency decree, that criminalizes truth-telling, and that places the feelings</w:t>
       </w:r>
       <w:r>
@@ -5073,7 +5073,6 @@
         <w:jc w:val="right"/>
       </w:pPr>
       <w:r>
-        <w:lastRenderedPageBreak/>
         <w:t>the</w:t>
       </w:r>
       <w:r>
@@ -5597,11 +5596,25 @@
         <w:tab/>
       </w:r>
       <w:r>
-        <w:t xml:space="preserve">A non-systemic violation affecting fewer than one thousand citizens that is fully rectified and all affected accounts unconditionally restored within 24 hours of formal notice incurs </w:t>
+        <w:t>A non-systemic violation affecting fewer than one thousand citizens that is fully rectified and all affected accounts unconditionally restored within 24 hours of formal notice incurs no penalty beyond a mandatory public explanation and algorithmic audit.</w:t>
+      </w:r>
+    </w:p>
+    <w:p>
+      <w:pPr>
+        <w:ind w:left="1080" w:hanging="360"/>
+      </w:pPr>
+      <w:r>
+        <w:t>ii)</w:t>
+      </w:r>
+      <w:r>
+        <w:tab/>
+      </w:r>
+      <w:r>
+        <w:t xml:space="preserve">Any single, non-systemic violation affecting fewer than one thousand citizens that is not rectified within 24 hours, or any systemic or repeated violation affecting fewer than one thousand </w:t>
       </w:r>
       <w:r>
         <w:lastRenderedPageBreak/>
-        <w:t>no penalty beyond a mandatory public explanation and algorithmic audit.</w:t>
+        <w:t>citizens, incurs a substantial fine and mandatory public algorithmic audit.</w:t>
       </w:r>
     </w:p>
     <w:p>
@@ -5609,13 +5622,25 @@
         <w:ind w:left="1080" w:hanging="360"/>
       </w:pPr>
       <w:r>
-        <w:t>ii)</w:t>
-      </w:r>
-      <w:r>
-        <w:tab/>
-      </w:r>
-      <w:r>
-        <w:t>Any single, non-systemic violation affecting fewer than one thousand citizens that is not rectified within 24 hours, or any systemic or repeated violation affecting fewer than one thousand citizens, incurs a substantial fine and mandatory public algorithmic audit.</w:t>
+        <w:t>iii)</w:t>
+      </w:r>
+      <w:r>
+        <w:tab/>
+      </w:r>
+      <w:r>
+        <w:t>Any systemic or repeated violation affecting one thousand or more citizens, or any violation that persists more than 72 hours after formal notice, escalates automatically to</w:t>
+      </w:r>
+      <w:r>
+        <w:t>:</w:t>
+      </w:r>
+      <w:r>
+        <w:t xml:space="preserve"> severe fines scaled to a significant portion of annual domestic revenue; mandatory divestiture of Canadian operations to a </w:t>
+      </w:r>
+      <w:r>
+        <w:t>Dominion</w:t>
+      </w:r>
+      <w:r>
+        <w:t>-compliant entity; and personal liability of responsible officers for damages payable to affected citizens.</w:t>
       </w:r>
     </w:p>
     <w:p>
@@ -5623,25 +5648,92 @@
         <w:ind w:left="1080" w:hanging="360"/>
       </w:pPr>
       <w:r>
-        <w:t>iii)</w:t>
-      </w:r>
-      <w:r>
-        <w:tab/>
-      </w:r>
-      <w:r>
-        <w:t>Any systemic or repeated violation affecting one thousand or more citizens, or any violation that persists more than 72 hours after formal notice, escalates automatically to</w:t>
-      </w:r>
-      <w:r>
-        <w:t>:</w:t>
-      </w:r>
-      <w:r>
-        <w:t xml:space="preserve"> severe fines scaled to a significant portion of annual domestic revenue; mandatory divestiture of Canadian operations to a </w:t>
+        <w:t>iv)</w:t>
+      </w:r>
+      <w:r>
+        <w:tab/>
+      </w:r>
+      <w:r>
+        <w:t xml:space="preserve">A wilful, persistent, and nationwide campaign of censorship triggers immediate and permanent revocation of licence to operate in the </w:t>
       </w:r>
       <w:r>
         <w:t>Dominion</w:t>
       </w:r>
       <w:r>
-        <w:t>-compliant entity; and personal liability of responsible officers for damages payable to affected citizens.</w:t>
+        <w:t>, seizure of all domestic assets, and personal liability of responsible officers for treble damages.</w:t>
+      </w:r>
+    </w:p>
+    <w:p>
+      <w:pPr>
+        <w:ind w:left="1077" w:hanging="357"/>
+      </w:pPr>
+      <w:r>
+        <w:t>v)</w:t>
+      </w:r>
+      <w:r>
+        <w:tab/>
+      </w:r>
+      <w:r>
+        <w:t>Fines are payable to the sovereign wealth fund. All proceedings are public and triable by a special tribunal of three senior judges.</w:t>
+      </w:r>
+    </w:p>
+    <w:p>
+      <w:pPr>
+        <w:ind w:left="360" w:hanging="360"/>
+      </w:pPr>
+      <w:r>
+        <w:t>6.</w:t>
+      </w:r>
+      <w:r>
+        <w:tab/>
+      </w:r>
+      <w:r>
+        <w:t xml:space="preserve">Institutional Accountability for Mass Deception </w:t>
+      </w:r>
+    </w:p>
+    <w:p>
+      <w:pPr>
+        <w:ind w:left="720" w:hanging="360"/>
+      </w:pPr>
+      <w:r>
+        <w:t>a)</w:t>
+      </w:r>
+      <w:r>
+        <w:tab/>
+      </w:r>
+      <w:r>
+        <w:t>Nothing in this Article shall ever limit, chill, or punish the speech of natural persons, unincorporated associations, or media enterprises whose annual domestic revenue is less than one hundred times the national median wage. Such persons and enterprises retain absolute protection.</w:t>
+      </w:r>
+    </w:p>
+    <w:p>
+      <w:pPr>
+        <w:ind w:left="720" w:hanging="360"/>
+      </w:pPr>
+      <w:r>
+        <w:t>b)</w:t>
+      </w:r>
+      <w:r>
+        <w:tab/>
+      </w:r>
+      <w:r>
+        <w:t>A corporate entity or licensed broadcaster whose domestic audience regularly exceeds ten percent (10 %) of the citizen population that knowingly publishes or broadcasts a statement of material fact it knows or deliberately avoids knowing to be false, with specific intent to deceive citizens on matters of public policy, national security, public health, electoral choice, or demographic continuity, commits the offence of Institutional Deception.</w:t>
+      </w:r>
+    </w:p>
+    <w:p>
+      <w:pPr>
+        <w:ind w:left="720" w:hanging="360"/>
+      </w:pPr>
+      <w:r>
+        <w:t>c)</w:t>
+      </w:r>
+      <w:r>
+        <w:tab/>
+      </w:r>
+      <w:r>
+        <w:t>The offence is triable only by a jury of twelve citizens chosen by blind lot, with conviction requiring a unanimous verdict; however, if the jury cannot reach unanimity after a reasonable period of deliberation as determined by the presiding judge, a verdict may be accepted by a majority of at least ten jurors.</w:t>
+      </w:r>
+      <w:r>
+        <w:t xml:space="preserve"> The prosecution must prove beyond reasonable doubt: </w:t>
       </w:r>
     </w:p>
     <w:p>
@@ -5649,117 +5741,21 @@
         <w:ind w:left="1080" w:hanging="360"/>
       </w:pPr>
       <w:r>
-        <w:t>iv)</w:t>
-      </w:r>
-      <w:r>
-        <w:tab/>
-      </w:r>
-      <w:r>
-        <w:t xml:space="preserve">A wilful, persistent, and nationwide campaign of censorship triggers immediate and permanent revocation of licence to operate in the </w:t>
-      </w:r>
-      <w:r>
-        <w:t>Dominion</w:t>
-      </w:r>
-      <w:r>
-        <w:t>, seizure of all domestic assets, and personal liability of responsible officers for treble damages.</w:t>
-      </w:r>
-    </w:p>
-    <w:p>
-      <w:pPr>
-        <w:ind w:left="1077" w:hanging="357"/>
-      </w:pPr>
-      <w:r>
-        <w:t>v)</w:t>
-      </w:r>
-      <w:r>
-        <w:tab/>
-      </w:r>
-      <w:r>
-        <w:t>Fines are payable to the sovereign wealth fund. All proceedings are public and triable by a special tribunal of three senior judges.</w:t>
-      </w:r>
-    </w:p>
-    <w:p>
-      <w:pPr>
-        <w:ind w:left="360" w:hanging="360"/>
-      </w:pPr>
-      <w:r>
-        <w:t>5.</w:t>
-      </w:r>
-      <w:r>
-        <w:tab/>
-      </w:r>
-      <w:r>
-        <w:t xml:space="preserve">Institutional Accountability for Mass Deception </w:t>
-      </w:r>
-    </w:p>
-    <w:p>
-      <w:pPr>
-        <w:ind w:left="720" w:hanging="360"/>
-      </w:pPr>
-      <w:r>
-        <w:t>a)</w:t>
-      </w:r>
-      <w:r>
-        <w:tab/>
-      </w:r>
-      <w:r>
-        <w:t>Nothing in this Article shall ever limit, chill, or punish the speech of natural persons, unincorporated associations, or media enterprises whose annual domestic revenue is less than one hundred times the national median wage. Such persons and enterprises retain absolute protection.</w:t>
-      </w:r>
-    </w:p>
-    <w:p>
-      <w:pPr>
-        <w:ind w:left="720" w:hanging="360"/>
-      </w:pPr>
-      <w:r>
-        <w:t>b)</w:t>
-      </w:r>
-      <w:r>
-        <w:tab/>
-      </w:r>
-      <w:r>
-        <w:t xml:space="preserve">A corporate entity or licensed broadcaster whose domestic audience regularly exceeds ten percent (10 %) of the citizen population that knowingly publishes or broadcasts a statement of material fact it knows or deliberately avoids knowing to be false, with specific intent to deceive citizens on matters of public policy, national security, public </w:t>
-      </w:r>
+        <w:t>i)</w:t>
+      </w:r>
+      <w:r>
+        <w:tab/>
+      </w:r>
+      <w:r>
+        <w:t xml:space="preserve">objective falsity or deliberate material omission; </w:t>
+      </w:r>
+    </w:p>
+    <w:p>
+      <w:pPr>
+        <w:ind w:left="1080" w:hanging="360"/>
+      </w:pPr>
       <w:r>
         <w:lastRenderedPageBreak/>
-        <w:t>health, electoral choice, or demographic continuity, commits the offence of Institutional Deception.</w:t>
-      </w:r>
-    </w:p>
-    <w:p>
-      <w:pPr>
-        <w:ind w:left="720" w:hanging="360"/>
-      </w:pPr>
-      <w:r>
-        <w:t>c)</w:t>
-      </w:r>
-      <w:r>
-        <w:tab/>
-      </w:r>
-      <w:r>
-        <w:t>The offence is triable only by a jury of twelve citizens chosen by blind lot, with conviction requiring a unanimous verdict; however, if the jury cannot reach unanimity after a reasonable period of deliberation as determined by the presiding judge, a verdict may be accepted by a majority of at least ten jurors.</w:t>
-      </w:r>
-      <w:r>
-        <w:t xml:space="preserve"> The prosecution must prove beyond reasonable doubt: </w:t>
-      </w:r>
-    </w:p>
-    <w:p>
-      <w:pPr>
-        <w:ind w:left="1080" w:hanging="360"/>
-      </w:pPr>
-      <w:r>
-        <w:t>i)</w:t>
-      </w:r>
-      <w:r>
-        <w:tab/>
-      </w:r>
-      <w:r>
-        <w:t xml:space="preserve">objective falsity or deliberate material omission; </w:t>
-      </w:r>
-    </w:p>
-    <w:p>
-      <w:pPr>
-        <w:ind w:left="1080" w:hanging="360"/>
-      </w:pPr>
-      <w:r>
         <w:t>ii)</w:t>
       </w:r>
       <w:r>
@@ -6206,11 +6202,7 @@
         <w:t>-thousand words</w:t>
       </w:r>
       <w:r>
-        <w:t xml:space="preserve">, the Supreme Court shall empanel a Special Tribunal of </w:t>
-      </w:r>
-      <w:r>
-        <w:lastRenderedPageBreak/>
-        <w:t>Scientific Review consisting of</w:t>
+        <w:t>, the Supreme Court shall empanel a Special Tribunal of Scientific Review consisting of</w:t>
       </w:r>
       <w:r>
         <w:t xml:space="preserve"> </w:t>
@@ -6225,6 +6217,7 @@
         <w:ind w:left="360"/>
       </w:pPr>
       <w:r>
+        <w:lastRenderedPageBreak/>
         <w:t>Petitions which cover largely the same subject matter shall be heard on a first-come, first-served basis. If a prior petition results in an Overturn decision, all subsequent queued petitions challenging the same claim on substantially similar grounds shall be dismissed as moot, without need for further hearing.</w:t>
       </w:r>
     </w:p>
@@ -6381,11 +6374,22 @@
         <w:pStyle w:val="ListParagraph"/>
       </w:pPr>
       <w:r>
-        <w:t xml:space="preserve">The identities of the fourteen non-judicial members shall remain permanently sealed and known only to the Registrar of the Supreme Court. In all proceedings and decisions they shall appear solely under </w:t>
-      </w:r>
+        <w:t>The identities of the fourteen non-judicial members shall remain permanently sealed and known only to the Registrar of the Supreme Court. In all proceedings and decisions they shall appear solely under randomly assigned numerical identifiers. Any attempt to discover, publish, or act upon the sealed identities of anonymised members is a felony carrying a mandatory minimum sentence of seven years’ imprisonment.</w:t>
+      </w:r>
+    </w:p>
+    <w:p>
+      <w:pPr>
+        <w:pStyle w:val="ListParagraph"/>
+      </w:pPr>
       <w:r>
         <w:lastRenderedPageBreak/>
-        <w:t>randomly assigned numerical identifiers. Any attempt to discover, publish, or act upon the sealed identities of anonymised members is a felony carrying a mandatory minimum sentence of seven years’ imprisonment.</w:t>
+        <w:t>The fourteen anonymized members shall never meet in person, hear each other’s voices, or see each other’s faces at any time</w:t>
+      </w:r>
+      <w:r>
+        <w:t xml:space="preserve"> through the proceedings</w:t>
+      </w:r>
+      <w:r>
+        <w:t>, including during the hearing and decision phase.</w:t>
       </w:r>
     </w:p>
     <w:p>
@@ -6393,13 +6397,27 @@
         <w:pStyle w:val="ListParagraph"/>
       </w:pPr>
       <w:r>
-        <w:t>The fourteen anonymized members shall never meet in person, hear each other’s voices, or see each other’s faces at any time</w:t>
-      </w:r>
-      <w:r>
-        <w:t xml:space="preserve"> through the proceedings</w:t>
-      </w:r>
-      <w:r>
-        <w:t>, including during the hearing and decision phase.</w:t>
+        <w:t>All proceedings shall be conducted through a secure interface that defaults to text-only but permits voice-and-image inputs only if fully scrambled to ensure</w:t>
+      </w:r>
+      <w:r>
+        <w:t xml:space="preserve"> secure</w:t>
+      </w:r>
+      <w:r>
+        <w:t xml:space="preserve"> anonymity. Each anonymized member appears solely as their assigned number, with no unscrambled voice or image permitted at any stage.</w:t>
+      </w:r>
+    </w:p>
+    <w:p>
+      <w:pPr>
+        <w:ind w:left="720" w:hanging="360"/>
+      </w:pPr>
+      <w:r>
+        <w:t>c)</w:t>
+      </w:r>
+      <w:r>
+        <w:tab/>
+      </w:r>
+      <w:r>
+        <w:t>Procedure and Decision</w:t>
       </w:r>
     </w:p>
     <w:p>
@@ -6407,27 +6425,13 @@
         <w:pStyle w:val="ListParagraph"/>
       </w:pPr>
       <w:r>
-        <w:t>All proceedings shall be conducted through a secure interface that defaults to text-only but permits voice-and-image inputs only if fully scrambled to ensure</w:t>
-      </w:r>
-      <w:r>
-        <w:t xml:space="preserve"> secure</w:t>
-      </w:r>
-      <w:r>
-        <w:t xml:space="preserve"> anonymity. Each anonymized member appears solely as their assigned number, with no unscrambled voice or image permitted at any stage.</w:t>
-      </w:r>
-    </w:p>
-    <w:p>
-      <w:pPr>
-        <w:ind w:left="720" w:hanging="360"/>
-      </w:pPr>
-      <w:r>
-        <w:t>c)</w:t>
-      </w:r>
-      <w:r>
-        <w:tab/>
-      </w:r>
-      <w:r>
-        <w:t>Procedure and Decision</w:t>
+        <w:t>Proceedings shall be fully adversarial, equally funded, open to the public, and live-streamed with</w:t>
+      </w:r>
+      <w:r>
+        <w:t xml:space="preserve"> securely anonymizing</w:t>
+      </w:r>
+      <w:r>
+        <w:t xml:space="preserve"> voice and image alteration for the fourteen anonymised members.</w:t>
       </w:r>
     </w:p>
     <w:p>
@@ -6435,13 +6439,34 @@
         <w:pStyle w:val="ListParagraph"/>
       </w:pPr>
       <w:r>
-        <w:t>Proceedings shall be fully adversarial, equally funded, open to the public, and live-streamed with</w:t>
-      </w:r>
-      <w:r>
-        <w:t xml:space="preserve"> securely anonymizing</w:t>
-      </w:r>
-      <w:r>
-        <w:t xml:space="preserve"> voice and image alteration for the fourteen anonymised members.</w:t>
+        <w:t xml:space="preserve">After the close of evidence and argument, each of the fourteen members shall individually and privately submit a written report (maximum </w:t>
+      </w:r>
+      <w:r>
+        <w:t>three-thousand words</w:t>
+      </w:r>
+      <w:r>
+        <w:t>) containing their reasoning and provisional vote (Uphold / Overturn / Inconclusive).</w:t>
+      </w:r>
+      <w:r>
+        <w:t xml:space="preserve"> </w:t>
+      </w:r>
+      <w:r>
+        <w:t>All fourteen reports are immediately published simultaneously and anonymously to the other panel members and to the public.</w:t>
+      </w:r>
+      <w:r>
+        <w:t xml:space="preserve"> </w:t>
+      </w:r>
+      <w:r>
+        <w:t>Each member then has 72 hours to submit optional written rebuttals or revisions (again anonymized).</w:t>
+      </w:r>
+      <w:r>
+        <w:t xml:space="preserve"> </w:t>
+      </w:r>
+      <w:r>
+        <w:t>F</w:t>
+      </w:r>
+      <w:r>
+        <w:t xml:space="preserve">inal binding votes are cast secretly and simultaneously. </w:t>
       </w:r>
     </w:p>
     <w:p>
@@ -6449,55 +6474,20 @@
         <w:pStyle w:val="ListParagraph"/>
       </w:pPr>
       <w:r>
-        <w:t xml:space="preserve">After the close of evidence and argument, each of the fourteen members shall individually and privately submit a written report (maximum </w:t>
-      </w:r>
-      <w:r>
-        <w:t>three-thousand words</w:t>
-      </w:r>
-      <w:r>
-        <w:t>) containing their reasoning and provisional vote (Uphold / Overturn / Inconclusive).</w:t>
+        <w:t>The decision is determined by simple majority of the seventeen</w:t>
       </w:r>
       <w:r>
         <w:t xml:space="preserve"> </w:t>
       </w:r>
       <w:r>
-        <w:t>All fourteen reports are immediately published simultaneously and anonymously to the other panel members and to the public.</w:t>
+        <w:t>members and may be</w:t>
+      </w:r>
+      <w:r>
+        <w:t>:</w:t>
       </w:r>
       <w:r>
         <w:t xml:space="preserve"> </w:t>
       </w:r>
-      <w:r>
-        <w:t>Each member then has 72 hours to submit optional written rebuttals or revisions (again anonymized).</w:t>
-      </w:r>
-      <w:r>
-        <w:t xml:space="preserve"> </w:t>
-      </w:r>
-      <w:r>
-        <w:t>F</w:t>
-      </w:r>
-      <w:r>
-        <w:t xml:space="preserve">inal binding votes are cast secretly and simultaneously. </w:t>
-      </w:r>
-    </w:p>
-    <w:p>
-      <w:pPr>
-        <w:pStyle w:val="ListParagraph"/>
-      </w:pPr>
-      <w:r>
-        <w:t>The decision is determined by simple majority of the seventeen</w:t>
-      </w:r>
-      <w:r>
-        <w:t xml:space="preserve"> </w:t>
-      </w:r>
-      <w:r>
-        <w:t>members and may be</w:t>
-      </w:r>
-      <w:r>
-        <w:t>:</w:t>
-      </w:r>
-      <w:r>
-        <w:t xml:space="preserve"> </w:t>
-      </w:r>
     </w:p>
     <w:p>
       <w:pPr>
@@ -6532,7 +6522,6 @@
         <w:ind w:left="1080" w:hanging="360"/>
       </w:pPr>
       <w:r>
-        <w:lastRenderedPageBreak/>
         <w:t>iii)</w:t>
       </w:r>
       <w:r>
@@ -6559,6 +6548,7 @@
         <w:ind w:left="720"/>
       </w:pPr>
       <w:r>
+        <w:lastRenderedPageBreak/>
         <w:t>No decision of the tribunal establishes binding precedent; scientific, philosophical, religious, political, and any other truth or falsehood remains forever contestable.</w:t>
       </w:r>
     </w:p>
@@ -6622,34 +6612,37 @@
         <w:ind w:left="1080" w:hanging="360"/>
       </w:pPr>
       <w:r>
+        <w:t>i)</w:t>
+      </w:r>
+      <w:r>
+        <w:tab/>
+      </w:r>
+      <w:r>
+        <w:t xml:space="preserve">Automatic reimbursement of all verified costs incurred in preparing and pursuing the petition (e.g., research, signature collection, and administrative expenses), as certified by the Supreme Court; and </w:t>
+      </w:r>
+    </w:p>
+    <w:p>
+      <w:pPr>
+        <w:ind w:left="1077" w:hanging="357"/>
+      </w:pPr>
+      <w:r>
+        <w:t>ii)</w:t>
+      </w:r>
+      <w:r>
+        <w:tab/>
+      </w:r>
+      <w:r>
+        <w:t>A fixed honorarium equal to seven times the national median annual wage. This remuneration shall be drawn from the budget of the suspended program, law, or expenditure</w:t>
+      </w:r>
+      <w:r>
+        <w:t>,</w:t>
+      </w:r>
+      <w:r>
+        <w:t xml:space="preserve"> or, if unavailable, </w:t>
+      </w:r>
+      <w:r>
         <w:lastRenderedPageBreak/>
-        <w:t>i)</w:t>
-      </w:r>
-      <w:r>
-        <w:tab/>
-      </w:r>
-      <w:r>
-        <w:t xml:space="preserve">Automatic reimbursement of all verified costs incurred in preparing and pursuing the petition (e.g., research, signature collection, and administrative expenses), as certified by the Supreme Court; and </w:t>
-      </w:r>
-    </w:p>
-    <w:p>
-      <w:pPr>
-        <w:ind w:left="1077" w:hanging="357"/>
-      </w:pPr>
-      <w:r>
-        <w:t>ii)</w:t>
-      </w:r>
-      <w:r>
-        <w:tab/>
-      </w:r>
-      <w:r>
-        <w:t>A fixed honorarium equal to seven times the national median annual wage. This remuneration shall be drawn from the budget of the suspended program, law, or expenditure</w:t>
-      </w:r>
-      <w:r>
-        <w:t>,</w:t>
-      </w:r>
-      <w:r>
-        <w:t xml:space="preserve"> or, if unavailable, from a dedicated Accountability Fund established by the Treasury under Article 20. No rewards apply to Uphold or Inconclusive decisions.</w:t>
+        <w:t>from a dedicated Accountability Fund established by the Treasury under Article 20. No rewards apply to Uphold or Inconclusive decisions.</w:t>
       </w:r>
       <w:r>
         <w:t xml:space="preserve"> </w:t>
@@ -6753,7 +6746,6 @@
     <w:p/>
     <w:p>
       <w:r>
-        <w:lastRenderedPageBreak/>
         <w:br w:type="page"/>
       </w:r>
     </w:p>
@@ -7022,24 +7014,21 @@
         <w:tab/>
       </w:r>
       <w:r>
-        <w:t xml:space="preserve">a prohibition on carry outside designated hunting areas or outside hunting season. Such provincial minor’s permits confer no general right of possession or carry and expire automatically at age eighteen, at </w:t>
-      </w:r>
+        <w:t xml:space="preserve">a prohibition on carry outside designated hunting areas or outside hunting season. Such provincial minor’s permits confer no general right of possession or carry and expire automatically at age eighteen, at which point the holder immediately qualifies for the permit under </w:t>
+      </w:r>
+      <w:r>
+        <w:t xml:space="preserve">section </w:t>
+      </w:r>
+      <w:r>
+        <w:t>4.</w:t>
+      </w:r>
+    </w:p>
+    <w:p>
+      <w:pPr>
+        <w:ind w:left="357" w:hanging="360"/>
+      </w:pPr>
       <w:r>
         <w:lastRenderedPageBreak/>
-        <w:t xml:space="preserve">which point the holder immediately qualifies for the permit under </w:t>
-      </w:r>
-      <w:r>
-        <w:t xml:space="preserve">section </w:t>
-      </w:r>
-      <w:r>
-        <w:t>4.</w:t>
-      </w:r>
-    </w:p>
-    <w:p>
-      <w:pPr>
-        <w:ind w:left="357" w:hanging="360"/>
-      </w:pPr>
-      <w:r>
         <w:t>6.</w:t>
       </w:r>
       <w:r>
@@ -7222,11 +7211,11 @@
         <w:t>A</w:t>
       </w:r>
       <w:r>
-        <w:t xml:space="preserve">ny citizen proven in a court of law to have negligently caused death or serious injury through the use of a firearm, outside the reasonable bounds of lawful self-defence, shall be liable to severe penalty, including </w:t>
+        <w:t xml:space="preserve">ny citizen proven in a court of law to have negligently caused death or serious injury through the use of a firearm, outside the reasonable bounds of lawful self-defence, shall be liable to severe penalty, including imprisonment for a term of not less than ten years, forfeiture of arms privileges for life, and civil restitution to victims or their families as determined by the court. Such negligence shall be established only upon </w:t>
       </w:r>
       <w:r>
         <w:lastRenderedPageBreak/>
-        <w:t>imprisonment for a term of not less than ten years, forfeiture of arms privileges for life, and civil restitution to victims or their families as determined by the court. Such negligence shall be established only upon proof beyond a reasonable doubt that the citizen’s actions demonstrated reckless disregard for human life inconsistent with the responsible exercise of the rights herein affirmed.</w:t>
+        <w:t>proof beyond a reasonable doubt that the citizen’s actions demonstrated reckless disregard for human life inconsistent with the responsible exercise of the rights herein affirmed.</w:t>
       </w:r>
     </w:p>
     <w:p>
@@ -8121,21 +8110,21 @@
         <w:ind w:left="360" w:hanging="360"/>
       </w:pPr>
       <w:r>
+        <w:t>10.</w:t>
+      </w:r>
+      <w:r>
+        <w:tab/>
+      </w:r>
+      <w:r>
+        <w:t xml:space="preserve">The conception, gestation, and birth of every human being must occur through the natural union of one man and one woman and the gestation of the child within the body of its own mother. </w:t>
+      </w:r>
+    </w:p>
+    <w:p>
+      <w:pPr>
+        <w:ind w:left="720" w:hanging="360"/>
+      </w:pPr>
+      <w:r>
         <w:lastRenderedPageBreak/>
-        <w:t>10.</w:t>
-      </w:r>
-      <w:r>
-        <w:tab/>
-      </w:r>
-      <w:r>
-        <w:t xml:space="preserve">The conception, gestation, and birth of every human being must occur through the natural union of one man and one woman and the gestation of the child within the body of its own mother. </w:t>
-      </w:r>
-    </w:p>
-    <w:p>
-      <w:pPr>
-        <w:ind w:left="720" w:hanging="360"/>
-      </w:pPr>
-      <w:r>
         <w:t>a)</w:t>
       </w:r>
       <w:r>
@@ -8526,6 +8515,7 @@
     </w:p>
     <w:p>
       <w:r>
+        <w:lastRenderedPageBreak/>
         <w:t>Precis:</w:t>
       </w:r>
     </w:p>
@@ -8584,7 +8574,11 @@
         <w:t xml:space="preserve">, </w:t>
       </w:r>
       <w:r>
-        <w:t xml:space="preserve">balance compassion with accountability, while post-first-trimester registration enables state-facilitated adoption or paternal custody, empowering biological fathers with absolute rights unless proven unfit. This framework aligns with meritocratic principles by favoring competent guardianship and treating the killing of a pregnant woman as double murder from conception, deterring violent crimes that target vulnerable families, and providing safe, anonymous surrender of children at any age without stigma to encourage responsible alternatives. By classifying unauthorized terminations of viable fetuses as murder, it incorporates generous provisions for surrender to eliminate excuses for harm, drawing from European familial norms that emphasize paternal involvement and child welfare over individual convenience. This comprehensive approach not only upholds national vitality but also counters twenty-first-century challenges like declining birthrates or bioethical exploitation that could undermine the </w:t>
+        <w:t xml:space="preserve">balance compassion with accountability, while post-first-trimester registration enables state-facilitated adoption or paternal custody, empowering biological fathers with absolute rights unless proven unfit. This framework aligns with meritocratic principles by favoring competent guardianship and treating the killing of a pregnant woman as double murder from conception, deterring violent crimes that target vulnerable families, and providing safe, anonymous surrender of children at any age without stigma to encourage responsible alternatives. By classifying unauthorized terminations of viable fetuses as murder, it incorporates generous provisions for surrender to eliminate excuses for harm, drawing from European familial norms that emphasize paternal involvement and child welfare over individual convenience. This comprehensive approach not only upholds national vitality but also </w:t>
+      </w:r>
+      <w:r>
+        <w:lastRenderedPageBreak/>
+        <w:t xml:space="preserve">counters twenty-first-century challenges like declining birthrates or bioethical exploitation that could undermine the </w:t>
       </w:r>
       <w:r>
         <w:t>Dominion</w:t>
@@ -27117,9 +27111,9 @@
   <w:abstractNum w:abstractNumId="51" w15:restartNumberingAfterBreak="0">
     <w:nsid w:val="73DE689F"/>
     <w:multiLevelType w:val="multilevel"/>
-    <w:tmpl w:val="490A811E"/>
+    <w:tmpl w:val="4FAC1204"/>
     <w:lvl w:ilvl="0">
-      <w:start w:val="5"/>
+      <w:start w:val="6"/>
       <w:numFmt w:val="decimal"/>
       <w:lvlText w:val="%1."/>
       <w:lvlJc w:val="left"/>

</xml_diff>

<commit_message>
Add home and digital privacy: Charter item 5 and Article 22 ambient sensing.
Protect privacy of person, home, and digital life in the Charter. Ban ambient mics, cameras, and RF/Wi-Fi sensing inside dwellings without specific consent or a warrant. Refresh completePDF DOCX/PDF and website JSON.
</commit_message>
<xml_diff>
--- a/completePDF/Meritocratic Dominion of Canada.docx
+++ b/completePDF/Meritocratic Dominion of Canada.docx
@@ -59,7 +59,7 @@
           <w:noProof/>
         </w:rPr>
         <w:drawing>
-          <wp:inline distT="0" distB="0" distL="0" distR="0" wp14:anchorId="4B7B226F" wp14:editId="4DE4C860">
+          <wp:inline distT="0" distB="0" distL="0" distR="0" wp14:anchorId="662D45DD" wp14:editId="71DE1915">
             <wp:extent cx="4239010" cy="2117693"/>
             <wp:effectExtent l="0" t="0" r="0" b="0"/>
             <wp:docPr id="4" name="Picture 4"/>
@@ -627,7 +627,6 @@
             <w:rPr>
               <w:rFonts w:ascii="Garamond" w:hAnsi="Garamond"/>
             </w:rPr>
-            <w:lastRenderedPageBreak/>
             <w:t>Contents</w:t>
           </w:r>
           <w:r>
@@ -3427,7 +3426,6 @@
       </w:pPr>
       <w:bookmarkStart w:id="58" w:name="_Toc229835201"/>
       <w:r>
-        <w:lastRenderedPageBreak/>
         <w:t>Introduction</w:t>
       </w:r>
       <w:bookmarkEnd w:id="58"/>
@@ -3576,11 +3574,7 @@
         <w:t xml:space="preserve">The reference to European peoples, or White people as a general term, is explicit, as more than two-thousand years ago one of the greatest intellects of Western history, Aristotle, explained that the state could only function </w:t>
       </w:r>
       <w:r>
-        <w:t xml:space="preserve">if there </w:t>
-      </w:r>
-      <w:r>
-        <w:lastRenderedPageBreak/>
-        <w:t>was</w:t>
+        <w:t>if there was</w:t>
       </w:r>
       <w:r>
         <w:t xml:space="preserve"> a</w:t>
@@ -3732,11 +3726,7 @@
         <w:t xml:space="preserve">. </w:t>
       </w:r>
       <w:r>
-        <w:t xml:space="preserve">There is no point to discuss here the various ways in which this constitution provides </w:t>
-      </w:r>
-      <w:r>
-        <w:lastRenderedPageBreak/>
-        <w:t xml:space="preserve">for </w:t>
+        <w:t xml:space="preserve">There is no point to discuss here the various ways in which this constitution provides for </w:t>
       </w:r>
       <w:r>
         <w:t>meritocracy</w:t>
@@ -3867,7 +3857,6 @@
     </w:p>
     <w:p>
       <w:r>
-        <w:lastRenderedPageBreak/>
         <w:t>As this document was written with Canadian interests and culture in mind,</w:t>
       </w:r>
       <w:r>
@@ -4002,7 +3991,6 @@
       </w:pPr>
       <w:bookmarkStart w:id="59" w:name="_Toc229835202"/>
       <w:r>
-        <w:lastRenderedPageBreak/>
         <w:t>T</w:t>
       </w:r>
       <w:r>
@@ -4233,7 +4221,6 @@
     </w:p>
     <w:p>
       <w:r>
-        <w:lastRenderedPageBreak/>
         <w:t xml:space="preserve">That everyone must be held equally before the law, and that the Laws of Nature have endowed </w:t>
       </w:r>
       <w:r>
@@ -4482,7 +4469,6 @@
         <w:ind w:left="360" w:hanging="360"/>
       </w:pPr>
       <w:r>
-        <w:lastRenderedPageBreak/>
         <w:t>5.</w:t>
       </w:r>
       <w:r>
@@ -4613,7 +4599,6 @@
     <w:p/>
     <w:p>
       <w:r>
-        <w:lastRenderedPageBreak/>
         <w:t>A government that rules by emergency decree, that criminalizes truth-telling, and that places the feelings</w:t>
       </w:r>
       <w:r>
@@ -4858,7 +4843,6 @@
         <w:ind w:left="360" w:hanging="360"/>
       </w:pPr>
       <w:r>
-        <w:lastRenderedPageBreak/>
         <w:t>1.</w:t>
       </w:r>
       <w:r>
@@ -4939,6 +4923,20 @@
         <w:tab/>
       </w:r>
       <w:r>
+        <w:t>Privacy of the person, the home, and private digital life, including freedom from unwarranted surveillance or sensing within the dwelling, shall not be violated except by judicial warrant as provided in this Charter and the Articles.</w:t>
+      </w:r>
+    </w:p>
+    <w:p>
+      <w:pPr>
+        <w:ind w:left="360" w:hanging="360"/>
+      </w:pPr>
+      <w:r>
+        <w:t>6.</w:t>
+      </w:r>
+      <w:r>
+        <w:tab/>
+      </w:r>
+      <w:r>
         <w:t xml:space="preserve">The </w:t>
       </w:r>
       <w:r>
@@ -4956,7 +4954,7 @@
         <w:ind w:left="360" w:hanging="360"/>
       </w:pPr>
       <w:r>
-        <w:t>6.</w:t>
+        <w:t>7.</w:t>
       </w:r>
       <w:r>
         <w:tab/>
@@ -5000,7 +4998,7 @@
         <w:ind w:left="360" w:hanging="360"/>
       </w:pPr>
       <w:r>
-        <w:t>7.</w:t>
+        <w:t>8.</w:t>
       </w:r>
       <w:r>
         <w:tab/>
@@ -5020,7 +5018,7 @@
         <w:ind w:left="360" w:hanging="360"/>
       </w:pPr>
       <w:r>
-        <w:t>8.</w:t>
+        <w:t>9.</w:t>
       </w:r>
       <w:r>
         <w:tab/>
@@ -5182,7 +5180,6 @@
       <w:bookmarkStart w:id="71" w:name="_Toc215665032"/>
       <w:bookmarkStart w:id="72" w:name="_Toc229835205"/>
       <w:r>
-        <w:lastRenderedPageBreak/>
         <w:t xml:space="preserve">Article 1 </w:t>
       </w:r>
       <w:r>
@@ -5415,7 +5412,6 @@
         <w:ind w:left="357" w:hanging="357"/>
       </w:pPr>
       <w:r>
-        <w:lastRenderedPageBreak/>
         <w:t>4.</w:t>
       </w:r>
       <w:r>
@@ -5610,11 +5606,7 @@
         <w:tab/>
       </w:r>
       <w:r>
-        <w:t xml:space="preserve">Any single, non-systemic violation affecting fewer than one thousand citizens that is not rectified within 24 hours, or any systemic or repeated violation affecting fewer than one thousand </w:t>
-      </w:r>
-      <w:r>
-        <w:lastRenderedPageBreak/>
-        <w:t>citizens, incurs a substantial fine and mandatory public algorithmic audit.</w:t>
+        <w:t>Any single, non-systemic violation affecting fewer than one thousand citizens that is not rectified within 24 hours, or any systemic or repeated violation affecting fewer than one thousand citizens, incurs a substantial fine and mandatory public algorithmic audit.</w:t>
       </w:r>
     </w:p>
     <w:p>
@@ -5755,7 +5747,6 @@
         <w:ind w:left="1080" w:hanging="360"/>
       </w:pPr>
       <w:r>
-        <w:lastRenderedPageBreak/>
         <w:t>ii)</w:t>
       </w:r>
       <w:r>
@@ -5897,7 +5888,6 @@
     </w:p>
     <w:p>
       <w:r>
-        <w:lastRenderedPageBreak/>
         <w:t>Precis:</w:t>
       </w:r>
     </w:p>
@@ -5947,11 +5937,7 @@
         <w:t>’</w:t>
       </w:r>
       <w:r>
-        <w:t xml:space="preserve"> vision of a society that elevates human dignity over base exploitation. This </w:t>
-      </w:r>
-      <w:r>
-        <w:lastRenderedPageBreak/>
-        <w:t xml:space="preserve">boundary prevents the societal decay that arises from the commercialization of degradation, which has been shown to erode family structures, exploit vulnerabilities, and undermine the meritocratic ideal by rewarding vice over virtue. By exempting artistic and educational representations of the human form, it honors the classical European traditions of sculpture and painting that celebrate beauty and anatomy without descending into obscenity, thus securing freedoms for genuine cultural expression while curbing crimes like the proliferation of materials that contribute to addiction, objectification, and the corruption of youth. In safeguarding these distinctions, the </w:t>
+        <w:t xml:space="preserve"> vision of a society that elevates human dignity over base exploitation. This boundary prevents the societal decay that arises from the commercialization of degradation, which has been shown to erode family structures, exploit vulnerabilities, and undermine the meritocratic ideal by rewarding vice over virtue. By exempting artistic and educational representations of the human form, it honors the classical European traditions of sculpture and painting that celebrate beauty and anatomy without descending into obscenity, thus securing freedoms for genuine cultural expression while curbing crimes like the proliferation of materials that contribute to addiction, objectification, and the corruption of youth. In safeguarding these distinctions, the </w:t>
       </w:r>
       <w:r>
         <w:t>Dominion</w:t>
@@ -6008,7 +5994,6 @@
       <w:bookmarkStart w:id="74" w:name="_Toc215665033"/>
       <w:bookmarkStart w:id="75" w:name="_Toc229835206"/>
       <w:r>
-        <w:lastRenderedPageBreak/>
         <w:t xml:space="preserve">Article 2 </w:t>
       </w:r>
       <w:r>
@@ -6217,7 +6202,6 @@
         <w:ind w:left="360"/>
       </w:pPr>
       <w:r>
-        <w:lastRenderedPageBreak/>
         <w:t>Petitions which cover largely the same subject matter shall be heard on a first-come, first-served basis. If a prior petition results in an Overturn decision, all subsequent queued petitions challenging the same claim on substantially similar grounds shall be dismissed as moot, without need for further hearing.</w:t>
       </w:r>
     </w:p>
@@ -6382,7 +6366,6 @@
         <w:pStyle w:val="ListParagraph"/>
       </w:pPr>
       <w:r>
-        <w:lastRenderedPageBreak/>
         <w:t>The fourteen anonymized members shall never meet in person, hear each other’s voices, or see each other’s faces at any time</w:t>
       </w:r>
       <w:r>
@@ -6548,7 +6531,6 @@
         <w:ind w:left="720"/>
       </w:pPr>
       <w:r>
-        <w:lastRenderedPageBreak/>
         <w:t>No decision of the tribunal establishes binding precedent; scientific, philosophical, religious, political, and any other truth or falsehood remains forever contestable.</w:t>
       </w:r>
     </w:p>
@@ -6638,11 +6620,7 @@
         <w:t>,</w:t>
       </w:r>
       <w:r>
-        <w:t xml:space="preserve"> or, if unavailable, </w:t>
-      </w:r>
-      <w:r>
-        <w:lastRenderedPageBreak/>
-        <w:t>from a dedicated Accountability Fund established by the Treasury under Article 20. No rewards apply to Uphold or Inconclusive decisions.</w:t>
+        <w:t xml:space="preserve"> or, if unavailable, from a dedicated Accountability Fund established by the Treasury under Article 20. No rewards apply to Uphold or Inconclusive decisions.</w:t>
       </w:r>
       <w:r>
         <w:t xml:space="preserve"> </w:t>
@@ -6751,7 +6729,6 @@
     </w:p>
     <w:p>
       <w:r>
-        <w:lastRenderedPageBreak/>
         <w:t>Precis:</w:t>
       </w:r>
     </w:p>
@@ -6799,7 +6776,6 @@
     </w:p>
     <w:p>
       <w:r>
-        <w:lastRenderedPageBreak/>
         <w:t>A permanent National Repository of Human Knowledge further secures this freedom by collecting, transcribing without algorithmic alteration, and indefinitely preserving on durable non-digital media the complete historical, scientific, philosophical, religious, legal, and cultural record of the European-descended peoples and of all humanity, guarded as a critical national asset yet open for public research.</w:t>
       </w:r>
     </w:p>
@@ -6837,7 +6813,6 @@
       <w:bookmarkStart w:id="77" w:name="_Toc215665034"/>
       <w:bookmarkStart w:id="78" w:name="_Toc229835207"/>
       <w:r>
-        <w:lastRenderedPageBreak/>
         <w:t xml:space="preserve">Article 3 </w:t>
       </w:r>
       <w:r>
@@ -7028,7 +7003,6 @@
         <w:ind w:left="357" w:hanging="360"/>
       </w:pPr>
       <w:r>
-        <w:lastRenderedPageBreak/>
         <w:t>6.</w:t>
       </w:r>
       <w:r>
@@ -7211,11 +7185,7 @@
         <w:t>A</w:t>
       </w:r>
       <w:r>
-        <w:t xml:space="preserve">ny citizen proven in a court of law to have negligently caused death or serious injury through the use of a firearm, outside the reasonable bounds of lawful self-defence, shall be liable to severe penalty, including imprisonment for a term of not less than ten years, forfeiture of arms privileges for life, and civil restitution to victims or their families as determined by the court. Such negligence shall be established only upon </w:t>
-      </w:r>
-      <w:r>
-        <w:lastRenderedPageBreak/>
-        <w:t>proof beyond a reasonable doubt that the citizen’s actions demonstrated reckless disregard for human life inconsistent with the responsible exercise of the rights herein affirmed.</w:t>
+        <w:t>ny citizen proven in a court of law to have negligently caused death or serious injury through the use of a firearm, outside the reasonable bounds of lawful self-defence, shall be liable to severe penalty, including imprisonment for a term of not less than ten years, forfeiture of arms privileges for life, and civil restitution to victims or their families as determined by the court. Such negligence shall be established only upon proof beyond a reasonable doubt that the citizen’s actions demonstrated reckless disregard for human life inconsistent with the responsible exercise of the rights herein affirmed.</w:t>
       </w:r>
     </w:p>
     <w:p>
@@ -7268,7 +7238,6 @@
     </w:p>
     <w:p>
       <w:r>
-        <w:lastRenderedPageBreak/>
         <w:t>Precis:</w:t>
       </w:r>
     </w:p>
@@ -7297,11 +7266,7 @@
         <w:t xml:space="preserve">, </w:t>
       </w:r>
       <w:r>
-        <w:t xml:space="preserve">aligns with meritocratic principles by tying access to demonstrated competence via straightforward safety courses, while restricting non-citizens to limited uses under provincial oversight, thereby preserving demographic continuity and high-trust societal norms inherited from European founders. This framework prevents abuses such as arbitrary denials or burdensome regulations that have historically disarmed law-abiding citizens, ensuring that permits are granted without fees or undue hurdles and that transport and supervised use remain unqualified. By presuming the lawfulness of lethal force in defense of life, integrity, or property without a duty to retreat, it shifts the burden to the state in prosecutions, deterring crimes like home invasions or felonious assaults that exploit vulnerability, and fostering a culture where merit is rewarded through responsible stewardship of power. This </w:t>
-      </w:r>
-      <w:r>
-        <w:lastRenderedPageBreak/>
-        <w:t xml:space="preserve">modern adaptation honors the European legacy of resilient communities, incorporating safeguards against misuse while promoting training that builds communal defense capabilities, thus shielding the </w:t>
+        <w:t xml:space="preserve">aligns with meritocratic principles by tying access to demonstrated competence via straightforward safety courses, while restricting non-citizens to limited uses under provincial oversight, thereby preserving demographic continuity and high-trust societal norms inherited from European founders. This framework prevents abuses such as arbitrary denials or burdensome regulations that have historically disarmed law-abiding citizens, ensuring that permits are granted without fees or undue hurdles and that transport and supervised use remain unqualified. By presuming the lawfulness of lethal force in defense of life, integrity, or property without a duty to retreat, it shifts the burden to the state in prosecutions, deterring crimes like home invasions or felonious assaults that exploit vulnerability, and fostering a culture where merit is rewarded through responsible stewardship of power. This modern adaptation honors the European legacy of resilient communities, incorporating safeguards against misuse while promoting training that builds communal defense capabilities, thus shielding the </w:t>
       </w:r>
       <w:r>
         <w:t>Dominion</w:t>
@@ -7363,7 +7328,6 @@
       <w:bookmarkStart w:id="80" w:name="_Toc215665035"/>
       <w:bookmarkStart w:id="81" w:name="_Toc229835208"/>
       <w:r>
-        <w:lastRenderedPageBreak/>
         <w:t xml:space="preserve">Article </w:t>
       </w:r>
       <w:r>
@@ -7488,7 +7452,6 @@
         <w:ind w:left="357" w:hanging="357"/>
       </w:pPr>
       <w:r>
-        <w:lastRenderedPageBreak/>
         <w:t>6.</w:t>
       </w:r>
       <w:r>
@@ -7562,11 +7525,7 @@
         <w:t>or any</w:t>
       </w:r>
       <w:r>
-        <w:t xml:space="preserve"> other entity may mandate, coerce, penalize, or condition any licence, permit, sale, transport, exhibition, or commercial activity upon the vaccination, pharmaceutical treatment, or any other medical intervention performed or refused upon pets, livestock, or domestic animals. No State or corporate program of medical intervention shall target wildlife populations. Any claim that a specific animal medical intervention is necessary for commerce, food security, or public policy must rest upon transparent, localized, and independently verifiable evidence of actual and imminent threat. All such claims remain subject to challenge, review, and potential nationwide suspension through the Petition of Redress procedures established in Article 2. No form of discrimination against animals or their owners may arise from medical compliance. All existing statutes, regulations, and </w:t>
-      </w:r>
-      <w:r>
-        <w:lastRenderedPageBreak/>
-        <w:t>policies compelling animal medical treatment are abolished.</w:t>
+        <w:t xml:space="preserve"> other entity may mandate, coerce, penalize, or condition any licence, permit, sale, transport, exhibition, or commercial activity upon the vaccination, pharmaceutical treatment, or any other medical intervention performed or refused upon pets, livestock, or domestic animals. No State or corporate program of medical intervention shall target wildlife populations. Any claim that a specific animal medical intervention is necessary for commerce, food security, or public policy must rest upon transparent, localized, and independently verifiable evidence of actual and imminent threat. All such claims remain subject to challenge, review, and potential nationwide suspension through the Petition of Redress procedures established in Article 2. No form of discrimination against animals or their owners may arise from medical compliance. All existing statutes, regulations, and policies compelling animal medical treatment are abolished.</w:t>
       </w:r>
       <w:r>
         <w:t xml:space="preserve"> Any person or entity found</w:t>
@@ -7615,7 +7574,6 @@
     </w:p>
     <w:p>
       <w:r>
-        <w:lastRenderedPageBreak/>
         <w:t>Precis:</w:t>
       </w:r>
     </w:p>
@@ -7695,11 +7653,7 @@
         <w:t>’</w:t>
       </w:r>
       <w:r>
-        <w:t xml:space="preserve">s medical care without state override, it draws from European familial traditions of guardianship, countering modern </w:t>
-      </w:r>
-      <w:r>
-        <w:lastRenderedPageBreak/>
-        <w:t xml:space="preserve">perils such as ideological indoctrination in schools or hospitals that could erode family integrity. This structure not only shields practitioners and patients but also fortifies national health, addressing twenty-first-century threats like bioengineering ethics or pandemic overreach that might otherwise undermine the </w:t>
+        <w:t xml:space="preserve">s medical care without state override, it draws from European familial traditions of guardianship, countering modern perils such as ideological indoctrination in schools or hospitals that could erode family integrity. This structure not only shields practitioners and patients but also fortifies national health, addressing twenty-first-century threats like bioengineering ethics or pandemic overreach that might otherwise undermine the </w:t>
       </w:r>
       <w:r>
         <w:t>Dominion</w:t>
@@ -7753,11 +7707,7 @@
     </w:p>
     <w:p>
       <w:r>
-        <w:t xml:space="preserve">Together, these protections accelerate discovery of effective healing modalities through open inquiry, reject the commodification of the body, and position </w:t>
-      </w:r>
-      <w:r>
-        <w:lastRenderedPageBreak/>
-        <w:t xml:space="preserve">natural health as the preferred foundation for national well-being, ensuring the </w:t>
+        <w:t xml:space="preserve">Together, these protections accelerate discovery of effective healing modalities through open inquiry, reject the commodification of the body, and position natural health as the preferred foundation for national well-being, ensuring the </w:t>
       </w:r>
       <w:r>
         <w:t>Dominion</w:t>
@@ -7786,7 +7736,6 @@
       <w:bookmarkStart w:id="83" w:name="_Toc215665036"/>
       <w:bookmarkStart w:id="84" w:name="_Toc229835209"/>
       <w:r>
-        <w:lastRenderedPageBreak/>
         <w:t xml:space="preserve">Article </w:t>
       </w:r>
       <w:r>
@@ -7869,11 +7818,7 @@
         <w:t>this Article</w:t>
       </w:r>
       <w:r>
-        <w:t xml:space="preserve"> that is proven, beyond reasonable doubt, to have been made with knowledge of its falsity and with specific intent to inflict harm, legal jeopardy, or reputational destruction upon an innocent person, shall subject the accuser to the identical penalties prescribed for the crime falsely alleged, including death by firing squad where that penalty applies to the underlying offence. The same accelerated timelines (no bail, trial within thirty days, final determination within sixty days, execution within seven </w:t>
-      </w:r>
-      <w:r>
-        <w:lastRenderedPageBreak/>
-        <w:t xml:space="preserve">days) shall govern such proceedings. Public officials, prosecutors, or child-protection agents who knowingly advance or conceal such false accusations shall additionally face personal liability for treble damages, permanent disqualification from public service, and prosecution for deprivation of rights under colour of law. Honest error, good-faith belief, or negligent misstatement shall constitute an absolute defence; the burden of proving malice rests entirely on the accused or the </w:t>
+        <w:t xml:space="preserve"> that is proven, beyond reasonable doubt, to have been made with knowledge of its falsity and with specific intent to inflict harm, legal jeopardy, or reputational destruction upon an innocent person, shall subject the accuser to the identical penalties prescribed for the crime falsely alleged, including death by firing squad where that penalty applies to the underlying offence. The same accelerated timelines (no bail, trial within thirty days, final determination within sixty days, execution within seven days) shall govern such proceedings. Public officials, prosecutors, or child-protection agents who knowingly advance or conceal such false accusations shall additionally face personal liability for treble damages, permanent disqualification from public service, and prosecution for deprivation of rights under colour of law. Honest error, good-faith belief, or negligent misstatement shall constitute an absolute defence; the burden of proving malice rests entirely on the accused or the </w:t>
       </w:r>
       <w:r>
         <w:t>Dominion</w:t>
@@ -7974,11 +7919,7 @@
         <w:t>Dominion</w:t>
       </w:r>
       <w:r>
-        <w:t xml:space="preserve"> shall be treated as human trafficking, punishable under the fullest extent of the law. The State recognises that </w:t>
-      </w:r>
-      <w:r>
-        <w:lastRenderedPageBreak/>
-        <w:t xml:space="preserve">every child has the inviolable right to be raised, wherever possible, by both a mother and a father united in marriage. </w:t>
+        <w:t xml:space="preserve"> shall be treated as human trafficking, punishable under the fullest extent of the law. The State recognises that every child has the inviolable right to be raised, wherever possible, by both a mother and a father united in marriage. </w:t>
       </w:r>
     </w:p>
     <w:p>
@@ -8124,7 +8065,6 @@
         <w:ind w:left="720" w:hanging="360"/>
       </w:pPr>
       <w:r>
-        <w:lastRenderedPageBreak/>
         <w:t>a)</w:t>
       </w:r>
       <w:r>
@@ -8188,7 +8128,6 @@
     </w:p>
     <w:p>
       <w:r>
-        <w:lastRenderedPageBreak/>
         <w:t>Precis:</w:t>
       </w:r>
     </w:p>
@@ -8241,11 +8180,7 @@
         <w:t>biological resilience</w:t>
       </w:r>
       <w:r>
-        <w:t xml:space="preserve">, while adoption and guardianship rules prioritize stable, heterosexual married couples to provide the optimal environment of mother-father guidance, treating surrogacy as human trafficking to uphold dignity. Single-sex spaces remain inviolate based on birth-recorded biology, with felony penalties for violations to protect privacy and fairness in sports, shelters, and facilities, drawing from European heritage norms of segregated protections that foster safety and merit-based competition. By mandating severe punishments like ten-year minimums for facilitators and life imprisonment for artificial conception crimes, it deters </w:t>
-      </w:r>
-      <w:r>
-        <w:lastRenderedPageBreak/>
-        <w:t xml:space="preserve">abuses that have historically fragmented societies, incorporating humanitarian exceptions for existing children via merit-evaluated tribunals to balance compassion with national integrity. This robust framework not only safeguards minors but also reinforces familial bonds, addressing modern perils such as bioethical overreach or ideological capture in education that could erode the </w:t>
+        <w:t xml:space="preserve">, while adoption and guardianship rules prioritize stable, heterosexual married couples to provide the optimal environment of mother-father guidance, treating surrogacy as human trafficking to uphold dignity. Single-sex spaces remain inviolate based on birth-recorded biology, with felony penalties for violations to protect privacy and fairness in sports, shelters, and facilities, drawing from European heritage norms of segregated protections that foster safety and merit-based competition. By mandating severe punishments like ten-year minimums for facilitators and life imprisonment for artificial conception crimes, it deters abuses that have historically fragmented societies, incorporating humanitarian exceptions for existing children via merit-evaluated tribunals to balance compassion with national integrity. This robust framework not only safeguards minors but also reinforces familial bonds, addressing modern perils such as bioethical overreach or ideological capture in education that could erode the </w:t>
       </w:r>
       <w:r>
         <w:t>Dominion</w:t>
@@ -8305,7 +8240,6 @@
       <w:bookmarkStart w:id="86" w:name="_Toc215665037"/>
       <w:bookmarkStart w:id="87" w:name="_Toc229835210"/>
       <w:r>
-        <w:lastRenderedPageBreak/>
         <w:t xml:space="preserve">Article </w:t>
       </w:r>
       <w:r>
@@ -8515,7 +8449,6 @@
     </w:p>
     <w:p>
       <w:r>
-        <w:lastRenderedPageBreak/>
         <w:t>Precis:</w:t>
       </w:r>
     </w:p>
@@ -8574,11 +8507,7 @@
         <w:t xml:space="preserve">, </w:t>
       </w:r>
       <w:r>
-        <w:t xml:space="preserve">balance compassion with accountability, while post-first-trimester registration enables state-facilitated adoption or paternal custody, empowering biological fathers with absolute rights unless proven unfit. This framework aligns with meritocratic principles by favoring competent guardianship and treating the killing of a pregnant woman as double murder from conception, deterring violent crimes that target vulnerable families, and providing safe, anonymous surrender of children at any age without stigma to encourage responsible alternatives. By classifying unauthorized terminations of viable fetuses as murder, it incorporates generous provisions for surrender to eliminate excuses for harm, drawing from European familial norms that emphasize paternal involvement and child welfare over individual convenience. This comprehensive approach not only upholds national vitality but also </w:t>
-      </w:r>
-      <w:r>
-        <w:lastRenderedPageBreak/>
-        <w:t xml:space="preserve">counters twenty-first-century challenges like declining birthrates or bioethical exploitation that could undermine the </w:t>
+        <w:t xml:space="preserve">balance compassion with accountability, while post-first-trimester registration enables state-facilitated adoption or paternal custody, empowering biological fathers with absolute rights unless proven unfit. This framework aligns with meritocratic principles by favoring competent guardianship and treating the killing of a pregnant woman as double murder from conception, deterring violent crimes that target vulnerable families, and providing safe, anonymous surrender of children at any age without stigma to encourage responsible alternatives. By classifying unauthorized terminations of viable fetuses as murder, it incorporates generous provisions for surrender to eliminate excuses for harm, drawing from European familial norms that emphasize paternal involvement and child welfare over individual convenience. This comprehensive approach not only upholds national vitality but also counters twenty-first-century challenges like declining birthrates or bioethical exploitation that could undermine the </w:t>
       </w:r>
       <w:r>
         <w:t>Dominion</w:t>
@@ -8629,7 +8558,6 @@
       <w:bookmarkStart w:id="89" w:name="_Toc215665038"/>
       <w:bookmarkStart w:id="90" w:name="_Toc229835211"/>
       <w:r>
-        <w:lastRenderedPageBreak/>
         <w:t xml:space="preserve">Article 7 </w:t>
       </w:r>
       <w:r>
@@ -8745,7 +8673,6 @@
     </w:p>
     <w:p>
       <w:r>
-        <w:lastRenderedPageBreak/>
         <w:t>Precis:</w:t>
       </w:r>
     </w:p>
@@ -8767,11 +8694,7 @@
     </w:p>
     <w:p>
       <w:r>
-        <w:t xml:space="preserve">Article 7 prohibits all public manifestation, propagation, or institutional establishment of religions and ideological systems foreign to the European peoples, confining them strictly to private belief and banning proselytism or organisational infrastructure, thereby preventing cultural fragmentation, social discord, and subversive influences that could undermine unity, public safety, and merit-based governance. As an act of historic reconciliation, it extends equivalent protections to the traditional spiritual practices of pre-Confederation Indian inhabitants for grandfathered citizens and descendants, </w:t>
-      </w:r>
-      <w:r>
-        <w:lastRenderedPageBreak/>
-        <w:t xml:space="preserve">integrating these elements without expansion or public subsidy while maintaining demographic continuity. By anchoring protected freedoms in verifiable European roots and explicitly providing for authentic future developments, Article 7 fortifies the </w:t>
+        <w:t xml:space="preserve">Article 7 prohibits all public manifestation, propagation, or institutional establishment of religions and ideological systems foreign to the European peoples, confining them strictly to private belief and banning proselytism or organisational infrastructure, thereby preventing cultural fragmentation, social discord, and subversive influences that could undermine unity, public safety, and merit-based governance. As an act of historic reconciliation, it extends equivalent protections to the traditional spiritual practices of pre-Confederation Indian inhabitants for grandfathered citizens and descendants, integrating these elements without expansion or public subsidy while maintaining demographic continuity. By anchoring protected freedoms in verifiable European roots and explicitly providing for authentic future developments, Article 7 fortifies the </w:t>
       </w:r>
       <w:r>
         <w:t>Dominion</w:t>
@@ -8801,7 +8724,6 @@
       <w:bookmarkStart w:id="92" w:name="_Toc215665039"/>
       <w:bookmarkStart w:id="93" w:name="_Toc229835212"/>
       <w:r>
-        <w:lastRenderedPageBreak/>
         <w:t xml:space="preserve">Article </w:t>
       </w:r>
       <w:r>
@@ -8938,7 +8860,6 @@
         <w:t xml:space="preserve">priority shall be given to individuals of proven European descent who demonstrate high merit, good character, and willingness to assimilate fully into the historic culture and values of the </w:t>
       </w:r>
       <w:r>
-        <w:lastRenderedPageBreak/>
         <w:t>Dominion</w:t>
       </w:r>
       <w:r>
@@ -9092,7 +9013,6 @@
         <w:contextualSpacing w:val="0"/>
       </w:pPr>
       <w:r>
-        <w:lastRenderedPageBreak/>
         <w:t xml:space="preserve">Corporations or entities convicted of paying or facilitating such bribes shall have their charter or licence to operate in the </w:t>
       </w:r>
       <w:r>
@@ -9208,7 +9128,6 @@
         <w:rPr>
           <w:lang w:eastAsia="en-CA"/>
         </w:rPr>
-        <w:lastRenderedPageBreak/>
         <w:t>Precis:</w:t>
       </w:r>
     </w:p>
@@ -9269,11 +9188,7 @@
         <w:t>B</w:t>
       </w:r>
       <w:r>
-        <w:t xml:space="preserve">y prioritizing European-descended immigrants of exceptional merit while strictly limiting non-European entry, Article 8 addresses the perils of </w:t>
-      </w:r>
-      <w:r>
-        <w:lastRenderedPageBreak/>
-        <w:t xml:space="preserve">demographic shifts that could overwhelm infrastructure, strain social cohesion, and invite cultural conflicts incompatible with the </w:t>
+        <w:t xml:space="preserve">y prioritizing European-descended immigrants of exceptional merit while strictly limiting non-European entry, Article 8 addresses the perils of demographic shifts that could overwhelm infrastructure, strain social cohesion, and invite cultural conflicts incompatible with the </w:t>
       </w:r>
       <w:r>
         <w:t>Dominion</w:t>
@@ -9323,7 +9238,6 @@
       <w:bookmarkStart w:id="95" w:name="_Toc215665040"/>
       <w:bookmarkStart w:id="96" w:name="_Toc229835213"/>
       <w:r>
-        <w:lastRenderedPageBreak/>
         <w:t xml:space="preserve">Article </w:t>
       </w:r>
       <w:r>
@@ -9601,7 +9515,6 @@
         <w:ind w:left="720" w:hanging="357"/>
       </w:pPr>
       <w:r>
-        <w:lastRenderedPageBreak/>
         <w:t>e)</w:t>
       </w:r>
       <w:r>
@@ -9793,11 +9706,7 @@
         <w:t>Indian</w:t>
       </w:r>
       <w:r>
-        <w:t xml:space="preserve"> or Métis citizenship categories may ever be created, and all separate legal status, reserves, and race-based programmes are abolished as per Article 8. On the tenth anniversary of ratification, all </w:t>
-      </w:r>
-      <w:r>
-        <w:lastRenderedPageBreak/>
-        <w:t xml:space="preserve">administrative designations in the National Registry of Citizens that identify citizens as having been granted citizenship under </w:t>
+        <w:t xml:space="preserve"> or Métis citizenship categories may ever be created, and all separate legal status, reserves, and race-based programmes are abolished as per Article 8. On the tenth anniversary of ratification, all administrative designations in the National Registry of Citizens that identify citizens as having been granted citizenship under </w:t>
       </w:r>
       <w:r>
         <w:t xml:space="preserve">section </w:t>
@@ -9933,7 +9842,6 @@
         <w:ind w:left="1080" w:hanging="360"/>
       </w:pPr>
       <w:r>
-        <w:lastRenderedPageBreak/>
         <w:t>i)</w:t>
       </w:r>
       <w:r>
@@ -10108,7 +10016,6 @@
         <w:ind w:left="720" w:hanging="360"/>
       </w:pPr>
       <w:r>
-        <w:lastRenderedPageBreak/>
         <w:t>a)</w:t>
       </w:r>
       <w:r>
@@ -10369,7 +10276,6 @@
         <w:ind w:left="1080" w:hanging="360"/>
       </w:pPr>
       <w:r>
-        <w:lastRenderedPageBreak/>
         <w:t>i)</w:t>
       </w:r>
       <w:r>
@@ -10687,7 +10593,6 @@
         <w:ind w:left="720" w:hanging="360"/>
       </w:pPr>
       <w:r>
-        <w:lastRenderedPageBreak/>
         <w:t>iv)</w:t>
       </w:r>
       <w:r>
@@ -10794,11 +10699,7 @@
         <w:tab/>
       </w:r>
       <w:r>
-        <w:t xml:space="preserve">Permanent non-citizen residents enjoy all rights and protections enumerated in the Charter of Rights and Freedoms except political rights, the franchise (Article 16), eligibility for public office or employment in the public service (Article 14), adoption or </w:t>
-      </w:r>
-      <w:r>
-        <w:lastRenderedPageBreak/>
-        <w:t>guardianship of citizen children (Article 5), and any right to transmit citizenship to offspring. They are subject to national preference in employment, housing allocation, and public benefits (Article 8) and to the demographic caps of this Article. Once the 90 % European threshold is certified by the Registrar, further non-European immigration ceases except for the exceptional cases in Article 8.4; existing permanent residents remain indefinitely unless convicted of felony or voluntary departure.</w:t>
+        <w:t>Permanent non-citizen residents enjoy all rights and protections enumerated in the Charter of Rights and Freedoms except political rights, the franchise (Article 16), eligibility for public office or employment in the public service (Article 14), adoption or guardianship of citizen children (Article 5), and any right to transmit citizenship to offspring. They are subject to national preference in employment, housing allocation, and public benefits (Article 8) and to the demographic caps of this Article. Once the 90 % European threshold is certified by the Registrar, further non-European immigration ceases except for the exceptional cases in Article 8.4; existing permanent residents remain indefinitely unless convicted of felony or voluntary departure.</w:t>
       </w:r>
     </w:p>
     <w:p>
@@ -10952,7 +10853,6 @@
         <w:ind w:left="1440" w:hanging="360"/>
       </w:pPr>
       <w:r>
-        <w:lastRenderedPageBreak/>
         <w:t>(ii)</w:t>
       </w:r>
       <w:r>
@@ -11060,7 +10960,6 @@
     </w:p>
     <w:p>
       <w:r>
-        <w:lastRenderedPageBreak/>
         <w:t xml:space="preserve">Precis: </w:t>
       </w:r>
     </w:p>
@@ -11093,11 +10992,7 @@
     </w:p>
     <w:p>
       <w:r>
-        <w:t xml:space="preserve">Centralised under a constitutionally shielded Registrar of unmixed European descent, appointed for a single 15-year term by unanimous Supreme Court vote, are two inviolable national registries: the National Registry of Citizens and the National Registry of Qualified Experts. Both are secured by extraordinary redundant measures such as encrypted digital ledgers, immutable paper archives, millennial-duration physical media, and additional forms designed to survive technological collapse, sabotage, or catastrophe. Annual ethnic composition statistics are published, yet the Citizen Registry contains </w:t>
-      </w:r>
-      <w:r>
-        <w:lastRenderedPageBreak/>
-        <w:t>only minimal data essential to prove living citizenship and descent, explicitly forbidding expansion into social-credit fields.</w:t>
+        <w:t>Centralised under a constitutionally shielded Registrar of unmixed European descent, appointed for a single 15-year term by unanimous Supreme Court vote, are two inviolable national registries: the National Registry of Citizens and the National Registry of Qualified Experts. Both are secured by extraordinary redundant measures such as encrypted digital ledgers, immutable paper archives, millennial-duration physical media, and additional forms designed to survive technological collapse, sabotage, or catastrophe. Annual ethnic composition statistics are published, yet the Citizen Registry contains only minimal data essential to prove living citizenship and descent, explicitly forbidding expansion into social-credit fields.</w:t>
       </w:r>
     </w:p>
     <w:p>
@@ -11135,7 +11030,6 @@
       <w:bookmarkStart w:id="98" w:name="_Toc215665041"/>
       <w:bookmarkStart w:id="99" w:name="_Toc229835214"/>
       <w:r>
-        <w:lastRenderedPageBreak/>
         <w:t>Article 10</w:t>
       </w:r>
       <w:r>
@@ -11265,11 +11159,7 @@
         <w:t>Dominion</w:t>
       </w:r>
       <w:r>
-        <w:t xml:space="preserve"> and the recognised provincial flags may be flown on any public building, school, or government-funded </w:t>
-      </w:r>
-      <w:r>
-        <w:lastRenderedPageBreak/>
-        <w:t>institution. No foreign national flag, supranational flag, ideological banner, or corporate logo may be displayed on public property or above the national or provincial flag at any time.</w:t>
+        <w:t xml:space="preserve"> and the recognised provincial flags may be flown on any public building, school, or government-funded institution. No foreign national flag, supranational flag, ideological banner, or corporate logo may be displayed on public property or above the national or provincial flag at any time.</w:t>
       </w:r>
       <w:r>
         <w:t xml:space="preserve"> Violation of this mandate shall result in three years</w:t>
@@ -11292,7 +11182,6 @@
     </w:p>
     <w:p>
       <w:r>
-        <w:lastRenderedPageBreak/>
         <w:t>Precis:</w:t>
       </w:r>
     </w:p>
@@ -11341,11 +11230,7 @@
         <w:t>’</w:t>
       </w:r>
       <w:r>
-        <w:t xml:space="preserve">s sovereign break from imperial remnants, </w:t>
-      </w:r>
-      <w:r>
-        <w:lastRenderedPageBreak/>
-        <w:t>reinforcing national pride and unity while warding off foreign or ideological encroachments on public spaces. This provision addresses contemporary perils such as corporate branding or supranational symbols infiltrating state institutions, which could undermine meritocratic values by prioritizing external loyalties over domestic achievement. By limiting flags on public property to national and provincial emblems, Article 10 secures the freedom of symbolic expression for private citizens while preventing the crimes of propaganda dissemination and visual pollution that erode public trust. In protecting these elements for the European posterity, it ensures Canada remains a resilient meritocracy, equipped to navigate future technological and geopolitical challenges without sacrificing the cultural foundations that enable true liberty and innovation.</w:t>
+        <w:t>s sovereign break from imperial remnants, reinforcing national pride and unity while warding off foreign or ideological encroachments on public spaces. This provision addresses contemporary perils such as corporate branding or supranational symbols infiltrating state institutions, which could undermine meritocratic values by prioritizing external loyalties over domestic achievement. By limiting flags on public property to national and provincial emblems, Article 10 secures the freedom of symbolic expression for private citizens while preventing the crimes of propaganda dissemination and visual pollution that erode public trust. In protecting these elements for the European posterity, it ensures Canada remains a resilient meritocracy, equipped to navigate future technological and geopolitical challenges without sacrificing the cultural foundations that enable true liberty and innovation.</w:t>
       </w:r>
     </w:p>
     <w:p>
@@ -11368,7 +11253,6 @@
       <w:bookmarkStart w:id="101" w:name="_Toc215665042"/>
       <w:bookmarkStart w:id="102" w:name="_Toc229835215"/>
       <w:r>
-        <w:lastRenderedPageBreak/>
         <w:t xml:space="preserve">Article </w:t>
       </w:r>
       <w:r>
@@ -11511,11 +11395,7 @@
         <w:tab/>
       </w:r>
       <w:r>
-        <w:t xml:space="preserve">No citizen challenge shall stay any operational order, or portion thereof, that the executive certifies in writing is immediately necessary to prevent loss of human life or catastrophic destruction of inhabited </w:t>
-      </w:r>
-      <w:r>
-        <w:lastRenderedPageBreak/>
-        <w:t>property during an active natural disaster (wildfire, flood, earthquake, volcanic eruption, hurricane, or equivalent event)</w:t>
+        <w:t>No citizen challenge shall stay any operational order, or portion thereof, that the executive certifies in writing is immediately necessary to prevent loss of human life or catastrophic destruction of inhabited property during an active natural disaster (wildfire, flood, earthquake, volcanic eruption, hurricane, or equivalent event)</w:t>
       </w:r>
       <w:r>
         <w:t xml:space="preserve"> or invasion</w:t>
@@ -11623,7 +11503,6 @@
     </w:p>
     <w:p>
       <w:r>
-        <w:lastRenderedPageBreak/>
         <w:t xml:space="preserve">Precis: </w:t>
       </w:r>
     </w:p>
@@ -11673,11 +11552,7 @@
         <w:t xml:space="preserve">, </w:t>
       </w:r>
       <w:r>
-        <w:t xml:space="preserve">while preserving the European heritage of self-reliant citizenry capable of meeting existential threats without surrendering liberty. Meritocratic </w:t>
-      </w:r>
-      <w:r>
-        <w:lastRenderedPageBreak/>
-        <w:t>governance demands that power remain transparent, temporally bounded, and accountable, ensuring excellence prevails over panic and that posterity inherits a nation where freedom is never negotiable, even amid catastrophe.</w:t>
+        <w:t>while preserving the European heritage of self-reliant citizenry capable of meeting existential threats without surrendering liberty. Meritocratic governance demands that power remain transparent, temporally bounded, and accountable, ensuring excellence prevails over panic and that posterity inherits a nation where freedom is never negotiable, even amid catastrophe.</w:t>
       </w:r>
     </w:p>
     <w:p>
@@ -11700,7 +11575,6 @@
       <w:bookmarkStart w:id="104" w:name="_Toc215665043"/>
       <w:bookmarkStart w:id="105" w:name="_Toc229835216"/>
       <w:r>
-        <w:lastRenderedPageBreak/>
         <w:t xml:space="preserve">Article </w:t>
       </w:r>
       <w:r>
@@ -11868,7 +11742,6 @@
         <w:ind w:left="360"/>
       </w:pPr>
       <w:r>
-        <w:lastRenderedPageBreak/>
         <w:t xml:space="preserve">This prohibition serves both the protection of other peoples from cultural dissolution caused by incompatible technologies and the self-defence of the European-descended people of Canada against the unpredictable future weaponization or misuse of such advancements against them. Exceptions may be made only by unanimous consent of the National Assembly upon certification by the Special Tribunal of Scientific Review (Article 2) that the transfer poses no material risk to the </w:t>
       </w:r>
       <w:r>
@@ -11901,7 +11774,6 @@
     </w:p>
     <w:p>
       <w:r>
-        <w:lastRenderedPageBreak/>
         <w:t xml:space="preserve">Precis: </w:t>
       </w:r>
     </w:p>
@@ -11953,11 +11825,7 @@
     </w:p>
     <w:p>
       <w:r>
-        <w:t xml:space="preserve">Moreover, by granting the unqualified right to binding referenda, Article 12 democratizes decision-making in a direct, unfiltered manner, safeguarding against legislative gridlock or judicial activism that could stifle innovation or impose unwanted changes in an era of rapid technological advancement. This tool prevents crimes like policy capture by special interests or the imposition of harmful agendas under the guise of expertise, as evidenced by past global events where populations were sidelined on issues of sovereignty and identity. </w:t>
-      </w:r>
-      <w:r>
-        <w:lastRenderedPageBreak/>
-        <w:t xml:space="preserve">In preserving these avenues for popular expression, the Article ensures that the </w:t>
+        <w:t xml:space="preserve">Moreover, by granting the unqualified right to binding referenda, Article 12 democratizes decision-making in a direct, unfiltered manner, safeguarding against legislative gridlock or judicial activism that could stifle innovation or impose unwanted changes in an era of rapid technological advancement. This tool prevents crimes like policy capture by special interests or the imposition of harmful agendas under the guise of expertise, as evidenced by past global events where populations were sidelined on issues of sovereignty and identity. In preserving these avenues for popular expression, the Article ensures that the </w:t>
       </w:r>
       <w:r>
         <w:t>Dominion</w:t>
@@ -11988,7 +11856,6 @@
       <w:bookmarkStart w:id="107" w:name="_Toc215665044"/>
       <w:bookmarkStart w:id="108" w:name="_Toc229835217"/>
       <w:r>
-        <w:lastRenderedPageBreak/>
         <w:t xml:space="preserve">Article </w:t>
       </w:r>
       <w:r>
@@ -12086,7 +11953,6 @@
         <w:ind w:left="357" w:hanging="357"/>
       </w:pPr>
       <w:r>
-        <w:lastRenderedPageBreak/>
         <w:t>5)</w:t>
       </w:r>
       <w:r>
@@ -12225,7 +12091,6 @@
         <w:ind w:left="720" w:hanging="357"/>
       </w:pPr>
       <w:r>
-        <w:lastRenderedPageBreak/>
         <w:t>e)</w:t>
       </w:r>
       <w:r>
@@ -12320,11 +12185,7 @@
         <w:tab/>
       </w:r>
       <w:r>
-        <w:t xml:space="preserve">Question Period is abolished in its current theatrical form. Instead, every Wednesday the Prime Minister and every minister shall appear in person before the House for a maximum of three hours of direct, unscripted questioning by any member. Questions are limited to two minutes; answers </w:t>
-      </w:r>
-      <w:r>
-        <w:lastRenderedPageBreak/>
-        <w:t xml:space="preserve">to four minutes. No points of order, no props, no applause, no prepared talking points. </w:t>
+        <w:t xml:space="preserve">Question Period is abolished in its current theatrical form. Instead, every Wednesday the Prime Minister and every minister shall appear in person before the House for a maximum of three hours of direct, unscripted questioning by any member. Questions are limited to two minutes; answers to four minutes. No points of order, no props, no applause, no prepared talking points. </w:t>
       </w:r>
       <w:r>
         <w:t>Sessions are live-streamed and permanently archived.</w:t>
@@ -12468,11 +12329,7 @@
         <w:tab/>
       </w:r>
       <w:r>
-        <w:t xml:space="preserve">The provinces retain exclusive jurisdiction over education, health, municipal institutions, property and civil rights, natural resources within their boundaries, and all matters of a purely local or private nature. All </w:t>
-      </w:r>
-      <w:r>
-        <w:lastRenderedPageBreak/>
-        <w:t>residual powers belong to the national government. No concurrent powers exist except where explicitly stated in this Constitution.</w:t>
+        <w:t>The provinces retain exclusive jurisdiction over education, health, municipal institutions, property and civil rights, natural resources within their boundaries, and all matters of a purely local or private nature. All residual powers belong to the national government. No concurrent powers exist except where explicitly stated in this Constitution.</w:t>
       </w:r>
     </w:p>
     <w:p>
@@ -12599,7 +12456,6 @@
     </w:p>
     <w:p>
       <w:r>
-        <w:lastRenderedPageBreak/>
         <w:t xml:space="preserve">Precis: </w:t>
       </w:r>
     </w:p>
@@ -12693,7 +12549,6 @@
       <w:bookmarkStart w:id="110" w:name="_Toc215665045"/>
       <w:bookmarkStart w:id="111" w:name="_Toc229835218"/>
       <w:r>
-        <w:lastRenderedPageBreak/>
         <w:t xml:space="preserve">Article </w:t>
       </w:r>
       <w:r>
@@ -12866,7 +12721,6 @@
         <w:ind w:left="360" w:hanging="357"/>
       </w:pPr>
       <w:r>
-        <w:lastRenderedPageBreak/>
         <w:t>5.</w:t>
       </w:r>
       <w:r>
@@ -12913,7 +12767,10 @@
         <w:tab/>
       </w:r>
       <w:r>
-        <w:t>Any public servant, corporate officer acting under colour of law, or judge found guilty of corruption, gross negligence, waste of public funds, insider trading, financial fraud, collusion to offshore Canadian jobs, or the awarding of contracts or employment on the basis of factors other than merit shall be:</w:t>
+        <w:t xml:space="preserve">Any public servant, corporate officer acting under </w:t>
+      </w:r>
+      <w:r>
+        <w:t>colour of law, or judge found guilty of corruption, gross negligence, waste of public funds, insider trading, financial fraud, collusion to offshore Canadian jobs, or the awarding of contracts or employment on the basis of factors other than merit shall be:</w:t>
       </w:r>
     </w:p>
     <w:p>
@@ -13092,7 +12949,6 @@
         <w:contextualSpacing w:val="0"/>
       </w:pPr>
       <w:r>
-        <w:lastRenderedPageBreak/>
         <w:t>Sexual offences against minors, any non-consensual sexual crime committed by a public servant (past or present), or possession of child sexual abuse material by a public servant shall be punished by death by firing squad under the provisions of Article 5 and Article 15, in addition to automatic removal and permanent disqualification.</w:t>
       </w:r>
       <w:r>
@@ -13201,11 +13057,7 @@
         <w:t>business</w:t>
       </w:r>
       <w:r>
-        <w:t xml:space="preserve">-class equivalents are prohibited. All claims </w:t>
-      </w:r>
-      <w:r>
-        <w:lastRenderedPageBreak/>
-        <w:t>must be publicly itemized and posted online within seven days. Violation constitutes waste of public funds under section 6 and triggers the full penalties therein.</w:t>
+        <w:t>-class equivalents are prohibited. All claims must be publicly itemized and posted online within seven days. Violation constitutes waste of public funds under section 6 and triggers the full penalties therein.</w:t>
       </w:r>
     </w:p>
     <w:p/>
@@ -13216,7 +13068,6 @@
     </w:p>
     <w:p>
       <w:r>
-        <w:lastRenderedPageBreak/>
         <w:t xml:space="preserve">Precis: </w:t>
       </w:r>
     </w:p>
@@ -13296,7 +13147,6 @@
       <w:bookmarkStart w:id="113" w:name="_Toc215665046"/>
       <w:bookmarkStart w:id="114" w:name="_Toc229835219"/>
       <w:r>
-        <w:lastRenderedPageBreak/>
         <w:t xml:space="preserve">Article </w:t>
       </w:r>
       <w:r>
@@ -13445,7 +13295,6 @@
         <w:pStyle w:val="ListParagraph"/>
       </w:pPr>
       <w:r>
-        <w:lastRenderedPageBreak/>
         <w:t xml:space="preserve">Provincial superior court judges serve until mandatory retirement at age </w:t>
       </w:r>
       <w:r>
@@ -13511,7 +13360,10 @@
         <w:pStyle w:val="ListParagraph"/>
       </w:pPr>
       <w:r>
-        <w:t xml:space="preserve">The </w:t>
+        <w:t>T</w:t>
+      </w:r>
+      <w:r>
+        <w:t xml:space="preserve">he </w:t>
       </w:r>
       <w:r>
         <w:t>Dominion</w:t>
@@ -13539,7 +13391,10 @@
         <w:pStyle w:val="ListParagraph"/>
       </w:pPr>
       <w:r>
-        <w:t>This section applies to every judge, justice of the peace, parole or release-board member, prosecutor, corrections official, or other person acting under colour of law who orders, recommends, approves, or materially facilitates any Covered Liberty Decision under subsection (c).</w:t>
+        <w:t>T</w:t>
+      </w:r>
+      <w:r>
+        <w:t>his section applies to every judge, justice of the peace, parole or release-board member, prosecutor, corrections official, or other person acting under colour of law who orders, recommends, approves, or materially facilitates any Covered Liberty Decision under subsection (c).</w:t>
       </w:r>
     </w:p>
     <w:p>
@@ -13561,7 +13416,10 @@
         <w:pStyle w:val="ListParagraph"/>
       </w:pPr>
       <w:r>
-        <w:t>A Covered Liberty Decision is any of the following concerning a person charged with, or convicted of, a violent offence, or a Designated High-Harm Offence as defined in subsection (l):</w:t>
+        <w:t>A</w:t>
+      </w:r>
+      <w:r>
+        <w:t xml:space="preserve"> Covered Liberty Decision is any of the following concerning a person charged with, or convicted of, a violent offence, or a Designated High-Harm Offence as defined in subsection (l):</w:t>
       </w:r>
     </w:p>
     <w:p>
@@ -13583,7 +13441,6 @@
         <w:ind w:left="1080" w:hanging="360"/>
       </w:pPr>
       <w:r>
-        <w:lastRenderedPageBreak/>
         <w:t>ii)</w:t>
       </w:r>
       <w:r>
@@ -13654,7 +13511,10 @@
         <w:pStyle w:val="ListParagraph"/>
       </w:pPr>
       <w:r>
-        <w:t>A sentence or disposition is “manifestly inadequate” when it:</w:t>
+        <w:t>A</w:t>
+      </w:r>
+      <w:r>
+        <w:t xml:space="preserve"> sentence or disposition is “manifestly inadequate” when it:</w:t>
       </w:r>
     </w:p>
     <w:p>
@@ -13732,7 +13592,10 @@
         <w:pStyle w:val="ListParagraph"/>
       </w:pPr>
       <w:r>
-        <w:t>Liability under this section is triggered when a person who was the subject of a Covered Liberty Decision or manifestly inadequate sentence later commits, or is lawfully charged with and subsequently convicted of, a violent offence or a Designated High-Harm Offence committed after that decision (the “Subsequent Offence”). Where the principal dies or is otherwise unavailable for trial, the Subsequent Offence may be proved beyond reasonable doubt in the proceedings against the Covered Decision-Maker alone.</w:t>
+        <w:t>L</w:t>
+      </w:r>
+      <w:r>
+        <w:t>iability under this section is triggered when a person who was the subject of a Covered Liberty Decision or manifestly inadequate sentence later commits, or is lawfully charged with and subsequently convicted of, a violent offence or a Designated High-Harm Offence committed after that decision (the “Subsequent Offence”). Where the principal dies or is otherwise unavailable for trial, the Subsequent Offence may be proved beyond reasonable doubt in the proceedings against the Covered Decision-Maker alone.</w:t>
       </w:r>
     </w:p>
     <w:p>
@@ -13754,7 +13617,10 @@
         <w:pStyle w:val="ListParagraph"/>
       </w:pPr>
       <w:r>
-        <w:t>Criminal liability under this section requires that the Covered Decision-Maker acted:</w:t>
+        <w:t>C</w:t>
+      </w:r>
+      <w:r>
+        <w:t>riminal liability under this section requires that the Covered Decision-Maker acted:</w:t>
       </w:r>
     </w:p>
     <w:p>
@@ -13782,7 +13648,10 @@
         <w:tab/>
       </w:r>
       <w:r>
-        <w:t>with wilful blindness to such violation; or</w:t>
+        <w:t xml:space="preserve">with wilful blindness to </w:t>
+      </w:r>
+      <w:r>
+        <w:t>such violation; or</w:t>
       </w:r>
     </w:p>
     <w:p>
@@ -13790,7 +13659,6 @@
         <w:ind w:left="1080" w:hanging="360"/>
       </w:pPr>
       <w:r>
-        <w:lastRenderedPageBreak/>
         <w:t>iii)</w:t>
       </w:r>
       <w:r>
@@ -13805,7 +13673,10 @@
         <w:pStyle w:val="ListParagraph"/>
       </w:pPr>
       <w:r>
-        <w:t>Honest error after documented full compliance with sections 2, 3, and 8(d) and with all mandatory findings required by law is not a criminal offence under this section, but remains subject to removal for misbehaviour or incapacity under section 4 and to civil liability where negligence is proven.</w:t>
+        <w:t>H</w:t>
+      </w:r>
+      <w:r>
+        <w:t>onest error after documented full compliance with sections 2, 3, and 8(d) and with all mandatory findings required by law is not a criminal offence under this section, but remains subject to removal for misbehaviour or incapacity under section 4 and to civil liability where negligence is proven.</w:t>
       </w:r>
     </w:p>
     <w:p>
@@ -13827,7 +13698,10 @@
         <w:pStyle w:val="ListParagraph"/>
       </w:pPr>
       <w:r>
-        <w:t>When a person who was the subject of a Covered Liberty Decision or manifestly inadequate sentence is arrested and charged with a Subsequent Offence that is violent or Designated High-Harm:</w:t>
+        <w:t>W</w:t>
+      </w:r>
+      <w:r>
+        <w:t>hen a person who was the subject of a Covered Liberty Decision or manifestly inadequate sentence is arrested and charged with a Subsequent Offence that is violent or Designated High-Harm:</w:t>
       </w:r>
     </w:p>
     <w:p>
@@ -13905,11 +13779,10 @@
         <w:pStyle w:val="ListParagraph"/>
       </w:pPr>
       <w:r>
-        <w:t xml:space="preserve">A Covered Decision-Maker who, with the mens rea required by subsection (f), made or facilitated a Covered Liberty Decision or imposed a manifestly inadequate sentence, after which a Subsequent Offence is committed, shall be prosecuted as an accessory before the </w:t>
-      </w:r>
-      <w:r>
-        <w:lastRenderedPageBreak/>
-        <w:t>fact to the Subsequent Offence (or under an equivalent statutory offence of reckless judicial endangerment of the public) and, upon conviction by jury beyond reasonable doubt:</w:t>
+        <w:t>A</w:t>
+      </w:r>
+      <w:r>
+        <w:t xml:space="preserve"> Covered Decision-Maker who, with the mens rea required by subsection (f), made or facilitated a Covered Liberty Decision or imposed a manifestly inadequate sentence, after which a Subsequent Offence is committed, shall be prosecuted as an accessory before the fact to the Subsequent Offence (or under an equivalent statutory offence of reckless judicial endangerment of the public) and, upon conviction by jury beyond reasonable doubt:</w:t>
       </w:r>
     </w:p>
     <w:p>
@@ -14027,11 +13900,7 @@
         <w:tab/>
       </w:r>
       <w:r>
-        <w:t xml:space="preserve">Upon a complaint supported by prima facie evidence of a Covered Liberty Decision or manifestly inadequate sentence and a </w:t>
-      </w:r>
-      <w:r>
-        <w:lastRenderedPageBreak/>
-        <w:t>Subsequent Offence, the court shall order an independent prosecutor (who shall not be the office that participated in the original liberty decision) to investigate and, if evidence warrants, to charge within sixty days, or to file public written reasons for declining, which reasons are themselves subject to review by a three-judge panel drawn by lot.</w:t>
+        <w:t>Upon a complaint supported by prima facie evidence of a Covered Liberty Decision or manifestly inadequate sentence and a Subsequent Offence, the court shall order an independent prosecutor (who shall not be the office that participated in the original liberty decision) to investigate and, if evidence warrants, to charge within sixty days, or to file public written reasons for declining, which reasons are themselves subject to review by a three-judge panel drawn by lot.</w:t>
       </w:r>
     </w:p>
     <w:p>
@@ -14073,7 +13942,10 @@
         <w:tab/>
       </w:r>
       <w:r>
-        <w:t>Parole Boards and Collective Decisions. Where a Covered Liberty Decision was made by a multi-member board, every member who voted in favour is a Covered Decision-Maker. Members who voted against and recorded a dissent in writing are not liable under this section for that decision.</w:t>
+        <w:t xml:space="preserve">Parole Boards and Collective Decisions. Where a Covered Liberty Decision was made by a multi-member board, every member who voted in favour is a Covered Decision-Maker. Members who </w:t>
+      </w:r>
+      <w:r>
+        <w:t>voted against and recorded a dissent in writing are not liable under this section for that decision.</w:t>
       </w:r>
     </w:p>
     <w:p>
@@ -14127,11 +13999,7 @@
         <w:t xml:space="preserve"> rape,</w:t>
       </w:r>
       <w:r>
-        <w:t xml:space="preserve"> high treason, and for extreme, provably intentional financial, medical, religious, scientific or any other fraud that directly causes widespread death </w:t>
-      </w:r>
-      <w:r>
-        <w:lastRenderedPageBreak/>
-        <w:t>or irreversible ruin,</w:t>
+        <w:t xml:space="preserve"> high treason, and for extreme, provably intentional financial, medical, religious, scientific or any other fraud that directly causes widespread death or irreversible ruin,</w:t>
       </w:r>
       <w:r>
         <w:t xml:space="preserve"> </w:t>
@@ -14233,7 +14101,6 @@
         <w:ind w:left="714" w:hanging="357"/>
       </w:pPr>
       <w:r>
-        <w:lastRenderedPageBreak/>
         <w:t>d)</w:t>
       </w:r>
       <w:r>
@@ -14356,7 +14223,6 @@
     </w:p>
     <w:p>
       <w:r>
-        <w:lastRenderedPageBreak/>
         <w:t>Prec</w:t>
       </w:r>
       <w:r>
@@ -14398,7 +14264,6 @@
     </w:p>
     <w:p>
       <w:r>
-        <w:lastRenderedPageBreak/>
         <w:t xml:space="preserve">By mandating presumption of innocence, jury trials beyond reasonable doubt, and prohibitions against self-incrimination, Article 15 fortifies the </w:t>
       </w:r>
       <w:r>
@@ -14421,7 +14286,6 @@
       <w:bookmarkStart w:id="116" w:name="_Toc215665047"/>
       <w:bookmarkStart w:id="117" w:name="_Toc229835220"/>
       <w:r>
-        <w:lastRenderedPageBreak/>
         <w:t xml:space="preserve">Article </w:t>
       </w:r>
       <w:r>
@@ -14555,7 +14419,6 @@
         <w:ind w:left="720" w:hanging="360"/>
       </w:pPr>
       <w:r>
-        <w:lastRenderedPageBreak/>
         <w:t>a)</w:t>
       </w:r>
       <w:r>
@@ -14612,7 +14475,6 @@
     </w:p>
     <w:p>
       <w:r>
-        <w:lastRenderedPageBreak/>
         <w:t>Precis:</w:t>
       </w:r>
     </w:p>
@@ -14741,7 +14603,6 @@
       <w:bookmarkStart w:id="119" w:name="_Toc215665048"/>
       <w:bookmarkStart w:id="120" w:name="_Toc229835221"/>
       <w:r>
-        <w:lastRenderedPageBreak/>
         <w:t xml:space="preserve">Article </w:t>
       </w:r>
       <w:r>
@@ -14869,11 +14730,7 @@
         <w:t xml:space="preserve">Benefits are non-means-tested beyond contributions and the clawback. </w:t>
       </w:r>
       <w:r>
-        <w:t xml:space="preserve">If one parent remains home full-time thereafter to raise the couple’s minor </w:t>
-      </w:r>
-      <w:r>
-        <w:lastRenderedPageBreak/>
-        <w:t>children until the youngest child reaches the age of fourteen, that parent qualifies for the means-tested support under Article 27, section 4, assessed against total family assets and income, for the duration of that period.</w:t>
+        <w:t>If one parent remains home full-time thereafter to raise the couple’s minor children until the youngest child reaches the age of fourteen, that parent qualifies for the means-tested support under Article 27, section 4, assessed against total family assets and income, for the duration of that period.</w:t>
       </w:r>
     </w:p>
     <w:p>
@@ -15003,11 +14860,7 @@
         <w:tab/>
       </w:r>
       <w:r>
-        <w:t xml:space="preserve">No individual may receive more than one form of support under this Article or related provisions (including parental leave benefits or ongoing family-carer support cross-referenced to Article 27, section 4), </w:t>
-      </w:r>
-      <w:r>
-        <w:lastRenderedPageBreak/>
-        <w:t>and each support claim shall apply solely to the care of a single dependent unit, defined as either one infirm relative or the claimant</w:t>
+        <w:t>No individual may receive more than one form of support under this Article or related provisions (including parental leave benefits or ongoing family-carer support cross-referenced to Article 27, section 4), and each support claim shall apply solely to the care of a single dependent unit, defined as either one infirm relative or the claimant</w:t>
       </w:r>
       <w:r>
         <w:t>’</w:t>
@@ -15155,7 +15008,6 @@
         <w:ind w:left="1080" w:hanging="360"/>
       </w:pPr>
       <w:r>
-        <w:lastRenderedPageBreak/>
         <w:t>v)</w:t>
       </w:r>
       <w:r>
@@ -15310,7 +15162,6 @@
         <w:ind w:left="1080" w:hanging="360"/>
       </w:pPr>
       <w:r>
-        <w:lastRenderedPageBreak/>
         <w:t>ii)</w:t>
       </w:r>
       <w:r>
@@ -15479,7 +15330,6 @@
         <w:ind w:left="1080" w:hanging="360"/>
       </w:pPr>
       <w:r>
-        <w:lastRenderedPageBreak/>
         <w:t>ii)</w:t>
       </w:r>
       <w:r>
@@ -15524,7 +15374,6 @@
     </w:p>
     <w:p>
       <w:r>
-        <w:lastRenderedPageBreak/>
         <w:t>Precis:</w:t>
       </w:r>
     </w:p>
@@ -15570,11 +15419,7 @@
         <w:t xml:space="preserve">, </w:t>
       </w:r>
       <w:r>
-        <w:t xml:space="preserve">further shield dependent spouses and children from economic coercion or retaliation. These measures collectively safeguard family integrity against modern abuses of </w:t>
-      </w:r>
-      <w:r>
-        <w:lastRenderedPageBreak/>
-        <w:t>process that turn dissolution into prolonged punishment, promoting instead a society where merit flourishes through stable homes that nurture competent, virtuous posterity.</w:t>
+        <w:t>further shield dependent spouses and children from economic coercion or retaliation. These measures collectively safeguard family integrity against modern abuses of process that turn dissolution into prolonged punishment, promoting instead a society where merit flourishes through stable homes that nurture competent, virtuous posterity.</w:t>
       </w:r>
     </w:p>
     <w:p>
@@ -15595,7 +15440,6 @@
       <w:bookmarkStart w:id="122" w:name="_Toc215665049"/>
       <w:bookmarkStart w:id="123" w:name="_Toc229835222"/>
       <w:r>
-        <w:lastRenderedPageBreak/>
         <w:t>Article 1</w:t>
       </w:r>
       <w:r>
@@ -15758,7 +15602,6 @@
         <w:ind w:left="720" w:hanging="360"/>
       </w:pPr>
       <w:r>
-        <w:lastRenderedPageBreak/>
         <w:t>c)</w:t>
       </w:r>
       <w:r>
@@ -15893,11 +15736,7 @@
         <w:t>’</w:t>
       </w:r>
       <w:r>
-        <w:t xml:space="preserve">s own children as a collective unit. </w:t>
-      </w:r>
-      <w:r>
-        <w:lastRenderedPageBreak/>
-        <w:t>Overlapping claims with other care or assistance provisions, such as those under Article 17 or Article 27, are prohibited.</w:t>
+        <w:t>s own children as a collective unit. Overlapping claims with other care or assistance provisions, such as those under Article 17 or Article 27, are prohibited.</w:t>
       </w:r>
     </w:p>
     <w:p>
@@ -15989,7 +15828,6 @@
         <w:ind w:left="720" w:hanging="360"/>
       </w:pPr>
       <w:r>
-        <w:lastRenderedPageBreak/>
         <w:t>e)</w:t>
       </w:r>
       <w:r>
@@ -16004,7 +15842,6 @@
     </w:p>
     <w:p>
       <w:r>
-        <w:lastRenderedPageBreak/>
         <w:t>Precis:</w:t>
       </w:r>
     </w:p>
@@ -16043,11 +15880,7 @@
     </w:p>
     <w:p>
       <w:r>
-        <w:t xml:space="preserve">Higher education provisions extend meritocratic accountability to universities, transforming them from subsidized credential mills into autonomous centres funded primarily by tuition, endowments, competitive grants, and intellectual property revenue. Public loan guarantees are made conditional: institutions must co-guarantee loans proportional to program-specific graduate employment and income outcomes, assuming liability for persistent </w:t>
-      </w:r>
-      <w:r>
-        <w:lastRenderedPageBreak/>
-        <w:t>underperformance. Admissions remain strictly merit-based on demonstrated ability, without irrelevant quotas. Pure research and foundational disciplines are preserved through internal merit-awarded fellowships and chairs, while mass enrolment in persistently low-viability programs loses public loan eligibility unless privately funded. Fraudulent misrepresentation of outcomes incurs civil and criminal liability, and students retain repayment responsibility except in proven hardship.</w:t>
+        <w:t>Higher education provisions extend meritocratic accountability to universities, transforming them from subsidized credential mills into autonomous centres funded primarily by tuition, endowments, competitive grants, and intellectual property revenue. Public loan guarantees are made conditional: institutions must co-guarantee loans proportional to program-specific graduate employment and income outcomes, assuming liability for persistent underperformance. Admissions remain strictly merit-based on demonstrated ability, without irrelevant quotas. Pure research and foundational disciplines are preserved through internal merit-awarded fellowships and chairs, while mass enrolment in persistently low-viability programs loses public loan eligibility unless privately funded. Fraudulent misrepresentation of outcomes incurs civil and criminal liability, and students retain repayment responsibility except in proven hardship.</w:t>
       </w:r>
     </w:p>
     <w:p>
@@ -16081,7 +15914,6 @@
       <w:bookmarkStart w:id="125" w:name="_Toc215665050"/>
       <w:bookmarkStart w:id="126" w:name="_Toc229835223"/>
       <w:r>
-        <w:lastRenderedPageBreak/>
         <w:t xml:space="preserve">Article </w:t>
       </w:r>
       <w:r>
@@ -16191,11 +16023,7 @@
         <w:tab/>
       </w:r>
       <w:r>
-        <w:t xml:space="preserve">No federal or provincial law, regulation, licence, quota, marketing board, supply-management system, or any other instrument may prohibit or unreasonably restrict the direct sale by family farmers of raw milk and raw-milk products (including cheese, butter, and cream) or their pasteurized equivalents, farm-fresh eggs, meat, poultry, honey, vegetables, fruit, or any other whole, unprocessed food produced on the farm to willing consumers. Simple sanitary guidelines may be issued for the protection of public health, but no pasteurisation mandate, inspection fee regime, </w:t>
-      </w:r>
-      <w:r>
-        <w:lastRenderedPageBreak/>
-        <w:t>production quota, or licensing barrier may be used to suppress or eliminate small-scale or traditional production and direct farm-to-consumer commerce.</w:t>
+        <w:t>No federal or provincial law, regulation, licence, quota, marketing board, supply-management system, or any other instrument may prohibit or unreasonably restrict the direct sale by family farmers of raw milk and raw-milk products (including cheese, butter, and cream) or their pasteurized equivalents, farm-fresh eggs, meat, poultry, honey, vegetables, fruit, or any other whole, unprocessed food produced on the farm to willing consumers. Simple sanitary guidelines may be issued for the protection of public health, but no pasteurisation mandate, inspection fee regime, production quota, or licensing barrier may be used to suppress or eliminate small-scale or traditional production and direct farm-to-consumer commerce.</w:t>
       </w:r>
       <w:r>
         <w:t xml:space="preserve"> </w:t>
@@ -16325,7 +16153,6 @@
     </w:p>
     <w:p>
       <w:r>
-        <w:lastRenderedPageBreak/>
         <w:t xml:space="preserve">Precis: </w:t>
       </w:r>
     </w:p>
@@ -16358,11 +16185,7 @@
         <w:t>Dominion</w:t>
       </w:r>
       <w:r>
-        <w:t xml:space="preserve"> rejects chemical dependence that compromises the biological </w:t>
-      </w:r>
-      <w:r>
-        <w:lastRenderedPageBreak/>
-        <w:t xml:space="preserve">vitality of the founding European peoples and their posterity in favour of agricultural excellence that aligns productivity with the long-term health of the land and the people. The </w:t>
+        <w:t xml:space="preserve"> rejects chemical dependence that compromises the biological vitality of the founding European peoples and their posterity in favour of agricultural excellence that aligns productivity with the long-term health of the land and the people. The </w:t>
       </w:r>
       <w:r>
         <w:t>Dominion</w:t>
@@ -16391,7 +16214,6 @@
       <w:bookmarkStart w:id="128" w:name="_Toc215665051"/>
       <w:bookmarkStart w:id="129" w:name="_Toc229835224"/>
       <w:r>
-        <w:lastRenderedPageBreak/>
         <w:t xml:space="preserve">Article </w:t>
       </w:r>
       <w:r>
@@ -16499,7 +16321,6 @@
         <w:ind w:left="357" w:hanging="357"/>
       </w:pPr>
       <w:r>
-        <w:lastRenderedPageBreak/>
         <w:t>4.</w:t>
       </w:r>
       <w:r>
@@ -16650,11 +16471,7 @@
         <w:tab/>
       </w:r>
       <w:r>
-        <w:t xml:space="preserve">Every nominee must be a citizen of unmixed European descent, born in Canada, with no dual citizenship and no financial or familial ties to </w:t>
-      </w:r>
-      <w:r>
-        <w:lastRenderedPageBreak/>
-        <w:t>any private banking institution in the previous twenty years</w:t>
+        <w:t>Every nominee must be a citizen of unmixed European descent, born in Canada, with no dual citizenship and no financial or familial ties to any private banking institution in the previous twenty years</w:t>
       </w:r>
       <w:r>
         <w:t xml:space="preserve"> nor during tenure of term</w:t>
@@ -16803,7 +16620,6 @@
         <w:ind w:left="357" w:hanging="357"/>
       </w:pPr>
       <w:r>
-        <w:lastRenderedPageBreak/>
         <w:t>12.</w:t>
       </w:r>
       <w:r>
@@ -16917,7 +16733,6 @@
     </w:p>
     <w:p>
       <w:r>
-        <w:lastRenderedPageBreak/>
         <w:t xml:space="preserve">Precis: </w:t>
       </w:r>
     </w:p>
@@ -16957,11 +16772,7 @@
     </w:p>
     <w:p>
       <w:r>
-        <w:t xml:space="preserve">Moreover, by barring entanglements with supranational banking cartels and allowing anonymous private digital cash without restrictions, Article 20 fortifies </w:t>
-      </w:r>
-      <w:r>
-        <w:lastRenderedPageBreak/>
-        <w:t xml:space="preserve">the </w:t>
+        <w:t xml:space="preserve">Moreover, by barring entanglements with supranational banking cartels and allowing anonymous private digital cash without restrictions, Article 20 fortifies the </w:t>
       </w:r>
       <w:r>
         <w:t>Dominion</w:t>
@@ -16995,7 +16806,6 @@
       <w:bookmarkStart w:id="131" w:name="_Toc215665052"/>
       <w:bookmarkStart w:id="132" w:name="_Toc229835225"/>
       <w:r>
-        <w:lastRenderedPageBreak/>
         <w:t xml:space="preserve">Article </w:t>
       </w:r>
       <w:r>
@@ -17119,7 +16929,6 @@
         <w:ind w:left="720" w:hanging="360"/>
       </w:pPr>
       <w:r>
-        <w:lastRenderedPageBreak/>
         <w:t>c)</w:t>
       </w:r>
       <w:r>
@@ -17380,11 +17189,7 @@
         <w:t>execution</w:t>
       </w:r>
       <w:r>
-        <w:t xml:space="preserve"> for acts causing death or irreversible harm. Institutions or </w:t>
-      </w:r>
-      <w:r>
-        <w:lastRenderedPageBreak/>
-        <w:t>professionals found in violation shall face dissolution, licence revocation, and treble damages to affected parties or their heirs.</w:t>
+        <w:t xml:space="preserve"> for acts causing death or irreversible harm. Institutions or professionals found in violation shall face dissolution, licence revocation, and treble damages to affected parties or their heirs.</w:t>
       </w:r>
     </w:p>
     <w:p>
@@ -17450,7 +17255,6 @@
     </w:p>
     <w:p>
       <w:r>
-        <w:lastRenderedPageBreak/>
         <w:t>Precis:</w:t>
       </w:r>
     </w:p>
@@ -17487,11 +17291,7 @@
     </w:p>
     <w:p>
       <w:r>
-        <w:t>Furthermore, in anticipating future threats from biotechnologies like genetic editing or AI-diagnostic monopolies that could enable surveillance or selective culling, Article 21 fortifies freedoms through independent audits and merit-</w:t>
-      </w:r>
-      <w:r>
-        <w:lastRenderedPageBreak/>
-        <w:t>evaluated protocols, ensuring that medical advancements enhance rather than undermine the human experience of autonomy. This preserves the cultural continuity of European posterity by barring presumptive consent schemes or linkages to end-of-life decisions, resilient amid emerging vectors of tyranny such as digital health passports or engineered pandemics. In doing so, the Article guarantees a meritocracy where health serves as a foundation for national strength, protecting generations from the distortions of supranational health agendas or corporate overreach that threaten liberty.</w:t>
+        <w:t>Furthermore, in anticipating future threats from biotechnologies like genetic editing or AI-diagnostic monopolies that could enable surveillance or selective culling, Article 21 fortifies freedoms through independent audits and merit-evaluated protocols, ensuring that medical advancements enhance rather than undermine the human experience of autonomy. This preserves the cultural continuity of European posterity by barring presumptive consent schemes or linkages to end-of-life decisions, resilient amid emerging vectors of tyranny such as digital health passports or engineered pandemics. In doing so, the Article guarantees a meritocracy where health serves as a foundation for national strength, protecting generations from the distortions of supranational health agendas or corporate overreach that threaten liberty.</w:t>
       </w:r>
     </w:p>
     <w:p/>
@@ -17517,7 +17317,6 @@
       <w:bookmarkStart w:id="134" w:name="_Toc215665053"/>
       <w:bookmarkStart w:id="135" w:name="_Toc229835226"/>
       <w:r>
-        <w:lastRenderedPageBreak/>
         <w:t xml:space="preserve">Article </w:t>
       </w:r>
       <w:r>
@@ -17603,7 +17402,6 @@
         <w:contextualSpacing w:val="0"/>
       </w:pPr>
       <w:r>
-        <w:lastRenderedPageBreak/>
         <w:t xml:space="preserve">No manufacturer, service provider, or third party may require recurring subscription fees or ongoing connectivity for the continued operation of core functionalities in any personally owned or leased vehicle following purchase or lease commencement. Core functionalities include propulsion, climate control (heating and cooling), lighting, braking, steering, safety systems, and any feature included in the original sale or lease agreement. Remote alteration, limitation, or disablement of such functionalities is prohibited without the explicit, informed, and revocable consent of the owner, except pursuant to a judicial warrant for specific criminal investigation. Violations shall render the manufacturer liable for full restitution, damages, and loss of operating privileges within the </w:t>
       </w:r>
       <w:r>
@@ -17689,7 +17487,6 @@
         <w:ind w:left="720" w:hanging="360"/>
       </w:pPr>
       <w:r>
-        <w:lastRenderedPageBreak/>
         <w:t>a)</w:t>
       </w:r>
       <w:r>
@@ -17836,7 +17633,6 @@
         <w:ind w:left="720" w:hanging="360"/>
       </w:pPr>
       <w:r>
-        <w:lastRenderedPageBreak/>
         <w:t>b)</w:t>
       </w:r>
       <w:r>
@@ -17939,11 +17735,7 @@
         <w:tab/>
       </w:r>
       <w:r>
-        <w:t xml:space="preserve">End-to-end cryptographic protection of communications is a fundamental right. No law, regulation, licence, or court order may ever prohibit, </w:t>
-      </w:r>
-      <w:r>
-        <w:lastRenderedPageBreak/>
-        <w:t xml:space="preserve">weaken, or compel the disclosure of cryptographic keys, source code, or back-door access to any communications system used by citizens. </w:t>
+        <w:t xml:space="preserve">End-to-end cryptographic protection of communications is a fundamental right. No law, regulation, licence, or court order may ever prohibit, weaken, or compel the disclosure of cryptographic keys, source code, or back-door access to any communications system used by citizens. </w:t>
       </w:r>
     </w:p>
     <w:p>
@@ -18084,6 +17876,79 @@
         <w:t>Bulk or suspicionless collection of communications metadata by any entity, domestic or foreign, is prohibited in perpetuity. Violation is high treason.</w:t>
       </w:r>
     </w:p>
+    <w:p>
+      <w:pPr>
+        <w:ind w:left="360" w:hanging="360"/>
+      </w:pPr>
+      <w:r>
+        <w:t>18.</w:t>
+      </w:r>
+      <w:r>
+        <w:tab/>
+      </w:r>
+      <w:r>
+        <w:t>Ambient Sensing and Sanctity of the Dwelling</w:t>
+      </w:r>
+    </w:p>
+    <w:p>
+      <w:pPr>
+        <w:ind w:left="360" w:hanging="360"/>
+      </w:pPr>
+      <w:r>
+        <w:t>19.</w:t>
+      </w:r>
+      <w:r>
+        <w:tab/>
+      </w:r>
+      <w:r>
+        <w:t>No government, corporation, or other entity may, without the citizen’s specific, informed, and revocable consent for each distinct purpose, or a judicial warrant meeting the same standard as for private communications under this Article:</w:t>
+      </w:r>
+    </w:p>
+    <w:p>
+      <w:pPr>
+        <w:ind w:left="720" w:hanging="360"/>
+      </w:pPr>
+      <w:r>
+        <w:t>a)</w:t>
+      </w:r>
+      <w:r>
+        <w:tab/>
+      </w:r>
+      <w:r>
+        <w:t>activate, require, or use microphones, cameras, or other sensors in a citizen’s dwelling or in privately owned devices located therein to capture ambient audio, video, or behavioural data; or</w:t>
+      </w:r>
+    </w:p>
+    <w:p>
+      <w:pPr>
+        <w:ind w:left="720" w:hanging="360"/>
+      </w:pPr>
+      <w:r>
+        <w:t>b)</w:t>
+      </w:r>
+      <w:r>
+        <w:tab/>
+      </w:r>
+      <w:r>
+        <w:t>use radiofrequency, wireless-network, radar, ultrasonic, or similar sensing, including but not limited to Wi-Fi or other network-signal sensing used to detect presence, motion, occupancy, or activity within a dwelling, to monitor or infer the interior of that dwelling or the conduct of persons therein.</w:t>
+      </w:r>
+    </w:p>
+    <w:p>
+      <w:pPr>
+        <w:ind w:left="360" w:hanging="360"/>
+      </w:pPr>
+      <w:r>
+        <w:t>20.</w:t>
+      </w:r>
+      <w:r>
+        <w:tab/>
+      </w:r>
+      <w:r>
+        <w:t xml:space="preserve">Pre-checked consent, bundled terms-of-service consent, or consent demanded as a condition of basic device function, connectivity, warranty, or updates is void. Data so obtained may not be stored, analysed, sold, or </w:t>
+      </w:r>
+      <w:r>
+        <w:t>shared except as the warrant or valid consent strictly allows. Violation is a crime against the Constitution.</w:t>
+      </w:r>
+    </w:p>
     <w:p/>
     <w:p>
       <w:r>
@@ -18092,7 +17957,6 @@
     </w:p>
     <w:p>
       <w:r>
-        <w:lastRenderedPageBreak/>
         <w:t xml:space="preserve">Precis: </w:t>
       </w:r>
     </w:p>
@@ -18126,16 +17990,12 @@
     </w:p>
     <w:p>
       <w:r>
-        <w:t>Resilient, decentralised, human-operable power grids and sovereign communications infrastructure guard against technological collapse or foreign sabotage. Private communications enjoy absolute inviolable protection through mandated end-to-end encryption, domestic data sovereignty, open-source transparency, and perpetual bans on bulk surveillance or back-door access. Violations constitute crimes against the Constitution.</w:t>
-      </w:r>
-    </w:p>
-    <w:p>
-      <w:r>
-        <w:t xml:space="preserve">This Article ensures infrastructure and industry serve as engines of meritocratic excellence and liberty, reversing deliberate prior de-industrialisation and environmental degradation, shielding the founding peoples and their posterity from twenty-first-century vectors of economic extraction, demographic </w:t>
-      </w:r>
-      <w:r>
-        <w:lastRenderedPageBreak/>
-        <w:t>displacement, and digital tyranny. Future generations inherit a nation of unmatched capability, self-sufficiency, and human primacy.</w:t>
+        <w:t>Resilient, decentralised, human-operable power grids and sovereign communications infrastructure guard against technological collapse or foreign sabotage. Private communications enjoy absolute inviolable protection through mandated end-to-end encryption, domestic data sovereignty, open-source transparency, and perpetual bans on bulk surveillance or back-door access. Violations constitute crimes against the Constitution. The sanctity of the dwelling is further secured against ambient microphones, cameras, and radiofrequency or Wi-Fi sensing of presence, motion, or activity within the home, except by specific revocable consent or a warrant of the same standard as for private communications.</w:t>
+      </w:r>
+    </w:p>
+    <w:p>
+      <w:r>
+        <w:t>This Article ensures infrastructure and industry serve as engines of meritocratic excellence and liberty, reversing deliberate prior de-industrialisation and environmental degradation, shielding the founding peoples and their posterity from twenty-first-century vectors of economic extraction, demographic displacement, and digital tyranny. Future generations inherit a nation of unmatched capability, self-sufficiency, and human primacy.</w:t>
       </w:r>
     </w:p>
     <w:p>
@@ -18158,7 +18018,6 @@
       <w:bookmarkStart w:id="137" w:name="_Toc215665054"/>
       <w:bookmarkStart w:id="138" w:name="_Toc229835227"/>
       <w:r>
-        <w:lastRenderedPageBreak/>
         <w:t>Article 2</w:t>
       </w:r>
       <w:r>
@@ -18348,7 +18207,6 @@
         <w:ind w:left="360" w:hanging="360"/>
       </w:pPr>
       <w:r>
-        <w:lastRenderedPageBreak/>
         <w:t>7.</w:t>
       </w:r>
       <w:r>
@@ -18636,7 +18494,6 @@
         <w:ind w:left="360" w:hanging="360"/>
       </w:pPr>
       <w:r>
-        <w:lastRenderedPageBreak/>
         <w:t>8.</w:t>
       </w:r>
       <w:r>
@@ -18669,7 +18526,6 @@
     </w:p>
     <w:p>
       <w:r>
-        <w:lastRenderedPageBreak/>
         <w:t>Precis:</w:t>
       </w:r>
     </w:p>
@@ -18715,7 +18571,6 @@
         <w:t xml:space="preserve">y allowing private AI development while enforcing safeguards against threats to core provisions, Article 23 balances freedom with vigilance, fortifying the </w:t>
       </w:r>
       <w:r>
-        <w:lastRenderedPageBreak/>
         <w:t>Dominion</w:t>
       </w:r>
       <w:r>
@@ -18749,7 +18604,6 @@
       <w:bookmarkStart w:id="140" w:name="_Toc215665055"/>
       <w:bookmarkStart w:id="141" w:name="_Toc229835228"/>
       <w:r>
-        <w:lastRenderedPageBreak/>
         <w:t>Article 2</w:t>
       </w:r>
       <w:r>
@@ -18869,11 +18723,7 @@
         <w:tab/>
       </w:r>
       <w:r>
-        <w:t xml:space="preserve">Any citizen of unmixed European descent aged twenty-one or older, of good character, and willing to occupy and improve the land personally, may stake a homestead claim of up to 160 acres (64 hectares) of unoccupied, unpatented land in the National Domain north of the 55th </w:t>
-      </w:r>
-      <w:r>
-        <w:lastRenderedPageBreak/>
-        <w:t>parallel or in designated frontier zones. After five continuous years of residence and visible improvement (dwelling, fencing, clearing, or productive agriculture), full fee-simple title shall issue free of charge. Homestead land may never be sold or transferred to non-citizens or to any corporation. It descends to lineal heirs or reverts to the National Domain. Provinces may establish parallel homesteading programmes on provincial public land under the same terms.</w:t>
+        <w:t>Any citizen of unmixed European descent aged twenty-one or older, of good character, and willing to occupy and improve the land personally, may stake a homestead claim of up to 160 acres (64 hectares) of unoccupied, unpatented land in the National Domain north of the 55th parallel or in designated frontier zones. After five continuous years of residence and visible improvement (dwelling, fencing, clearing, or productive agriculture), full fee-simple title shall issue free of charge. Homestead land may never be sold or transferred to non-citizens or to any corporation. It descends to lineal heirs or reverts to the National Domain. Provinces may establish parallel homesteading programmes on provincial public land under the same terms.</w:t>
       </w:r>
       <w:r>
         <w:t xml:space="preserve"> </w:t>
@@ -18967,11 +18817,7 @@
         <w:tab/>
       </w:r>
       <w:r>
-        <w:t xml:space="preserve">All government-funded or government-mandated software, communication protocols, and data formats shall be fully open-source and </w:t>
-      </w:r>
-      <w:r>
-        <w:lastRenderedPageBreak/>
-        <w:t>royalty-free in perpetuity. No citizen or enterprise may be compelled to use proprietary, closed-source systems for any interaction with the state or for participation in the economy.</w:t>
+        <w:t>All government-funded or government-mandated software, communication protocols, and data formats shall be fully open-source and royalty-free in perpetuity. No citizen or enterprise may be compelled to use proprietary, closed-source systems for any interaction with the state or for participation in the economy.</w:t>
       </w:r>
       <w:r>
         <w:t xml:space="preserve"> </w:t>
@@ -19068,7 +18914,6 @@
     </w:p>
     <w:p>
       <w:r>
-        <w:lastRenderedPageBreak/>
         <w:t>Precis:</w:t>
       </w:r>
     </w:p>
@@ -19114,11 +18959,7 @@
         <w:t>Dominion</w:t>
       </w:r>
       <w:r>
-        <w:t xml:space="preserve"> against future threats from digital economies, AI-driven monopolies, or blockchain-based asset manipulations that could centralize control and erode human agency. This stance upholds the human experience of freedom in property ownership, resilient amid technological convergences like smart contracts or geo-fencing that might otherwise enable unprecedented encroachments, guaranteeing that </w:t>
-      </w:r>
-      <w:r>
-        <w:lastRenderedPageBreak/>
-        <w:t>European posterity inherits a meritocracy where economic sovereignty empowers innovation and safeguards against the vectors of modern tyranny.</w:t>
+        <w:t xml:space="preserve"> against future threats from digital economies, AI-driven monopolies, or blockchain-based asset manipulations that could centralize control and erode human agency. This stance upholds the human experience of freedom in property ownership, resilient amid technological convergences like smart contracts or geo-fencing that might otherwise enable unprecedented encroachments, guaranteeing that European posterity inherits a meritocracy where economic sovereignty empowers innovation and safeguards against the vectors of modern tyranny.</w:t>
       </w:r>
     </w:p>
     <w:p/>
@@ -19142,7 +18983,6 @@
       <w:bookmarkStart w:id="143" w:name="_Toc215665056"/>
       <w:bookmarkStart w:id="144" w:name="_Toc229835229"/>
       <w:r>
-        <w:lastRenderedPageBreak/>
         <w:t xml:space="preserve">Article </w:t>
       </w:r>
       <w:r>
@@ -19275,11 +19115,7 @@
         <w:tab/>
       </w:r>
       <w:r>
-        <w:t xml:space="preserve">Provincial authorities may authorise temporary, localised hail-suppression or tornado-dissipation operations using established, non-persistent agents (e.g., silver iodide flares) only when a specific, imminent, and severe storm threatens a major population centre or critical infrastructure, and only for the duration of that immediate threat. Every such operation must be publicly announced 24 hours in advance or immediately if urgency forbids, </w:t>
-      </w:r>
-      <w:r>
-        <w:lastRenderedPageBreak/>
-        <w:t>live-streamed when possible, independently monitored, and fully reported to the provincial legislature within seven days. Any use outside these strict limits shall be punished as treason.</w:t>
+        <w:t>Provincial authorities may authorise temporary, localised hail-suppression or tornado-dissipation operations using established, non-persistent agents (e.g., silver iodide flares) only when a specific, imminent, and severe storm threatens a major population centre or critical infrastructure, and only for the duration of that immediate threat. Every such operation must be publicly announced 24 hours in advance or immediately if urgency forbids, live-streamed when possible, independently monitored, and fully reported to the provincial legislature within seven days. Any use outside these strict limits shall be punished as treason.</w:t>
       </w:r>
       <w:r>
         <w:t xml:space="preserve"> </w:t>
@@ -19411,7 +19247,6 @@
         <w:ind w:left="720" w:hanging="360"/>
       </w:pPr>
       <w:r>
-        <w:lastRenderedPageBreak/>
         <w:t>c)</w:t>
       </w:r>
       <w:r>
@@ -19559,11 +19394,7 @@
         <w:t>Dominion</w:t>
       </w:r>
       <w:r>
-        <w:t xml:space="preserve"> are the inalienable patrimony of the Canadian people and their posterity. No foreign person, foreign state, or corporation </w:t>
-      </w:r>
-      <w:r>
-        <w:lastRenderedPageBreak/>
-        <w:t>more than ten percent foreign-owned may ever acquire outright ownership of mineral rights or hold resource-extraction leases longer than twenty-five years. All resource revenues, after reasonable production costs, accrue exclusively to the sovereign wealth fund created under Article 22 for the equal benefit of citizens.</w:t>
+        <w:t xml:space="preserve"> are the inalienable patrimony of the Canadian people and their posterity. No foreign person, foreign state, or corporation more than ten percent foreign-owned may ever acquire outright ownership of mineral rights or hold resource-extraction leases longer than twenty-five years. All resource revenues, after reasonable production costs, accrue exclusively to the sovereign wealth fund created under Article 22 for the equal benefit of citizens.</w:t>
       </w:r>
     </w:p>
     <w:p>
@@ -19594,7 +19425,6 @@
     </w:p>
     <w:p>
       <w:r>
-        <w:lastRenderedPageBreak/>
         <w:t xml:space="preserve">Precis: </w:t>
       </w:r>
     </w:p>
@@ -19682,11 +19512,7 @@
         <w:t>Dominion</w:t>
       </w:r>
       <w:r>
-        <w:t xml:space="preserve"> against future tyrannies from monopolies that might </w:t>
-      </w:r>
-      <w:r>
-        <w:lastRenderedPageBreak/>
-        <w:t xml:space="preserve">exploit minerals for </w:t>
+        <w:t xml:space="preserve"> against future tyrannies from monopolies that might exploit minerals for </w:t>
       </w:r>
       <w:r>
         <w:t>supranational</w:t>
@@ -19715,7 +19541,6 @@
       <w:bookmarkStart w:id="146" w:name="_Toc215665057"/>
       <w:bookmarkStart w:id="147" w:name="_Toc229835230"/>
       <w:r>
-        <w:lastRenderedPageBreak/>
         <w:t xml:space="preserve">Article </w:t>
       </w:r>
       <w:r>
@@ -19861,7 +19686,6 @@
     </w:p>
     <w:p>
       <w:r>
-        <w:lastRenderedPageBreak/>
         <w:t>Precis:</w:t>
       </w:r>
     </w:p>
@@ -19889,11 +19713,7 @@
     </w:p>
     <w:p>
       <w:r>
-        <w:t xml:space="preserve">Ultimately, Article 26 fortifies the human experience of freedom by embedding meritocracy into the legal fabric, shielding future generations from the pitfalls </w:t>
-      </w:r>
-      <w:r>
-        <w:lastRenderedPageBreak/>
-        <w:t>of engineered inequality that have plagued modern societies. It prevents the crime of genocide through assimilation or favoritism, as defined in international norms, by promoting a unified national identity rooted in shared laws and opportunities rather than fragmented privileges. This approach not only enhances social cohesion but also bolsters economic liberty, as resources once diverted to unsustainable programs can be redirected toward infrastructure, education, and innovation that benefit all. In a world where supranational forces seek to dissolve borders and heritages, this article acts as a bulwark, ensuring that the freedoms won by European settlers</w:t>
+        <w:t>Ultimately, Article 26 fortifies the human experience of freedom by embedding meritocracy into the legal fabric, shielding future generations from the pitfalls of engineered inequality that have plagued modern societies. It prevents the crime of genocide through assimilation or favoritism, as defined in international norms, by promoting a unified national identity rooted in shared laws and opportunities rather than fragmented privileges. This approach not only enhances social cohesion but also bolsters economic liberty, as resources once diverted to unsustainable programs can be redirected toward infrastructure, education, and innovation that benefit all. In a world where supranational forces seek to dissolve borders and heritages, this article acts as a bulwark, ensuring that the freedoms won by European settlers</w:t>
       </w:r>
       <w:r>
         <w:t xml:space="preserve"> </w:t>
@@ -19929,7 +19749,6 @@
       <w:bookmarkStart w:id="149" w:name="_Toc215665058"/>
       <w:bookmarkStart w:id="150" w:name="_Toc229835231"/>
       <w:r>
-        <w:lastRenderedPageBreak/>
         <w:t>Article 2</w:t>
       </w:r>
       <w:r>
@@ -20105,7 +19924,6 @@
           <w:lang w:eastAsia="en-CA"/>
           <w14:ligatures w14:val="none"/>
         </w:rPr>
-        <w:lastRenderedPageBreak/>
         <w:t>6.</w:t>
       </w:r>
       <w:r>
@@ -20298,7 +20116,6 @@
         <w:rPr>
           <w:lang w:eastAsia="en-CA"/>
         </w:rPr>
-        <w:lastRenderedPageBreak/>
         <w:t>Precis:</w:t>
       </w:r>
     </w:p>
@@ -20392,14 +20209,7 @@
         <w:rPr>
           <w:lang w:eastAsia="en-CA"/>
         </w:rPr>
-        <w:t xml:space="preserve">Ultimately, Article 27 fortifies the human experience of freedom by embedding solidarity within a framework of accountability, shielding future generations </w:t>
-      </w:r>
-      <w:r>
-        <w:rPr>
-          <w:lang w:eastAsia="en-CA"/>
-        </w:rPr>
-        <w:lastRenderedPageBreak/>
-        <w:t>from the tyrannies of poverty traps and resource misallocation that plague outdated governance models. It prevents the crime of generational theft by funding programs transparently from general revenue and sovereign wealth, without imposing income taxes, aligning with the Charter</w:t>
+        <w:t>Ultimately, Article 27 fortifies the human experience of freedom by embedding solidarity within a framework of accountability, shielding future generations from the tyrannies of poverty traps and resource misallocation that plague outdated governance models. It prevents the crime of generational theft by funding programs transparently from general revenue and sovereign wealth, without imposing income taxes, aligning with the Charter</w:t>
       </w:r>
       <w:r>
         <w:rPr>
@@ -20459,7 +20269,6 @@
       <w:bookmarkStart w:id="152" w:name="_Toc215665059"/>
       <w:bookmarkStart w:id="153" w:name="_Toc229835232"/>
       <w:r>
-        <w:lastRenderedPageBreak/>
         <w:t>Article 2</w:t>
       </w:r>
       <w:r>
@@ -20562,11 +20371,7 @@
         <w:t>Dominion</w:t>
       </w:r>
       <w:r>
-        <w:t xml:space="preserve"> shall maintain dedicated capabilities for the suppression of wildland fires threatening the territory, citizens, infrastructure, and ecological integrity of the nation. This mission includes procurement, maintenance, and operation of aerial water-bomber fleets, ground suppression units, and preventive fuel-management operations on public lands. During peacetime and compulsory service, personnel shall receive training in wildland firefighting techniques, aerial coordination, and environmental stewardship. Provincial authorities retain primary coordination of routine fire management, with military assets activated upon provincial request or national declaration when civilian resources are overwhelmed. Such fire-suppression forces may be deployed to foreign nations upon their request for humanitarian assistance in combating wildfires or similar natural disasters, without such deployment being </w:t>
-      </w:r>
-      <w:r>
-        <w:lastRenderedPageBreak/>
-        <w:t>construed as a military action or implying any threat to the recipient nation</w:t>
+        <w:t xml:space="preserve"> shall maintain dedicated capabilities for the suppression of wildland fires threatening the territory, citizens, infrastructure, and ecological integrity of the nation. This mission includes procurement, maintenance, and operation of aerial water-bomber fleets, ground suppression units, and preventive fuel-management operations on public lands. During peacetime and compulsory service, personnel shall receive training in wildland firefighting techniques, aerial coordination, and environmental stewardship. Provincial authorities retain primary coordination of routine fire management, with military assets activated upon provincial request or national declaration when civilian resources are overwhelmed. Such fire-suppression forces may be deployed to foreign nations upon their request for humanitarian assistance in combating wildfires or similar natural disasters, without such deployment being construed as a military action or implying any threat to the recipient nation</w:t>
       </w:r>
       <w:r>
         <w:t>’</w:t>
@@ -20721,7 +20526,6 @@
         <w:ind w:left="720" w:hanging="360"/>
       </w:pPr>
       <w:r>
-        <w:lastRenderedPageBreak/>
         <w:t>a)</w:t>
       </w:r>
       <w:r>
@@ -20956,7 +20760,6 @@
         <w:ind w:left="720" w:hanging="360"/>
       </w:pPr>
       <w:r>
-        <w:lastRenderedPageBreak/>
         <w:t>c)</w:t>
       </w:r>
       <w:r>
@@ -21038,7 +20841,6 @@
     </w:p>
     <w:p>
       <w:r>
-        <w:lastRenderedPageBreak/>
         <w:t>Precis:</w:t>
       </w:r>
     </w:p>
@@ -21079,11 +20881,7 @@
         <w:t>’</w:t>
       </w:r>
       <w:r>
-        <w:t xml:space="preserve">s curbs on arbitrary power, these measures address modern risks like electromagnetic </w:t>
-      </w:r>
-      <w:r>
-        <w:lastRenderedPageBreak/>
-        <w:t>warfare and non-state actors, ensuring that policing enhances meritocratic society by targeting real harms</w:t>
+        <w:t>s curbs on arbitrary power, these measures address modern risks like electromagnetic warfare and non-state actors, ensuring that policing enhances meritocratic society by targeting real harms</w:t>
       </w:r>
       <w:r>
         <w:t xml:space="preserve"> </w:t>
@@ -21132,7 +20930,6 @@
       <w:bookmarkStart w:id="155" w:name="_Toc215665060"/>
       <w:bookmarkStart w:id="156" w:name="_Toc229835233"/>
       <w:r>
-        <w:lastRenderedPageBreak/>
         <w:t>Article 29 – Territorial Integrity and Provincial Relations</w:t>
       </w:r>
       <w:bookmarkEnd w:id="154"/>
@@ -21243,11 +21040,7 @@
         <w:t xml:space="preserve"> airspace,</w:t>
       </w:r>
       <w:r>
-        <w:t xml:space="preserve"> pipelines, power transmission lines, and telecommunications infrastructure. No province may impose </w:t>
-      </w:r>
-      <w:r>
-        <w:lastRenderedPageBreak/>
-        <w:t>tariffs, blockades, discriminatory fees, or regulatory barriers on goods, services, energy, or persons in transit to or from another province.</w:t>
+        <w:t xml:space="preserve"> pipelines, power transmission lines, and telecommunications infrastructure. No province may impose tariffs, blockades, discriminatory fees, or regulatory barriers on goods, services, energy, or persons in transit to or from another province.</w:t>
       </w:r>
     </w:p>
     <w:p>
@@ -21375,7 +21168,6 @@
     </w:p>
     <w:p>
       <w:r>
-        <w:lastRenderedPageBreak/>
         <w:t>Precis:</w:t>
       </w:r>
     </w:p>
@@ -21436,7 +21228,6 @@
     </w:p>
     <w:p>
       <w:r>
-        <w:lastRenderedPageBreak/>
         <w:t xml:space="preserve">Article 29 enhances the human experience of freedom by embedding territorial permanence into the constitutional framework, shielding future generations from the tyrannies of disunity and loss that have afflicted nations amid rapid technological and environmental changes. It prevents genocidal acts through territorial dilution by maintaining a singular, sovereign entity rooted in European founding principles, where provincial identities enrich rather than undermine the meritocratic whole. In doing so, it fosters a </w:t>
       </w:r>
       <w:r>
@@ -21480,7 +21271,6 @@
       <w:bookmarkStart w:id="158" w:name="_Toc215665061"/>
       <w:bookmarkStart w:id="159" w:name="_Toc229835234"/>
       <w:r>
-        <w:lastRenderedPageBreak/>
         <w:t xml:space="preserve">Article 30 – Amendment and Revision of </w:t>
       </w:r>
       <w:r>
@@ -21597,7 +21387,6 @@
         <w:ind w:left="357" w:hanging="357"/>
       </w:pPr>
       <w:r>
-        <w:lastRenderedPageBreak/>
         <w:t>6.</w:t>
       </w:r>
       <w:r>
@@ -21646,7 +21435,6 @@
     </w:p>
     <w:p>
       <w:r>
-        <w:lastRenderedPageBreak/>
         <w:t>Precis:</w:t>
       </w:r>
     </w:p>
@@ -21696,11 +21484,7 @@
         <w:t>’</w:t>
       </w:r>
       <w:r>
-        <w:t xml:space="preserve"> legacy. Moreover, the extraordinary refoundation clause reserves ultimate sovereignty to the people, allowing a complete overhaul only through overwhelming consensus, thus </w:t>
-      </w:r>
-      <w:r>
-        <w:lastRenderedPageBreak/>
-        <w:t>countering modern threats like supranational interference that might seek to dissolve national identities.</w:t>
+        <w:t xml:space="preserve"> legacy. Moreover, the extraordinary refoundation clause reserves ultimate sovereignty to the people, allowing a complete overhaul only through overwhelming consensus, thus countering modern threats like supranational interference that might seek to dissolve national identities.</w:t>
       </w:r>
     </w:p>
     <w:p>
@@ -21734,7 +21518,6 @@
       <w:bookmarkStart w:id="161" w:name="_Toc215665062"/>
       <w:bookmarkStart w:id="162" w:name="_Toc229835235"/>
       <w:r>
-        <w:lastRenderedPageBreak/>
         <w:t xml:space="preserve">Article </w:t>
       </w:r>
       <w:r>
@@ -21825,11 +21608,7 @@
     </w:p>
     <w:p>
       <w:r>
-        <w:t xml:space="preserve">The authors and ratifiers of this Constitution are under no illusion about the ferocity with which vested foreign and domestic powers will resist the </w:t>
-      </w:r>
-      <w:r>
-        <w:lastRenderedPageBreak/>
-        <w:t>restoration</w:t>
+        <w:t>The authors and ratifiers of this Constitution are under no illusion about the ferocity with which vested foreign and domestic powers will resist the restoration</w:t>
       </w:r>
       <w:r>
         <w:t xml:space="preserve"> and establishment</w:t>
@@ -21896,7 +21675,6 @@
     </w:p>
     <w:p>
       <w:r>
-        <w:lastRenderedPageBreak/>
         <w:t>Precis:</w:t>
       </w:r>
     </w:p>
@@ -21918,11 +21696,7 @@
         <w:t>Dominion</w:t>
       </w:r>
       <w:r>
-        <w:t xml:space="preserve">’s adaptability while anchoring it in eternal principles, shielding citizens from the perils of legal chaos or revolutionary </w:t>
-      </w:r>
-      <w:r>
-        <w:lastRenderedPageBreak/>
-        <w:t>excess that have plagued nations amid rapid progress. It prevents the crime of perpetual subjugation by empowering merit-driven renewal, ensuring that the European-descended people’s dominion over their homeland remains secure against internal decay or external threats. In doing so, it upholds a constitution designed not as an end but as a living instrument for prosperity, where freedom is defended vigilantly for generations to come.</w:t>
+        <w:t>’s adaptability while anchoring it in eternal principles, shielding citizens from the perils of legal chaos or revolutionary excess that have plagued nations amid rapid progress. It prevents the crime of perpetual subjugation by empowering merit-driven renewal, ensuring that the European-descended people’s dominion over their homeland remains secure against internal decay or external threats. In doing so, it upholds a constitution designed not as an end but as a living instrument for prosperity, where freedom is defended vigilantly for generations to come.</w:t>
       </w:r>
     </w:p>
     <w:p/>
@@ -21937,7 +21711,6 @@
       </w:pPr>
       <w:bookmarkStart w:id="163" w:name="_Toc229835236"/>
       <w:r>
-        <w:lastRenderedPageBreak/>
         <w:t>Developing the Noosphere</w:t>
       </w:r>
       <w:bookmarkEnd w:id="163"/>
@@ -21960,11 +21733,7 @@
     </w:p>
     <w:p>
       <w:r>
-        <w:t xml:space="preserve">Finally comes the noosphere, a new shell superimposed on top of the biosphere (and thus indirectly on the geosphere). It remained rudimentary in animals, but with humans it has exploded into burgeoning development. Human minds now reshape the planet at speeds unimaginable in earlier spheres. We migrate and concentrate atoms on an industrial scale with mining, manufacturing, building cities…augmenting the slow biomigration of atoms with rapid noomigration. Like its predecessors, the noosphere contains objects and actions, but they are mental rather than biological or geological: ideas, </w:t>
-      </w:r>
-      <w:r>
-        <w:lastRenderedPageBreak/>
-        <w:t>cultures, technologies, systems of thought. These are every bit as real and consequential as biological species or geological mountains: they are noological phenomena.</w:t>
+        <w:t>Finally comes the noosphere, a new shell superimposed on top of the biosphere (and thus indirectly on the geosphere). It remained rudimentary in animals, but with humans it has exploded into burgeoning development. Human minds now reshape the planet at speeds unimaginable in earlier spheres. We migrate and concentrate atoms on an industrial scale with mining, manufacturing, building cities…augmenting the slow biomigration of atoms with rapid noomigration. Like its predecessors, the noosphere contains objects and actions, but they are mental rather than biological or geological: ideas, cultures, technologies, systems of thought. These are every bit as real and consequential as biological species or geological mountains: they are noological phenomena.</w:t>
       </w:r>
     </w:p>
     <w:p>
@@ -21996,7 +21765,6 @@
       </w:pPr>
       <w:bookmarkStart w:id="164" w:name="_Toc229835237"/>
       <w:r>
-        <w:lastRenderedPageBreak/>
         <w:t xml:space="preserve">About the Provisional Flag of the Meritocratic </w:t>
       </w:r>
       <w:r>
@@ -22017,7 +21785,7 @@
           <w:noProof/>
         </w:rPr>
         <w:drawing>
-          <wp:inline distT="0" distB="0" distL="0" distR="0" wp14:anchorId="5CE7F2B9" wp14:editId="495799F8">
+          <wp:inline distT="0" distB="0" distL="0" distR="0" wp14:anchorId="70753236" wp14:editId="5B143DEC">
             <wp:extent cx="3882236" cy="1940288"/>
             <wp:effectExtent l="0" t="0" r="4445" b="3175"/>
             <wp:docPr id="1" name="Picture 1"/>
@@ -22095,11 +21863,7 @@
     </w:p>
     <w:p>
       <w:r>
-        <w:t xml:space="preserve">The arrangement represents the philosophical dialectic of thesis, antithesis, and synthesis as articulated by Hegel. The two lower leaves symbolize the historical tension between the forces of freedom (thesis) and the forces of control </w:t>
-      </w:r>
-      <w:r>
-        <w:lastRenderedPageBreak/>
-        <w:t>(antithesis), the latter now amplified by modern technological mechanisms of surveillance and coercion. The central, higher leaf represents the synthesis: a new constitutional order that resolves this conflict through explicit meritocracy, preservation of European heritage, and robust protections for human freedom in the technological age. Canada, through this synthesis, positions itself to advance the global condition of humanity.</w:t>
+        <w:t>The arrangement represents the philosophical dialectic of thesis, antithesis, and synthesis as articulated by Hegel. The two lower leaves symbolize the historical tension between the forces of freedom (thesis) and the forces of control (antithesis), the latter now amplified by modern technological mechanisms of surveillance and coercion. The central, higher leaf represents the synthesis: a new constitutional order that resolves this conflict through explicit meritocracy, preservation of European heritage, and robust protections for human freedom in the technological age. Canada, through this synthesis, positions itself to advance the global condition of humanity.</w:t>
       </w:r>
     </w:p>
     <w:p>
@@ -22154,7 +21918,6 @@
     </w:p>
     <w:p>
       <w:r>
-        <w:lastRenderedPageBreak/>
         <w:t xml:space="preserve">Through these elements, the provisional flag expresses the Meritocratic </w:t>
       </w:r>
       <w:r>

</xml_diff>

<commit_message>
Resync Article 22 ambient sensing from manually numbered master.
Copy fixed TRIM into completePDF, convert list numbers to static text for the extractor, regenerate article-22.json, and refresh the downloadable PDF.
</commit_message>
<xml_diff>
--- a/completePDF/Meritocratic Dominion of Canada.docx
+++ b/completePDF/Meritocratic Dominion of Canada.docx
@@ -59,7 +59,7 @@
           <w:noProof/>
         </w:rPr>
         <w:drawing>
-          <wp:inline distT="0" distB="0" distL="0" distR="0" wp14:anchorId="662D45DD" wp14:editId="71DE1915">
+          <wp:inline distT="0" distB="0" distL="0" distR="0" wp14:anchorId="52FDB48B" wp14:editId="6A042571">
             <wp:extent cx="4239010" cy="2117693"/>
             <wp:effectExtent l="0" t="0" r="0" b="0"/>
             <wp:docPr id="4" name="Picture 4"/>
@@ -569,8 +569,8 @@
       <w:bookmarkEnd w:id="55"/>
     </w:p>
     <w:p/>
-    <w:bookmarkStart w:id="56" w:name="_Toc215665027" w:displacedByCustomXml="next"/>
-    <w:bookmarkStart w:id="57" w:name="_Toc215664772" w:displacedByCustomXml="next"/>
+    <w:bookmarkStart w:id="56" w:name="_Toc215664772" w:displacedByCustomXml="next"/>
+    <w:bookmarkStart w:id="57" w:name="_Toc215665027" w:displacedByCustomXml="next"/>
     <w:sdt>
       <w:sdtPr>
         <w:rPr>
@@ -2650,7 +2650,7 @@
                 <w:noProof/>
                 <w:webHidden/>
               </w:rPr>
-              <w:t>139</w:t>
+              <w:t>140</w:t>
             </w:r>
             <w:r>
               <w:rPr>
@@ -2723,7 +2723,7 @@
                 <w:noProof/>
                 <w:webHidden/>
               </w:rPr>
-              <w:t>144</w:t>
+              <w:t>145</w:t>
             </w:r>
             <w:r>
               <w:rPr>
@@ -2796,7 +2796,7 @@
                 <w:noProof/>
                 <w:webHidden/>
               </w:rPr>
-              <w:t>149</w:t>
+              <w:t>150</w:t>
             </w:r>
             <w:r>
               <w:rPr>
@@ -2869,7 +2869,7 @@
                 <w:noProof/>
                 <w:webHidden/>
               </w:rPr>
-              <w:t>155</w:t>
+              <w:t>156</w:t>
             </w:r>
             <w:r>
               <w:rPr>
@@ -2942,7 +2942,7 @@
                 <w:noProof/>
                 <w:webHidden/>
               </w:rPr>
-              <w:t>158</w:t>
+              <w:t>159</w:t>
             </w:r>
             <w:r>
               <w:rPr>
@@ -3015,7 +3015,7 @@
                 <w:noProof/>
                 <w:webHidden/>
               </w:rPr>
-              <w:t>162</w:t>
+              <w:t>163</w:t>
             </w:r>
             <w:r>
               <w:rPr>
@@ -3088,7 +3088,7 @@
                 <w:noProof/>
                 <w:webHidden/>
               </w:rPr>
-              <w:t>168</w:t>
+              <w:t>169</w:t>
             </w:r>
             <w:r>
               <w:rPr>
@@ -3161,7 +3161,7 @@
                 <w:noProof/>
                 <w:webHidden/>
               </w:rPr>
-              <w:t>172</w:t>
+              <w:t>173</w:t>
             </w:r>
             <w:r>
               <w:rPr>
@@ -3234,7 +3234,7 @@
                 <w:noProof/>
                 <w:webHidden/>
               </w:rPr>
-              <w:t>176</w:t>
+              <w:t>177</w:t>
             </w:r>
             <w:r>
               <w:rPr>
@@ -3307,7 +3307,7 @@
                 <w:noProof/>
                 <w:webHidden/>
               </w:rPr>
-              <w:t>180</w:t>
+              <w:t>181</w:t>
             </w:r>
             <w:r>
               <w:rPr>
@@ -3394,7 +3394,7 @@
                 <w:noProof/>
                 <w:webHidden/>
               </w:rPr>
-              <w:t>182</w:t>
+              <w:t>183</w:t>
             </w:r>
             <w:r>
               <w:rPr>
@@ -5065,11 +5065,6 @@
       <w:pPr>
         <w:jc w:val="right"/>
       </w:pPr>
-    </w:p>
-    <w:p>
-      <w:pPr>
-        <w:jc w:val="right"/>
-      </w:pPr>
       <w:r>
         <w:t>the</w:t>
       </w:r>
@@ -17892,16 +17887,14 @@
     </w:p>
     <w:p>
       <w:pPr>
-        <w:ind w:left="360" w:hanging="360"/>
-      </w:pPr>
-      <w:r>
-        <w:t>19.</w:t>
-      </w:r>
-      <w:r>
-        <w:tab/>
-      </w:r>
-      <w:r>
-        <w:t>No government, corporation, or other entity may, without the citizen’s specific, informed, and revocable consent for each distinct purpose, or a judicial warrant meeting the same standard as for private communications under this Article:</w:t>
+        <w:pStyle w:val="ListParagraph"/>
+        <w:ind w:left="360"/>
+      </w:pPr>
+      <w:r>
+        <w:t>N</w:t>
+      </w:r>
+      <w:r>
+        <w:t>o government, corporation, or other entity may, without the citizen’s specific, informed, and revocable consent for each distinct purpose, or a judicial warrant meeting the same standard as for private communications under this Article:</w:t>
       </w:r>
     </w:p>
     <w:p>
@@ -17934,16 +17927,14 @@
     </w:p>
     <w:p>
       <w:pPr>
-        <w:ind w:left="360" w:hanging="360"/>
-      </w:pPr>
-      <w:r>
-        <w:t>20.</w:t>
-      </w:r>
-      <w:r>
-        <w:tab/>
-      </w:r>
-      <w:r>
-        <w:t xml:space="preserve">Pre-checked consent, bundled terms-of-service consent, or consent demanded as a condition of basic device function, connectivity, warranty, or updates is void. Data so obtained may not be stored, analysed, sold, or </w:t>
+        <w:pStyle w:val="ListParagraph"/>
+        <w:ind w:left="360"/>
+      </w:pPr>
+      <w:r>
+        <w:t>P</w:t>
+      </w:r>
+      <w:r>
+        <w:t xml:space="preserve">re-checked consent, bundled terms-of-service consent, or consent demanded as a condition of basic device function, connectivity, warranty, or updates is void. Data so obtained may not be stored, analysed, sold, or </w:t>
       </w:r>
       <w:r>
         <w:t>shared except as the warrant or valid consent strictly allows. Violation is a crime against the Constitution.</w:t>
@@ -21785,7 +21776,7 @@
           <w:noProof/>
         </w:rPr>
         <w:drawing>
-          <wp:inline distT="0" distB="0" distL="0" distR="0" wp14:anchorId="70753236" wp14:editId="5B143DEC">
+          <wp:inline distT="0" distB="0" distL="0" distR="0" wp14:anchorId="3C1D3DF0" wp14:editId="48DDEA84">
             <wp:extent cx="3882236" cy="1940288"/>
             <wp:effectExtent l="0" t="0" r="4445" b="3175"/>
             <wp:docPr id="1" name="Picture 1"/>

</xml_diff>